<commit_message>
Reconcile MT-0.1 with approved project Preferences
</commit_message>
<xml_diff>
--- a/docs/PROJECT_IMPLEMENTATION_ROADMAP.docx
+++ b/docs/PROJECT_IMPLEMENTATION_ROADMAP.docx
@@ -13,13 +13,19 @@
     <w:p>
       <w:pPr/>
       <w:r>
-        <w:t>Version: 1.0 | Date: 2026-08-31</w:t>
+        <w:t>Version: 1.1 | Date: 2026-08-31</w:t>
       </w:r>
     </w:p>
     <w:p>
       <w:pPr/>
       <w:r>
         <w:t>Canonical Goal: docs/PROJECT_GOAL.md</w:t>
+      </w:r>
+    </w:p>
+    <w:p>
+      <w:pPr/>
+      <w:r>
+        <w:t>Binding Preferences: docs/PROJECT_PREFERENCES.md</w:t>
       </w:r>
     </w:p>
     <w:p>
@@ -67,6 +73,12 @@
       </w:r>
     </w:p>
     <w:p>
+      <w:pPr/>
+      <w:r>
+        <w:t>Goal aur Preferences dono apply hon. Working features ke liye reuse/adapt/refactor/migrate pehle assess hon; rewrite ko verified reason chahiye. Incremental batches mein parity, data consistency, integration aur regression verify hon; big-bang rewrite nahi. Conventional solutions, justified Redis roles aur Laravel-only business backend use hon; Node/Express parallel backend nahi. Stack deviation sirf verified unavoidable blocker par documented ho, Goal conflict silently resolve na ho.</w:t>
+      </w:r>
+    </w:p>
+    <w:p>
       <w:pPr>
         <w:pStyle w:val="Heading1"/>
         <w:pageBreakBefore/>
@@ -106,7 +118,7 @@
         <w:t>Scope:</w:t>
       </w:r>
       <w:r>
-        <w:t xml:space="preserve"> Original Goal preserve karna; protected source baseline, monorepo layout, canonical docs/registry, matching DOCX aur independent private GitHub repository establish karna.</w:t>
+        <w:t xml:space="preserve"> Original Goal aur approved Preferences preserve/reconcile karna; protected source baseline, monorepo layout, canonical docs/registry, matching DOCX aur independent private GitHub repository establish karna.</w:t>
       </w:r>
     </w:p>
     <w:p>
@@ -118,7 +130,7 @@
         <w:t>Acceptance:</w:t>
       </w:r>
       <w:r>
-        <w:t xml:space="preserve"> Goal hash, docs parity, source unchanged checks, new root commit aur remote equality verify hon. Is point par application migration shuru na ho.</w:t>
+        <w:t xml:space="preserve"> Goal/Preferences hashes aur full coverage, docs parity, source unchanged checks, independent Git history aur remote equality verify hon. MT-0.1 re-verification evidence record ho; MT-1.1/application migration start na ho.</w:t>
       </w:r>
     </w:p>
     <w:p>
@@ -173,7 +185,7 @@
         <w:t>Scope:</w:t>
       </w:r>
       <w:r>
-        <w:t xml:space="preserve"> Pinned source code, routes, roles, models, migrations, tests, integrations, Dynamic Platform, branding aur Control ki full inventory banayein.</w:t>
+        <w:t xml:space="preserve"> Pinned source code, routes, roles, models, migrations, tests, integrations, Dynamic Platform, branding aur Control inventory; legacy files/folders ke roles/dependencies aur retention value assess karein.</w:t>
       </w:r>
     </w:p>
     <w:p>
@@ -185,7 +197,7 @@
         <w:t>Acceptance:</w:t>
       </w:r>
       <w:r>
-        <w:t xml:space="preserve"> Har valid capability ko target owner, source evidence, keep/adapt/retire decision aur acceptance gate mile. Isolated source-copy characterization run ho; originals unchanged hon.</w:t>
+        <w:t xml:space="preserve"> Har valid capability ke reuse/adapt/refactor/migrate options aur required rewrite ka verified reason record ho; retirement sirf unnecessary duplication ke liye. Target owner, parity gate aur isolated characterization hon; originals unchanged hon.</w:t>
       </w:r>
     </w:p>
     <w:p>
@@ -253,7 +265,7 @@
         <w:t>Scope:</w:t>
       </w:r>
       <w:r>
-        <w:t xml:space="preserve"> Compatible pinned runtimes/dependencies ke saath Laravel 13, React/Inertia/TypeScript/Tailwind aur Next.js foundations new folders mein tayyar karein; isolated MySQL/Redis/storage configure karein.</w:t>
+        <w:t xml:space="preserve"> Approved pinned stack par Laravel 13, React/Inertia/TypeScript/Tailwind aur Next.js foundations; isolated MySQL aur concrete justified Redis/storage roles configure karein. Useful source foundations reuse/adapt hon.</w:t>
       </w:r>
     </w:p>
     <w:p>
@@ -1228,7 +1240,7 @@
         <w:t>Scope:</w:t>
       </w:r>
       <w:r>
-        <w:t xml:space="preserve"> Aik Control app new backend/website paths aur approved branding par adapt karein; Laravel/Vite/Next.js processes manage karein.</w:t>
+        <w:t xml:space="preserve"> Useful legacy Control implementation aik canonical app mein adapt karein; current approved logo lagayein, old logo carry forward na ho. New backend/website paths aur development processes manage hon.</w:t>
       </w:r>
     </w:p>
     <w:p>
@@ -1240,7 +1252,7 @@
         <w:t>Acceptance:</w:t>
       </w:r>
       <w:r>
-        <w:t xml:space="preserve"> Start/stop/restart/open/status, already-running detection, PID ownership, occupied ports, duplicate starts aur orphan process handling verify hon; unrelated/source processes terminate na hon.</w:t>
+        <w:t xml:space="preserve"> Start, Stop, Restart, Open, Status, Start All aur Stop All jahan applicable hon verify hon; exclusions justified hon. PID ownership, already-running/occupied-port handling aur duplicate/orphan safety pass ho; unrelated/source processes terminate na hon.</w:t>
       </w:r>
     </w:p>
     <w:p>
@@ -1280,7 +1292,7 @@
         <w:t>Acceptance:</w:t>
       </w:r>
       <w:r>
-        <w:t xml:space="preserve"> Online/Offline accuracy, repeated start-stop, stale PID, browser deduplication, runtime errors aur reboot recovery documented hon; source environments unaffected hon.</w:t>
+        <w:t xml:space="preserve"> Online/Offline accuracy, repeated Start All/Stop All, partial-start failure, stale PID, browser deduplication, runtime errors aur reboot recovery verify hon; source environments unaffected hon.</w:t>
       </w:r>
     </w:p>
     <w:p>
@@ -1562,7 +1574,7 @@
         <w:t>Scope:</w:t>
       </w:r>
       <w:r>
-        <w:t xml:space="preserve"> Complete Goal, requirements map, all completed-point claims, Git/code/data, migration/recovery, security, integrations, CI, docs, HOLD register aur source immutability independently audit karein.</w:t>
+        <w:t xml:space="preserve"> Complete Goal aur Preferences, requirements map, all completed-point claims, Git/code/data, migration/recovery, security, integrations, CI, docs, HOLD register aur source immutability independently audit karein.</w:t>
       </w:r>
     </w:p>
     <w:p>

</xml_diff>

<commit_message>
Complete MT-1.1 source inventory and feature parity register
</commit_message>
<xml_diff>
--- a/docs/PROJECT_IMPLEMENTATION_ROADMAP.docx
+++ b/docs/PROJECT_IMPLEMENTATION_ROADMAP.docx
@@ -13,7 +13,7 @@
     <w:p>
       <w:pPr/>
       <w:r>
-        <w:t>Version: 1.1 | Date: 2026-08-31</w:t>
+        <w:t>Version: 1.2 | Date: 2026-08-31</w:t>
       </w:r>
     </w:p>
     <w:p>
@@ -57,7 +57,7 @@
     <w:p>
       <w:pPr/>
       <w:r>
-        <w:t>Yeh controlled migration ka single active roadmap hai. Sirf MT-0.1 initialization complete hai; application migration pending hai. Har Proceed aik point ko required gates aur intended new-repository commit/push tak complete karega, phir rukega. Dependencies ordered hain; IDs aur exact titles stable rahenge.</w:t>
+        <w:t>Yeh controlled migration ka single active roadmap hai. MT-0.1 initialization aur MT-1.1 source inventory complete hain (2/32); application migration pending hai. Har Proceed aik point ko required gates aur intended new-repository commit/push tak complete karega, phir rukega. Dependencies ordered hain; IDs aur exact titles stable rahenge.</w:t>
       </w:r>
     </w:p>
     <w:p>
@@ -157,7 +157,7 @@
     <w:p>
       <w:pPr/>
       <w:r>
-        <w:t>Stage status: Pending</w:t>
+        <w:t>Stage status: In Progress</w:t>
       </w:r>
     </w:p>
     <w:p>
@@ -173,7 +173,7 @@
         <w:keepNext/>
       </w:pPr>
       <w:r>
-        <w:t>Status: Pending | Dependencies: MT-0.1</w:t>
+        <w:t>Status: Completed | Dependencies: MT-0.1</w:t>
       </w:r>
     </w:p>
     <w:p>
@@ -198,6 +198,12 @@
       </w:r>
       <w:r>
         <w:t xml:space="preserve"> Har valid capability ke reuse/adapt/refactor/migrate options aur required rewrite ka verified reason record ho; retirement sirf unnecessary duplication ke liye. Target owner, parity gate aur isolated characterization hon; originals unchanged hon.</w:t>
+      </w:r>
+    </w:p>
+    <w:p>
+      <w:pPr/>
+      <w:r>
+        <w:t>Evidence: docs/migration/FEATURE_PARITY_REGISTER.md; isolated source tests passed, originals unchanged, target parity pending.</w:t>
       </w:r>
     </w:p>
     <w:p>
@@ -504,7 +510,7 @@
         <w:t>Acceptance:</w:t>
       </w:r>
       <w:r>
-        <w:t xml:space="preserve"> Money precision, identifiers, historical snapshots, return adjustments aur stock/accounting effects legacy acceptance se match hon.</w:t>
+        <w:t xml:space="preserve"> Money precision, identifiers, historical snapshots, return adjustments aur stock/accounting effects legacy acceptance se match hon. MT-1.1 mein stock return mila, full sale-refund route nahi; Goal-required sale returns ka explicit verified contract aur fresh tests required hain.</w:t>
       </w:r>
     </w:p>
     <w:p>

</xml_diff>

<commit_message>
Reconcile project documentation language policy
</commit_message>
<xml_diff>
--- a/docs/PROJECT_IMPLEMENTATION_ROADMAP.docx
+++ b/docs/PROJECT_IMPLEMENTATION_ROADMAP.docx
@@ -13,7 +13,7 @@
     <w:p>
       <w:pPr/>
       <w:r>
-        <w:t>Version: 1.2 | Date: 2026-08-31</w:t>
+        <w:t>Version: 1.3 | Date: 2026-08-31</w:t>
       </w:r>
     </w:p>
     <w:p>
@@ -51,31 +51,37 @@
         <w:pStyle w:val="Heading1"/>
       </w:pPr>
       <w:r>
-        <w:t>Scope aur execution rules</w:t>
+        <w:t>Scope and execution rules</w:t>
       </w:r>
     </w:p>
     <w:p>
       <w:pPr/>
       <w:r>
-        <w:t>Yeh controlled migration ka single active roadmap hai. MT-0.1 initialization aur MT-1.1 source inventory complete hain (2/32); application migration pending hai. Har Proceed aik point ko required gates aur intended new-repository commit/push tak complete karega, phir rukega. Dependencies ordered hain; IDs aur exact titles stable rahenge.</w:t>
+        <w:t>This is the single active roadmap for the controlled migration. MT-0.1 initialization and MT-1.1 source inventory are complete (2/32); application migration remains pending. Each Proceed executes one point through its required gates and intended new-repository commit/push, then stops. Dependencies are ordered; point IDs and exact titles remain stable.</w:t>
       </w:r>
     </w:p>
     <w:p>
       <w:pPr/>
       <w:r>
-        <w:t>Purane POS/Website folders, remotes aur data immutable references hain. Sab implementation, copied-source tests aur migration rehearsals C:\mobisttech ya isolated approved target resources mein honge. Originals par tests/builds bhi nahi. Single shared Laravel/MySQL authority ko duplicate authoritative databases se replace nahi karna.</w:t>
+        <w:t>The original POS/Website folders, remotes and data are immutable references. All implementation, copied-source tests and migration rehearsals must run under `C:\mobisttech` or isolated approved target resources. Do not run tests/builds against the originals. Do not replace the single shared Laravel/MySQL authority with duplicate authoritative databases.</w:t>
       </w:r>
     </w:p>
     <w:p>
       <w:pPr/>
       <w:r>
-        <w:t>Har point mein applicable focused/full tests, parity evidence, secrets review, source-boundary check, ledger update aur roadmap/DOCX parity completion gates hain. MT-1.1 detailed inventory is roadmap ko evidence ke mutabiq refine kar sakti hai; silently functionality drop ya completed IDs renumber nahi karna.</w:t>
+        <w:t>Every point includes applicable focused/full tests, parity evidence, secrets review, source-boundary checks, ledger updates and roadmap/DOCX parity completion gates. MT-1.1 detailed inventory may refine this roadmap from evidence, but valid functionality must not be silently dropped and completed IDs must not be renumbered.</w:t>
       </w:r>
     </w:p>
     <w:p>
       <w:pPr/>
       <w:r>
-        <w:t>Goal aur Preferences dono apply hon. Working features ke liye reuse/adapt/refactor/migrate pehle assess hon; rewrite ko verified reason chahiye. Incremental batches mein parity, data consistency, integration aur regression verify hon; big-bang rewrite nahi. Conventional solutions, justified Redis roles aur Laravel-only business backend use hon; Node/Express parallel backend nahi. Stack deviation sirf verified unavoidable blocker par documented ho, Goal conflict silently resolve na ho.</w:t>
+        <w:t>Both Goal and Preferences apply. For working features, assess reuse/adapt/refactor/migrate before rewrite; rewrite requires a verified reason. Verify parity, data consistency, integration and regression incrementally rather than using a big-bang rewrite. Prefer conventional solutions, justified Redis roles and a Laravel-only business backend; do not introduce a parallel Node/Express business backend. Record stack deviations only for verified unavoidable blockers and never silently resolve a Goal conflict.</w:t>
+      </w:r>
+    </w:p>
+    <w:p>
+      <w:pPr/>
+      <w:r>
+        <w:t>Roman Urdu is limited to assistant chat/UI communication. Git-tracked project documentation and technical artifacts use standard English unless the user explicitly requests another language for a specific artifact. User-supplied Goal/Preferences remain byte-preserved in their original language/content.</w:t>
       </w:r>
     </w:p>
     <w:p>
@@ -118,7 +124,7 @@
         <w:t>Scope:</w:t>
       </w:r>
       <w:r>
-        <w:t xml:space="preserve"> Original Goal aur approved Preferences preserve/reconcile karna; protected source baseline, monorepo layout, canonical docs/registry, matching DOCX aur independent private GitHub repository establish karna.</w:t>
+        <w:t xml:space="preserve"> Preserve/reconcile the original Goal and approved Preferences; establish the protected source baseline, monorepo layout, canonical docs/registry, matching DOCX and independent private GitHub repository.</w:t>
       </w:r>
     </w:p>
     <w:p>
@@ -130,7 +136,7 @@
         <w:t>Acceptance:</w:t>
       </w:r>
       <w:r>
-        <w:t xml:space="preserve"> Goal/Preferences hashes aur full coverage, docs parity, source unchanged checks, independent Git history aur remote equality verify hon. MT-0.1 re-verification evidence record ho; MT-1.1/application migration start na ho.</w:t>
+        <w:t xml:space="preserve"> Verify Goal/Preferences hashes and full coverage, documentation parity, source-unchanged checks, independent Git history and remote equality. Record MT-0.1 re-verification evidence; do not start MT-1.1/application migration within this point.</w:t>
       </w:r>
     </w:p>
     <w:p>
@@ -142,7 +148,7 @@
         <w:t>Stage exit:</w:t>
       </w:r>
       <w:r>
-        <w:t xml:space="preserve"> Is stage ke tamam points ke acceptance gates aur Git-backed evidence verified hon; partial work Complete mark na ho.</w:t>
+        <w:t xml:space="preserve"> Verify all acceptance gates and Git-backed evidence for every point in this stage; never mark partial work Complete.</w:t>
       </w:r>
     </w:p>
     <w:p>
@@ -185,7 +191,7 @@
         <w:t>Scope:</w:t>
       </w:r>
       <w:r>
-        <w:t xml:space="preserve"> Pinned source code, routes, roles, models, migrations, tests, integrations, Dynamic Platform, branding aur Control inventory; legacy files/folders ke roles/dependencies aur retention value assess karein.</w:t>
+        <w:t xml:space="preserve"> Inventory pinned source code, routes, roles, models, migrations, tests, integrations, Dynamic Platform, branding and Control; assess legacy files/folders for role, dependencies and retention value.</w:t>
       </w:r>
     </w:p>
     <w:p>
@@ -197,7 +203,7 @@
         <w:t>Acceptance:</w:t>
       </w:r>
       <w:r>
-        <w:t xml:space="preserve"> Har valid capability ke reuse/adapt/refactor/migrate options aur required rewrite ka verified reason record ho; retirement sirf unnecessary duplication ke liye. Target owner, parity gate aur isolated characterization hon; originals unchanged hon.</w:t>
+        <w:t xml:space="preserve"> Record reuse/adapt/refactor/migrate options for every valid capability and a verified reason for any required rewrite; retire only unnecessary duplication. Record target owner, parity gate and isolated characterization; originals remain unchanged.</w:t>
       </w:r>
     </w:p>
     <w:p>
@@ -231,7 +237,7 @@
         <w:t>Scope:</w:t>
       </w:r>
       <w:r>
-        <w:t xml:space="preserve"> Single MySQL schema, identity/record collision maps, customer merge rules, history, transaction boundaries, API versioning aur authorization design karein.</w:t>
+        <w:t xml:space="preserve"> Design the single MySQL schema, identity/record collision maps, customer merge rules, history, transaction boundaries, API versioning and authorization model.</w:t>
       </w:r>
     </w:p>
     <w:p>
@@ -243,7 +249,7 @@
         <w:t>Acceptance:</w:t>
       </w:r>
       <w:r>
-        <w:t xml:space="preserve"> Orders, payments, stock reservation, price/currency precision, idempotency, cache invalidation, rollback aur encrypted-data recovery contracts documented hon; two-way database sync target na ho.</w:t>
+        <w:t xml:space="preserve"> Document contracts for orders, payments, stock reservation, price/currency precision, idempotency, cache invalidation, rollback and encrypted-data recovery; do not use two-way database synchronization as the target.</w:t>
       </w:r>
     </w:p>
     <w:p>
@@ -271,7 +277,7 @@
         <w:t>Scope:</w:t>
       </w:r>
       <w:r>
-        <w:t xml:space="preserve"> Approved pinned stack par Laravel 13, React/Inertia/TypeScript/Tailwind aur Next.js foundations; isolated MySQL aur concrete justified Redis/storage roles configure karein. Useful source foundations reuse/adapt hon.</w:t>
+        <w:t xml:space="preserve"> Establish Laravel 13, React/Inertia/TypeScript/Tailwind and Next.js foundations on the approved pinned stack; configure isolated MySQL plus concrete justified Redis/storage roles. Reuse/adapt useful source foundations where appropriate.</w:t>
       </w:r>
     </w:p>
     <w:p>
@@ -283,7 +289,7 @@
         <w:t>Acceptance:</w:t>
       </w:r>
       <w:r>
-        <w:t xml:space="preserve"> Fresh Windows setup, secret-free examples, lockfiles aur smoke builds pass hon. Ports source servers se conflict na karein; nested .git, real provider calls ya source data connection na ho.</w:t>
+        <w:t xml:space="preserve"> Fresh Windows setup, secret-free examples, lockfiles and smoke builds pass. Ports do not conflict with source servers; no nested `.git`, real provider calls or source-data connections exist.</w:t>
       </w:r>
     </w:p>
     <w:p>
@@ -295,7 +301,7 @@
         <w:t>Stage exit:</w:t>
       </w:r>
       <w:r>
-        <w:t xml:space="preserve"> Is stage ke tamam points ke acceptance gates aur Git-backed evidence verified hon; partial work Complete mark na ho.</w:t>
+        <w:t xml:space="preserve"> Verify all acceptance gates and Git-backed evidence for every point in this stage; never mark partial work Complete.</w:t>
       </w:r>
     </w:p>
     <w:p>
@@ -338,7 +344,7 @@
         <w:t>Scope:</w:t>
       </w:r>
       <w:r>
-        <w:t xml:space="preserve"> Reusable Laravel core, migration schema, jobs, MySQL ownership, Redis roles aur S3-compatible storage layer migrate karein.</w:t>
+        <w:t xml:space="preserve"> Migrate the reusable Laravel core, migration schema, jobs, MySQL ownership, Redis roles and S3-compatible storage layer.</w:t>
       </w:r>
     </w:p>
     <w:p>
@@ -350,7 +356,7 @@
         <w:t>Acceptance:</w:t>
       </w:r>
       <w:r>
-        <w:t xml:space="preserve"> Disposable MySQL apply/rollback/reapply, storage isolation aur queue/cache failure behavior pass ho; Website ko DB credentials na milein.</w:t>
+        <w:t xml:space="preserve"> Disposable MySQL apply/rollback/reapply, storage isolation and queue/cache failure behavior pass; the Website does not receive DB credentials.</w:t>
       </w:r>
     </w:p>
     <w:p>
@@ -378,7 +384,7 @@
         <w:t>Scope:</w:t>
       </w:r>
       <w:r>
-        <w:t xml:space="preserve"> POS roles/guards aur Website customer identity ko shared backend mein map karein; session/password/account recovery aur ownership preserve karein.</w:t>
+        <w:t xml:space="preserve"> Map POS roles/guards and Website customer identity into the shared backend; preserve session/password/account recovery and ownership behavior.</w:t>
       </w:r>
     </w:p>
     <w:p>
@@ -390,7 +396,7 @@
         <w:t>Acceptance:</w:t>
       </w:r>
       <w:r>
-        <w:t xml:space="preserve"> Role matrix, user/customer collision cases, session isolation, CSRF, IDOR aur recovery tests pass hon; unauthorized account merging na ho.</w:t>
+        <w:t xml:space="preserve"> Role matrix, user/customer collision cases, session isolation, CSRF, IDOR and recovery tests pass; no unauthorized account merging occurs.</w:t>
       </w:r>
     </w:p>
     <w:p>
@@ -418,7 +424,7 @@
         <w:t>Scope:</w:t>
       </w:r>
       <w:r>
-        <w:t xml:space="preserve"> Products, variants/units, categories, attributes aur stable master data migrate karein; public/private field separation rakhein.</w:t>
+        <w:t xml:space="preserve"> Migrate products, variants/units, categories, attributes and stable master data; preserve public/private field separation.</w:t>
       </w:r>
     </w:p>
     <w:p>
@@ -430,7 +436,7 @@
         <w:t>Acceptance:</w:t>
       </w:r>
       <w:r>
-        <w:t xml:space="preserve"> ID/relationship maps, historical references aur validation parity pass ho; protected category/identifier semantics silently change na hon.</w:t>
+        <w:t xml:space="preserve"> ID/relationship maps, historical references and validation parity pass; protected category/identifier semantics do not silently change.</w:t>
       </w:r>
     </w:p>
     <w:p>
@@ -458,7 +464,7 @@
         <w:t>Scope:</w:t>
       </w:r>
       <w:r>
-        <w:t xml:space="preserve"> Acquisition, stock units/IMEIs, availability, movements aur transaction-derived stock rules shared services mein migrate karein.</w:t>
+        <w:t xml:space="preserve"> Migrate acquisition, stock units/IMEIs, availability, movements and transaction-derived stock rules into shared services.</w:t>
       </w:r>
     </w:p>
     <w:p>
@@ -470,7 +476,7 @@
         <w:t>Acceptance:</w:t>
       </w:r>
       <w:r>
-        <w:t xml:space="preserve"> Concurrent sale/reservation, uniqueness, rollback aur negative/duplicate stock prevention MySQL par pass hon; snapshots reconcile hon.</w:t>
+        <w:t xml:space="preserve"> Concurrent sale/reservation, uniqueness, rollback and negative/duplicate-stock prevention pass on MySQL; snapshots reconcile.</w:t>
       </w:r>
     </w:p>
     <w:p>
@@ -498,7 +504,7 @@
         <w:t>Scope:</w:t>
       </w:r>
       <w:r>
-        <w:t xml:space="preserve"> Sales, invoice totals/discounts, operational customer records aur returns ke verified behavior migrate karein.</w:t>
+        <w:t xml:space="preserve"> Migrate sales, invoice totals/discounts, operational customer records and verified return behavior.</w:t>
       </w:r>
     </w:p>
     <w:p>
@@ -510,7 +516,7 @@
         <w:t>Acceptance:</w:t>
       </w:r>
       <w:r>
-        <w:t xml:space="preserve"> Money precision, identifiers, historical snapshots, return adjustments aur stock/accounting effects legacy acceptance se match hon. MT-1.1 mein stock return mila, full sale-refund route nahi; Goal-required sale returns ka explicit verified contract aur fresh tests required hain.</w:t>
+        <w:t xml:space="preserve"> Money precision, identifiers, historical snapshots, return adjustments and stock/accounting effects match legacy acceptance. MT-1.1 found stock-return behavior but no full routed sale-refund flow; Goal-required sale returns need an explicit verified contract and fresh tests.</w:t>
       </w:r>
     </w:p>
     <w:p>
@@ -538,7 +544,7 @@
         <w:t>Scope:</w:t>
       </w:r>
       <w:r>
-        <w:t xml:space="preserve"> Warranty duration, versioned clauses, claim lifecycle aur historical document relationships preserve karein.</w:t>
+        <w:t xml:space="preserve"> Preserve warranty duration, versioned clauses, claim lifecycle and historical document relationships.</w:t>
       </w:r>
     </w:p>
     <w:p>
@@ -550,7 +556,7 @@
         <w:t>Acceptance:</w:t>
       </w:r>
       <w:r>
-        <w:t xml:space="preserve"> Sale-time snapshots, permissions, expiry/boundary conditions aur historical warranty/claim output parity pass ho.</w:t>
+        <w:t xml:space="preserve"> Sale-time snapshots, permissions, expiry/boundary conditions and historical warranty/claim output parity pass.</w:t>
       </w:r>
     </w:p>
     <w:p>
@@ -578,7 +584,7 @@
         <w:t>Scope:</w:t>
       </w:r>
       <w:r>
-        <w:t xml:space="preserve"> Website order/payment/COD/project-payment services ko shared transactions mein migrate karein; obsolete cross-DB sync ki replacement prove karein.</w:t>
+        <w:t xml:space="preserve"> Migrate Website order/payment/COD/project-payment services into shared transactions and prove replacement of obsolete cross-database synchronization.</w:t>
       </w:r>
     </w:p>
     <w:p>
@@ -590,7 +596,7 @@
         <w:t>Acceptance:</w:t>
       </w:r>
       <w:r>
-        <w:t xml:space="preserve"> Price/amount/ownership verification, retry/replay, expiration, confirmation-versus-release, reconciliation aur payment failure recovery tests pass hon. Disabled providers safe rahen.</w:t>
+        <w:t xml:space="preserve"> Price/amount/ownership verification, retry/replay, expiration, confirmation-versus-release, reconciliation and payment-failure recovery tests pass. Disabled providers remain safe.</w:t>
       </w:r>
     </w:p>
     <w:p>
@@ -602,7 +608,7 @@
         <w:t>Stage exit:</w:t>
       </w:r>
       <w:r>
-        <w:t xml:space="preserve"> Is stage ke tamam points ke acceptance gates aur Git-backed evidence verified hon; partial work Complete mark na ho.</w:t>
+        <w:t xml:space="preserve"> Verify all acceptance gates and Git-backed evidence for every point in this stage; never mark partial work Complete.</w:t>
       </w:r>
     </w:p>
     <w:p>
@@ -645,7 +651,7 @@
         <w:t>Scope:</w:t>
       </w:r>
       <w:r>
-        <w:t xml:space="preserve"> Verified reports, dashboards, A4/Thermal output, invoice/warranty documents aur safe communication templates migrate karein.</w:t>
+        <w:t xml:space="preserve"> Migrate verified reports, dashboards, A4/Thermal output, invoice/warranty documents and safe communication templates.</w:t>
       </w:r>
     </w:p>
     <w:p>
@@ -657,7 +663,7 @@
         <w:t>Acceptance:</w:t>
       </w:r>
       <w:r>
-        <w:t xml:space="preserve"> Role-scoped totals/exports, history, print/download aur protected template placeholders parity tests pass hon; real messages send na hon.</w:t>
+        <w:t xml:space="preserve"> Role-scoped totals/exports, history, print/download and protected-template-placeholder parity tests pass; no real messages are sent.</w:t>
       </w:r>
     </w:p>
     <w:p>
@@ -685,7 +691,7 @@
         <w:t>Scope:</w:t>
       </w:r>
       <w:r>
-        <w:t xml:space="preserve"> Website managed pages, navigation, homepage/catalogue, SEO/legal/promotion settings, media, themes aur branding controls backend mein migrate karein.</w:t>
+        <w:t xml:space="preserve"> Migrate Website-managed pages, navigation, homepage/catalogue, SEO/legal/promotion settings, media, themes and branding controls into the backend.</w:t>
       </w:r>
     </w:p>
     <w:p>
@@ -697,7 +703,7 @@
         <w:t>Acceptance:</w:t>
       </w:r>
       <w:r>
-        <w:t xml:space="preserve"> Draft/preview/publish, revisions/rollback, safe uploads/content, cache invalidation aur distinct POS/Website settings preserve hon.</w:t>
+        <w:t xml:space="preserve"> Draft/preview/publish, revisions/rollback, safe uploads/content, cache invalidation and distinct POS/Website settings are preserved.</w:t>
       </w:r>
     </w:p>
     <w:p>
@@ -725,7 +731,7 @@
         <w:t>Scope:</w:t>
       </w:r>
       <w:r>
-        <w:t xml:space="preserve"> Audit/redaction, safe configuration recovery, backup/history/restore guards aur valid external integration contracts migrate karein.</w:t>
+        <w:t xml:space="preserve"> Migrate audit/redaction, safe configuration recovery, backup/history/restore guards and valid external-integration contracts.</w:t>
       </w:r>
     </w:p>
     <w:p>
@@ -737,7 +743,7 @@
         <w:t>Acceptance:</w:t>
       </w:r>
       <w:r>
-        <w:t xml:space="preserve"> Secret masking, key-dependent recovery, target-only backup/restore rehearsal aur disabled-by-default external jobs verify hon; no arbitrary commands/endpoints.</w:t>
+        <w:t xml:space="preserve"> Secret masking, key-dependent recovery, target-only backup/restore rehearsal and disabled-by-default external jobs are verified; no arbitrary commands/endpoints are introduced.</w:t>
       </w:r>
     </w:p>
     <w:p>
@@ -765,7 +771,7 @@
         <w:t>Scope:</w:t>
       </w:r>
       <w:r>
-        <w:t xml:space="preserve"> Next.js ke liye public catalogue/content aur authenticated account/cart/order/payment APIs define aur expose karein.</w:t>
+        <w:t xml:space="preserve"> Define and expose public catalogue/content plus authenticated account/cart/order/payment APIs for Next.js.</w:t>
       </w:r>
     </w:p>
     <w:p>
@@ -777,7 +783,7 @@
         <w:t>Acceptance:</w:t>
       </w:r>
       <w:r>
-        <w:t xml:space="preserve"> Documented payload/error/pagination contracts, authorization, rate limits, public data allowlists aur freshness tests pass hon; writes shared services use karein.</w:t>
+        <w:t xml:space="preserve"> Documented payload/error/pagination contracts, authorization, rate limits, public-data allowlists and freshness tests pass; writes use shared services.</w:t>
       </w:r>
     </w:p>
     <w:p>
@@ -789,7 +795,7 @@
         <w:t>Stage exit:</w:t>
       </w:r>
       <w:r>
-        <w:t xml:space="preserve"> Is stage ke tamam points ke acceptance gates aur Git-backed evidence verified hon; partial work Complete mark na ho.</w:t>
+        <w:t xml:space="preserve"> Verify all acceptance gates and Git-backed evidence for every point in this stage; never mark partial work Complete.</w:t>
       </w:r>
     </w:p>
     <w:p>
@@ -832,7 +838,7 @@
         <w:t>Scope:</w:t>
       </w:r>
       <w:r>
-        <w:t xml:space="preserve"> React/TypeScript/Inertia/Tailwind POS shell, role landing pages, authentication aur safe navigation build karein.</w:t>
+        <w:t xml:space="preserve"> Build the React/TypeScript/Inertia/Tailwind POS shell, role landing pages, authentication and safe navigation.</w:t>
       </w:r>
     </w:p>
     <w:p>
@@ -844,7 +850,7 @@
         <w:t>Acceptance:</w:t>
       </w:r>
       <w:r>
-        <w:t xml:space="preserve"> Desktop/mobile role journeys aur direct-route permissions Playwright mein pass hon; menu hiding ko authorization na samjhein.</w:t>
+        <w:t xml:space="preserve"> Desktop/mobile role journeys and direct-route permissions pass in Playwright; menu hiding is not treated as authorization.</w:t>
       </w:r>
     </w:p>
     <w:p>
@@ -872,7 +878,7 @@
         <w:t>Scope:</w:t>
       </w:r>
       <w:r>
-        <w:t xml:space="preserve"> Products/units/IMEIs, acquisition, stock, sale aur return workflows verified backend services par migrate karein.</w:t>
+        <w:t xml:space="preserve"> Migrate product/unit/IMEI, acquisition, stock, sale and return workflows onto verified backend services.</w:t>
       </w:r>
     </w:p>
     <w:p>
@@ -884,7 +890,7 @@
         <w:t>Acceptance:</w:t>
       </w:r>
       <w:r>
-        <w:t xml:space="preserve"> Keyboard/form validation, pagination, conflict handling, totals aur transaction completion critical journeys pass hon.</w:t>
+        <w:t xml:space="preserve"> Keyboard/form validation, pagination, conflict handling, totals and critical transaction-completion journeys pass.</w:t>
       </w:r>
     </w:p>
     <w:p>
@@ -912,7 +918,7 @@
         <w:t>Scope:</w:t>
       </w:r>
       <w:r>
-        <w:t xml:space="preserve"> Customer/history, invoices, warranties/claims, dashboards, reports aur exports ki existing required UI migrate karein.</w:t>
+        <w:t xml:space="preserve"> Migrate required customer/history, invoice, warranty/claim, dashboard, report and export UI.</w:t>
       </w:r>
     </w:p>
     <w:p>
@@ -924,7 +930,7 @@
         <w:t>Acceptance:</w:t>
       </w:r>
       <w:r>
-        <w:t xml:space="preserve"> Role-scoped flows, historical records, Thermal 80mm/A4 preview-download-print aur mobile layouts verify hon.</w:t>
+        <w:t xml:space="preserve"> Role-scoped flows, historical records, Thermal 80mm/A4 preview-download-print and mobile layouts are verified.</w:t>
       </w:r>
     </w:p>
     <w:p>
@@ -952,7 +958,7 @@
         <w:t>Scope:</w:t>
       </w:r>
       <w:r>
-        <w:t xml:space="preserve"> Website CMS aur POS configuration ke protected React admin screens, revisions/media/branding/payment settings migrate karein.</w:t>
+        <w:t xml:space="preserve"> Migrate protected React admin screens for Website CMS and POS configuration, revisions/media/branding/payment settings.</w:t>
       </w:r>
     </w:p>
     <w:p>
@@ -964,7 +970,7 @@
         <w:t>Acceptance:</w:t>
       </w:r>
       <w:r>
-        <w:t xml:space="preserve"> Separate permissions, preview/publish/rollback, safe recovery, secret masking aur Dynamic Platform parity acceptance pass ho.</w:t>
+        <w:t xml:space="preserve"> Separate permissions, preview/publish/rollback, safe recovery, secret masking and Dynamic Platform parity acceptance pass.</w:t>
       </w:r>
     </w:p>
     <w:p>
@@ -976,7 +982,7 @@
         <w:t>Stage exit:</w:t>
       </w:r>
       <w:r>
-        <w:t xml:space="preserve"> Is stage ke tamam points ke acceptance gates aur Git-backed evidence verified hon; partial work Complete mark na ho.</w:t>
+        <w:t xml:space="preserve"> Verify all acceptance gates and Git-backed evidence for every point in this stage; never mark partial work Complete.</w:t>
       </w:r>
     </w:p>
     <w:p>
@@ -1019,7 +1025,7 @@
         <w:t>Scope:</w:t>
       </w:r>
       <w:r>
-        <w:t xml:space="preserve"> Next.js storefront, search/filtering, categories, product pages, variants, availability aur SEO defined APIs par migrate karein.</w:t>
+        <w:t xml:space="preserve"> Migrate the Next.js storefront, search/filtering, categories, product pages, variants, availability and SEO onto defined APIs.</w:t>
       </w:r>
     </w:p>
     <w:p>
@@ -1031,7 +1037,7 @@
         <w:t>Acceptance:</w:t>
       </w:r>
       <w:r>
-        <w:t xml:space="preserve"> Public payload privacy, metadata, responsive layouts, pagination aur POS-write-to-Website freshness verify ho; zero-stock visibility behavior preserve ho.</w:t>
+        <w:t xml:space="preserve"> Public-payload privacy, metadata, responsive layouts, pagination and POS-write-to-Website freshness are verified; zero-stock visibility behavior is preserved.</w:t>
       </w:r>
     </w:p>
     <w:p>
@@ -1059,7 +1065,7 @@
         <w:t>Scope:</w:t>
       </w:r>
       <w:r>
-        <w:t xml:space="preserve"> Registration/login/account, multi-line cart, customer order history/access aur review eligibility migrate karein.</w:t>
+        <w:t xml:space="preserve"> Migrate registration/login/account, multi-line cart, customer order history/access and review eligibility.</w:t>
       </w:r>
     </w:p>
     <w:p>
@@ -1071,7 +1077,7 @@
         <w:t>Acceptance:</w:t>
       </w:r>
       <w:r>
-        <w:t xml:space="preserve"> Session boundaries, ownership, guest-to-account behavior, cart recovery aur eligible-review Playwright/API journeys pass hon.</w:t>
+        <w:t xml:space="preserve"> Session boundaries, ownership, guest-to-account behavior, cart recovery and eligible-review Playwright/API journeys pass.</w:t>
       </w:r>
     </w:p>
     <w:p>
@@ -1099,7 +1105,7 @@
         <w:t>Scope:</w:t>
       </w:r>
       <w:r>
-        <w:t xml:space="preserve"> Checkout, COD, pending/retry/cancel, invoices/status aur provider-hosted payment boundaries connect karein.</w:t>
+        <w:t xml:space="preserve"> Connect checkout, COD, pending/retry/cancel, invoice/status and provider-hosted payment boundaries.</w:t>
       </w:r>
     </w:p>
     <w:p>
@@ -1111,7 +1117,7 @@
         <w:t>Acceptance:</w:t>
       </w:r>
       <w:r>
-        <w:t xml:space="preserve"> Duplicate submit, price/stock changes, failed payments aur verified confirmation end-to-end pass hon; sandbox claims sirf authentic configured providers ke liye hon.</w:t>
+        <w:t xml:space="preserve"> Duplicate submit, price/stock changes, failed payments and verified confirmation pass end-to-end; sandbox claims are made only for authentically configured providers.</w:t>
       </w:r>
     </w:p>
     <w:p>
@@ -1139,7 +1145,7 @@
         <w:t>Scope:</w:t>
       </w:r>
       <w:r>
-        <w:t xml:space="preserve"> Managed pages/menu/homepage/themes, promotions, legal content, digital services, service requests aur approved project quote/payment flows migrate karein.</w:t>
+        <w:t xml:space="preserve"> Migrate managed pages/menu/homepage/themes, promotions, legal content, digital services, service requests and approved project quote/payment flows.</w:t>
       </w:r>
     </w:p>
     <w:p>
@@ -1151,7 +1157,7 @@
         <w:t>Acceptance:</w:t>
       </w:r>
       <w:r>
-        <w:t xml:space="preserve"> CMS publication/revision website par reflect ho; safe content/media, protected routes aur digital quote amount/token/ownership parity pass ho.</w:t>
+        <w:t xml:space="preserve"> CMS publication/revision is reflected on the Website; safe content/media, protected routes and digital quote amount/token/ownership parity pass.</w:t>
       </w:r>
     </w:p>
     <w:p>
@@ -1163,7 +1169,7 @@
         <w:t>Stage exit:</w:t>
       </w:r>
       <w:r>
-        <w:t xml:space="preserve"> Is stage ke tamam points ke acceptance gates aur Git-backed evidence verified hon; partial work Complete mark na ho.</w:t>
+        <w:t xml:space="preserve"> Verify all acceptance gates and Git-backed evidence for every point in this stage; never mark partial work Complete.</w:t>
       </w:r>
     </w:p>
     <w:p>
@@ -1206,7 +1212,7 @@
         <w:t>Scope:</w:t>
       </w:r>
       <w:r>
-        <w:t xml:space="preserve"> Approved assets deduplicate karke root brand ko single master banayein; runtime copies/derivatives ke manifests banayein.</w:t>
+        <w:t xml:space="preserve"> Deduplicate approved assets so the root `brand` directory is the single master; create manifests for runtime copies/derivatives.</w:t>
       </w:r>
     </w:p>
     <w:p>
@@ -1218,7 +1224,7 @@
         <w:t>Acceptance:</w:t>
       </w:r>
       <w:r>
-        <w:t xml:space="preserve"> Logo/icon/favicon/watermark/font references, build output aur fallbacks verify hon; duplicate Brand Kit masters na hon; source artwork unchanged rahe.</w:t>
+        <w:t xml:space="preserve"> Logo/icon/favicon/watermark/font references, build output and fallbacks are verified; no duplicate master Brand Kits remain; source artwork stays unchanged.</w:t>
       </w:r>
     </w:p>
     <w:p>
@@ -1246,7 +1252,7 @@
         <w:t>Scope:</w:t>
       </w:r>
       <w:r>
-        <w:t xml:space="preserve"> Useful legacy Control implementation aik canonical app mein adapt karein; current approved logo lagayein, old logo carry forward na ho. New backend/website paths aur development processes manage hon.</w:t>
+        <w:t xml:space="preserve"> Adapt useful legacy Control implementation into one canonical app; apply the current approved logo and do not carry the old logo forward. Manage the new backend/website paths and development processes.</w:t>
       </w:r>
     </w:p>
     <w:p>
@@ -1258,7 +1264,7 @@
         <w:t>Acceptance:</w:t>
       </w:r>
       <w:r>
-        <w:t xml:space="preserve"> Start, Stop, Restart, Open, Status, Start All aur Stop All jahan applicable hon verify hon; exclusions justified hon. PID ownership, already-running/occupied-port handling aur duplicate/orphan safety pass ho; unrelated/source processes terminate na hon.</w:t>
+        <w:t xml:space="preserve"> Start, Stop, Restart, Open, Status, Start All and Stop All are verified where applicable; exclusions are justified. PID ownership, already-running/occupied-port handling and duplicate/orphan safety pass; unrelated/source processes are not terminated.</w:t>
       </w:r>
     </w:p>
     <w:p>
@@ -1286,7 +1292,7 @@
         <w:t>Scope:</w:t>
       </w:r>
       <w:r>
-        <w:t xml:space="preserve"> Clean Windows setup se both apps, queues/cache/storage aur Control ke real lifecycle journeys rehearse karein.</w:t>
+        <w:t xml:space="preserve"> Rehearse real lifecycle journeys for both apps, queues/cache/storage and Control from a clean Windows setup.</w:t>
       </w:r>
     </w:p>
     <w:p>
@@ -1298,7 +1304,7 @@
         <w:t>Acceptance:</w:t>
       </w:r>
       <w:r>
-        <w:t xml:space="preserve"> Online/Offline accuracy, repeated Start All/Stop All, partial-start failure, stale PID, browser deduplication, runtime errors aur reboot recovery verify hon; source environments unaffected hon.</w:t>
+        <w:t xml:space="preserve"> Online/Offline accuracy, repeated Start All/Stop All, partial-start failure, stale PID, browser deduplication, runtime errors and reboot recovery are verified; source environments remain unaffected.</w:t>
       </w:r>
     </w:p>
     <w:p>
@@ -1310,7 +1316,7 @@
         <w:t>Stage exit:</w:t>
       </w:r>
       <w:r>
-        <w:t xml:space="preserve"> Is stage ke tamam points ke acceptance gates aur Git-backed evidence verified hon; partial work Complete mark na ho.</w:t>
+        <w:t xml:space="preserve"> Verify all acceptance gates and Git-backed evidence for every point in this stage; never mark partial work Complete.</w:t>
       </w:r>
     </w:p>
     <w:p>
@@ -1353,7 +1359,7 @@
         <w:t>Scope:</w:t>
       </w:r>
       <w:r>
-        <w:t xml:space="preserve"> Protected exports/sanitized fixtures se isolated MySQL migration dry-run karein; ID maps, history, media aur keys ka recovery design verify karein.</w:t>
+        <w:t xml:space="preserve"> Perform an isolated MySQL migration dry-run from protected exports/sanitized fixtures; verify recovery design for ID maps, history, media and keys.</w:t>
       </w:r>
     </w:p>
     <w:p>
@@ -1365,7 +1371,7 @@
         <w:t>Acceptance:</w:t>
       </w:r>
       <w:r>
-        <w:t xml:space="preserve"> Record/relation/control-total reconciliation, rerun/idempotency, rollback aur verified restore pass hon. Real export/cutover authorization alag rahe; originals par writes na hon.</w:t>
+        <w:t xml:space="preserve"> Record/relation/control-total reconciliation, rerun/idempotency, rollback and verified restore pass. Real export/cutover authorization remains separate; originals are never written.</w:t>
       </w:r>
     </w:p>
     <w:p>
@@ -1393,7 +1399,7 @@
         <w:t>Scope:</w:t>
       </w:r>
       <w:r>
-        <w:t xml:space="preserve"> Authentication/authorization, upload/content, secrets, payments, stock concurrency, queues, API/cache performance aur recovery audit karein.</w:t>
+        <w:t xml:space="preserve"> Audit authentication/authorization, uploads/content, secrets, payments, stock concurrency, queues, API/cache performance and recovery.</w:t>
       </w:r>
     </w:p>
     <w:p>
@@ -1405,7 +1411,7 @@
         <w:t>Acceptance:</w:t>
       </w:r>
       <w:r>
-        <w:t xml:space="preserve"> MySQL concurrency, cache outages/stale data, worker retries, negative paths, dependency audits aur focused/full regression pass hon; verified gaps remediate hon.</w:t>
+        <w:t xml:space="preserve"> MySQL concurrency, cache outage/stale-data behavior, worker retries, negative paths, dependency audits and focused/full regression pass; verified gaps are remediated.</w:t>
       </w:r>
     </w:p>
     <w:p>
@@ -1433,7 +1439,7 @@
         <w:t>Scope:</w:t>
       </w:r>
       <w:r>
-        <w:t xml:space="preserve"> GitHub Actions mein backend tests, MySQL/Redis services, TypeScript/frontend checks, builds aur Playwright automate karein.</w:t>
+        <w:t xml:space="preserve"> Automate backend tests, MySQL/Redis services, TypeScript/frontend checks, builds and Playwright in GitHub Actions.</w:t>
       </w:r>
     </w:p>
     <w:p>
@@ -1445,7 +1451,7 @@
         <w:t>Acceptance:</w:t>
       </w:r>
       <w:r>
-        <w:t xml:space="preserve"> New private remote par clean checkout CI pass ho; lockfiles/caches/artifacts secret-safe hon aur original repos workflows untouched hon.</w:t>
+        <w:t xml:space="preserve"> Clean-checkout CI passes on the new private remote; lockfiles/caches/artifacts remain secret-safe and original-repository workflows are untouched.</w:t>
       </w:r>
     </w:p>
     <w:p>
@@ -1473,7 +1479,7 @@
         <w:t>Scope:</w:t>
       </w:r>
       <w:r>
-        <w:t xml:space="preserve"> Linux/Nginx/TLS configuration, queues/scheduler, S3, environment separation, automated backup/restore aur rollback runbooks banayein.</w:t>
+        <w:t xml:space="preserve"> Create Linux/Nginx/TLS configuration, queue/scheduler, S3, environment-separation, automated backup/restore and rollback runbooks.</w:t>
       </w:r>
     </w:p>
     <w:p>
@@ -1485,7 +1491,7 @@
         <w:t>Acceptance:</w:t>
       </w:r>
       <w:r>
-        <w:t xml:space="preserve"> Non-production configuration/recovery rehearsal aur backup integrity pass ho. Live provisioning/domain/provider changes tab tak HOLD rahen jab tak separately authorized na hon.</w:t>
+        <w:t xml:space="preserve"> Non-production configuration/recovery rehearsal and backup integrity pass. Live provisioning/domain/provider changes remain HOLD until separately authorized.</w:t>
       </w:r>
     </w:p>
     <w:p>
@@ -1513,7 +1519,7 @@
         <w:t>Scope:</w:t>
       </w:r>
       <w:r>
-        <w:t xml:space="preserve"> Complete source-to-target register ka har valid requirement fresh target evidence se close karein; operational journeys independently run karein.</w:t>
+        <w:t xml:space="preserve"> Close every valid requirement in the complete source-to-target register with fresh target evidence and independently run operational journeys.</w:t>
       </w:r>
     </w:p>
     <w:p>
@@ -1525,7 +1531,7 @@
         <w:t>Acceptance:</w:t>
       </w:r>
       <w:r>
-        <w:t xml:space="preserve"> Pest/PHPUnit, MySQL, builds, Playwright, POS/Website/Control, docs and recovery gates pass hon; no silent feature loss or unreviewed duplicate master ho.</w:t>
+        <w:t xml:space="preserve"> Pest/PHPUnit, MySQL, builds, Playwright, POS/Website/Control, documentation and recovery gates pass; no silent feature loss or unreviewed duplicate master remains.</w:t>
       </w:r>
     </w:p>
     <w:p>
@@ -1537,7 +1543,7 @@
         <w:t>Stage exit:</w:t>
       </w:r>
       <w:r>
-        <w:t xml:space="preserve"> Is stage ke tamam points ke acceptance gates aur Git-backed evidence verified hon; partial work Complete mark na ho.</w:t>
+        <w:t xml:space="preserve"> Verify all acceptance gates and Git-backed evidence for every point in this stage; never mark partial work Complete.</w:t>
       </w:r>
     </w:p>
     <w:p>
@@ -1580,7 +1586,7 @@
         <w:t>Scope:</w:t>
       </w:r>
       <w:r>
-        <w:t xml:space="preserve"> Complete Goal aur Preferences, requirements map, all completed-point claims, Git/code/data, migration/recovery, security, integrations, CI, docs, HOLD register aur source immutability independently audit karein.</w:t>
+        <w:t xml:space="preserve"> Independently audit the complete Goal and Preferences, requirement map, all completed-point claims, Git/code/data, migration/recovery, security, integrations, CI, documentation, HOLD register and source immutability.</w:t>
       </w:r>
     </w:p>
     <w:p>
@@ -1592,7 +1598,7 @@
         <w:t>Acceptance:</w:t>
       </w:r>
       <w:r>
-        <w:t xml:space="preserve"> Required gaps reopen hon; new repo clean aur remote-aligned ho. Sirf clean final audit par Project complete: 100% report ho; Deferred required work ko completion ka substitute na banayein.</w:t>
+        <w:t xml:space="preserve"> Reopen required gaps; the new repository must be clean and remote-aligned. Report `Project complete: 100%` only after a clean final audit; Deferred required work cannot substitute for completion.</w:t>
       </w:r>
     </w:p>
     <w:p>
@@ -1604,7 +1610,7 @@
         <w:t>Stage exit:</w:t>
       </w:r>
       <w:r>
-        <w:t xml:space="preserve"> Is stage ke tamam points ke acceptance gates aur Git-backed evidence verified hon; partial work Complete mark na ho.</w:t>
+        <w:t xml:space="preserve"> Verify all acceptance gates and Git-backed evidence for every point in this stage; never mark partial work Complete.</w:t>
       </w:r>
     </w:p>
     <w:p>
@@ -1619,31 +1625,31 @@
     <w:p>
       <w:pPr/>
       <w:r>
-        <w:t>H-01 - Live production deployment, domains, TLS activation aur real customer-data cutover: separate explicit authorization aur target access required. MT-7.1/MT-7.4 ki isolated rehearsal/readiness in scope rahegi.</w:t>
+        <w:t>H-01 - Live production deployment, domains, TLS activation and real customer-data cutover require separate explicit authorization and target access. MT-7.1/MT-7.4 isolated rehearsal/readiness remains in scope.</w:t>
       </w:r>
     </w:p>
     <w:p>
       <w:pPr/>
       <w:r>
-        <w:t>H-02 - JazzCash/Easypaisa authentic sandbox acceptance: verified official contracts aur valid sandbox credentials required. Card: approved hosted/tokenized processor required. Live activation alag HOLD hai. Existing safe disabled-provider behavior aur COD migration required hain; fake acceptance mana hai.</w:t>
+        <w:t>H-02 - JazzCash/Easypaisa authentic sandbox acceptance requires verified official contracts and valid sandbox credentials. Card requires an approved hosted/tokenized processor. Live activation is a separate HOLD. Existing safe disabled-provider behavior and COD migration remain required; fake acceptance is prohibited.</w:t>
       </w:r>
     </w:p>
     <w:p>
       <w:pPr/>
       <w:r>
-        <w:t>H-03 - Source business-data export aur destructive restore: sensitive datasets aur exact target ka authorization before access/use. Synthetic/sanitized isolated migration tests continue ho sakte hain. Source repository/database writes is project mein prohibited hain.</w:t>
+        <w:t>H-03 - Source business-data export and destructive restore require authorization for the sensitive dataset and exact target before access/use. Synthetic/sanitized isolated migration tests may continue. Source repository/database writes are prohibited in this project.</w:t>
       </w:r>
     </w:p>
     <w:p>
       <w:pPr/>
       <w:r>
-        <w:t>H-04 - Arbitrary new top-level category semantics aur unrelated new features: approved Goal se bahar jab tak separately scoped na hon. Existing protected IDs/business rules preserve honge.</w:t>
+        <w:t>H-04 - Arbitrary new top-level category semantics and unrelated new features are outside the approved Goal unless separately scoped. Existing protected IDs/business rules must be preserved.</w:t>
       </w:r>
     </w:p>
     <w:p>
       <w:pPr/>
       <w:r>
-        <w:t>HOLD/dependency evidence final audit mein explicitly review hogi. Koi required capability implement na hone par use sirf Deferred label de kar project complete nahi kehna.</w:t>
+        <w:t>HOLD/dependency evidence is explicitly reviewed in FINAL-AUDIT. A required capability cannot be left unimplemented and then relabeled Deferred merely to complete the project.</w:t>
       </w:r>
     </w:p>
     <w:sectPr>

</xml_diff>

<commit_message>
Complete MT-1.2 unified data API and security design
</commit_message>
<xml_diff>
--- a/docs/PROJECT_IMPLEMENTATION_ROADMAP.docx
+++ b/docs/PROJECT_IMPLEMENTATION_ROADMAP.docx
@@ -13,7 +13,7 @@
     <w:p>
       <w:pPr/>
       <w:r>
-        <w:t>Version: 1.3 | Date: 2026-08-31</w:t>
+        <w:t>Version: 1.4 | Date: 2026-08-31</w:t>
       </w:r>
     </w:p>
     <w:p>
@@ -57,7 +57,7 @@
     <w:p>
       <w:pPr/>
       <w:r>
-        <w:t>This is the single active roadmap for the controlled migration. MT-0.1 initialization and MT-1.1 source inventory are complete (2/32); application migration remains pending. Each Proceed executes one point through its required gates and intended new-repository commit/push, then stops. Dependencies are ordered; point IDs and exact titles remain stable.</w:t>
+        <w:t>This is the single active roadmap for the controlled migration. MT-0.1 initialization, MT-1.1 inventory and MT-1.2 design are complete (3/32); application migration remains pending. Each Proceed executes one point through its required gates and intended new-repository commit/push, then stops. Dependencies are ordered; point IDs and exact titles remain stable.</w:t>
       </w:r>
     </w:p>
     <w:p>
@@ -225,7 +225,7 @@
         <w:keepNext/>
       </w:pPr>
       <w:r>
-        <w:t>Status: Pending | Dependencies: MT-1.1</w:t>
+        <w:t>Status: Completed | Dependencies: MT-1.1</w:t>
       </w:r>
     </w:p>
     <w:p>
@@ -249,7 +249,7 @@
         <w:t>Acceptance:</w:t>
       </w:r>
       <w:r>
-        <w:t xml:space="preserve"> Document contracts for orders, payments, stock reservation, price/currency precision, idempotency, cache invalidation, rollback and encrypted-data recovery; do not use two-way database synchronization as the target.</w:t>
+        <w:t xml:space="preserve"> Document contracts for orders, payments, stock reservation, price/currency precision, idempotency, cache invalidation, rollback and encrypted-data recovery; do not use two-way database synchronization as the target. Evidence: docs/design/README.md; specification checks pass, runtime acceptance pending.</w:t>
       </w:r>
     </w:p>
     <w:p>

</xml_diff>

<commit_message>
Optimize roadmap and Word mirror lifecycle
</commit_message>
<xml_diff>
--- a/docs/PROJECT_IMPLEMENTATION_ROADMAP.docx
+++ b/docs/PROJECT_IMPLEMENTATION_ROADMAP.docx
@@ -13,7 +13,7 @@
     <w:p>
       <w:pPr/>
       <w:r>
-        <w:t>Version: 1.4 | Date: 2026-08-31</w:t>
+        <w:t>Version: 1.5 | Date: 2026-08-31</w:t>
       </w:r>
     </w:p>
     <w:p>
@@ -57,7 +57,7 @@
     <w:p>
       <w:pPr/>
       <w:r>
-        <w:t>This is the single active roadmap for the controlled migration. MT-0.1 initialization, MT-1.1 inventory and MT-1.2 design are complete (3/32); application migration remains pending. Each Proceed executes one point through its required gates and intended new-repository commit/push, then stops. Dependencies are ordered; point IDs and exact titles remain stable.</w:t>
+        <w:t>This is the single active structural roadmap for the controlled migration. Live Completed/In Progress/Pending state, last/current/next position and progress counts are recorded only in `docs/PROJECT_IMPLEMENTATION_STATUS.md`. Each Proceed executes one point through its required gates and intended new-repository commit/push, then stops. Dependencies are ordered; point IDs and exact titles remain stable.</w:t>
       </w:r>
     </w:p>
     <w:p>
@@ -69,7 +69,7 @@
     <w:p>
       <w:pPr/>
       <w:r>
-        <w:t>Every point includes applicable focused/full tests, parity evidence, secrets review, source-boundary checks, ledger updates and roadmap/DOCX parity completion gates. MT-1.1 detailed inventory may refine this roadmap from evidence, but valid functionality must not be silently dropped and completed IDs must not be renumbered.</w:t>
+        <w:t>Every point includes applicable focused/full tests, parity evidence, secrets review, source-boundary checks and ledger updates. Routine execution progress updates the ledger only and must not edit this roadmap or regenerate its DOCX. Regenerate/verify the DOCX only when roadmap structure/content materially changes. MT-1.1 detailed inventory may refine this roadmap from evidence, but valid functionality must not be silently dropped and completed IDs must not be renumbered.</w:t>
       </w:r>
     </w:p>
     <w:p>
@@ -87,16 +87,9 @@
     <w:p>
       <w:pPr>
         <w:pStyle w:val="Heading1"/>
-        <w:pageBreakBefore/>
       </w:pPr>
       <w:r>
         <w:t>MT-0 - Project initialization</w:t>
-      </w:r>
-    </w:p>
-    <w:p>
-      <w:pPr/>
-      <w:r>
-        <w:t>Stage status: Complete</w:t>
       </w:r>
     </w:p>
     <w:p>
@@ -112,7 +105,7 @@
         <w:keepNext/>
       </w:pPr>
       <w:r>
-        <w:t>Status: Completed | Dependencies: None</w:t>
+        <w:t>Dependencies: None</w:t>
       </w:r>
     </w:p>
     <w:p>
@@ -161,12 +154,6 @@
       </w:r>
     </w:p>
     <w:p>
-      <w:pPr/>
-      <w:r>
-        <w:t>Stage status: In Progress</w:t>
-      </w:r>
-    </w:p>
-    <w:p>
       <w:pPr>
         <w:pStyle w:val="Heading2"/>
       </w:pPr>
@@ -179,7 +166,7 @@
         <w:keepNext/>
       </w:pPr>
       <w:r>
-        <w:t>Status: Completed | Dependencies: MT-0.1</w:t>
+        <w:t>Dependencies: MT-0.1</w:t>
       </w:r>
     </w:p>
     <w:p>
@@ -225,7 +212,7 @@
         <w:keepNext/>
       </w:pPr>
       <w:r>
-        <w:t>Status: Completed | Dependencies: MT-1.1</w:t>
+        <w:t>Dependencies: MT-1.1</w:t>
       </w:r>
     </w:p>
     <w:p>
@@ -265,7 +252,7 @@
         <w:keepNext/>
       </w:pPr>
       <w:r>
-        <w:t>Status: Pending | Dependencies: MT-1.2</w:t>
+        <w:t>Dependencies: MT-1.2</w:t>
       </w:r>
     </w:p>
     <w:p>
@@ -314,12 +301,6 @@
       </w:r>
     </w:p>
     <w:p>
-      <w:pPr/>
-      <w:r>
-        <w:t>Stage status: Pending</w:t>
-      </w:r>
-    </w:p>
-    <w:p>
       <w:pPr>
         <w:pStyle w:val="Heading2"/>
       </w:pPr>
@@ -332,7 +313,7 @@
         <w:keepNext/>
       </w:pPr>
       <w:r>
-        <w:t>Status: Pending | Dependencies: MT-1.3</w:t>
+        <w:t>Dependencies: MT-1.3</w:t>
       </w:r>
     </w:p>
     <w:p>
@@ -372,7 +353,7 @@
         <w:keepNext/>
       </w:pPr>
       <w:r>
-        <w:t>Status: Pending | Dependencies: MT-2.1</w:t>
+        <w:t>Dependencies: MT-2.1</w:t>
       </w:r>
     </w:p>
     <w:p>
@@ -412,7 +393,7 @@
         <w:keepNext/>
       </w:pPr>
       <w:r>
-        <w:t>Status: Pending | Dependencies: MT-2.2</w:t>
+        <w:t>Dependencies: MT-2.2</w:t>
       </w:r>
     </w:p>
     <w:p>
@@ -452,7 +433,7 @@
         <w:keepNext/>
       </w:pPr>
       <w:r>
-        <w:t>Status: Pending | Dependencies: MT-2.3</w:t>
+        <w:t>Dependencies: MT-2.3</w:t>
       </w:r>
     </w:p>
     <w:p>
@@ -492,7 +473,7 @@
         <w:keepNext/>
       </w:pPr>
       <w:r>
-        <w:t>Status: Pending | Dependencies: MT-2.4</w:t>
+        <w:t>Dependencies: MT-2.4</w:t>
       </w:r>
     </w:p>
     <w:p>
@@ -532,7 +513,7 @@
         <w:keepNext/>
       </w:pPr>
       <w:r>
-        <w:t>Status: Pending | Dependencies: MT-2.5</w:t>
+        <w:t>Dependencies: MT-2.5</w:t>
       </w:r>
     </w:p>
     <w:p>
@@ -572,7 +553,7 @@
         <w:keepNext/>
       </w:pPr>
       <w:r>
-        <w:t>Status: Pending | Dependencies: MT-2.6</w:t>
+        <w:t>Dependencies: MT-2.6</w:t>
       </w:r>
     </w:p>
     <w:p>
@@ -621,12 +602,6 @@
       </w:r>
     </w:p>
     <w:p>
-      <w:pPr/>
-      <w:r>
-        <w:t>Stage status: Pending</w:t>
-      </w:r>
-    </w:p>
-    <w:p>
       <w:pPr>
         <w:pStyle w:val="Heading2"/>
       </w:pPr>
@@ -639,7 +614,7 @@
         <w:keepNext/>
       </w:pPr>
       <w:r>
-        <w:t>Status: Pending | Dependencies: MT-2.7</w:t>
+        <w:t>Dependencies: MT-2.7</w:t>
       </w:r>
     </w:p>
     <w:p>
@@ -679,7 +654,7 @@
         <w:keepNext/>
       </w:pPr>
       <w:r>
-        <w:t>Status: Pending | Dependencies: MT-3.1</w:t>
+        <w:t>Dependencies: MT-3.1</w:t>
       </w:r>
     </w:p>
     <w:p>
@@ -719,7 +694,7 @@
         <w:keepNext/>
       </w:pPr>
       <w:r>
-        <w:t>Status: Pending | Dependencies: MT-3.2</w:t>
+        <w:t>Dependencies: MT-3.2</w:t>
       </w:r>
     </w:p>
     <w:p>
@@ -759,7 +734,7 @@
         <w:keepNext/>
       </w:pPr>
       <w:r>
-        <w:t>Status: Pending | Dependencies: MT-3.3</w:t>
+        <w:t>Dependencies: MT-3.3</w:t>
       </w:r>
     </w:p>
     <w:p>
@@ -808,12 +783,6 @@
       </w:r>
     </w:p>
     <w:p>
-      <w:pPr/>
-      <w:r>
-        <w:t>Stage status: Pending</w:t>
-      </w:r>
-    </w:p>
-    <w:p>
       <w:pPr>
         <w:pStyle w:val="Heading2"/>
       </w:pPr>
@@ -826,7 +795,7 @@
         <w:keepNext/>
       </w:pPr>
       <w:r>
-        <w:t>Status: Pending | Dependencies: MT-3.4</w:t>
+        <w:t>Dependencies: MT-3.4</w:t>
       </w:r>
     </w:p>
     <w:p>
@@ -866,7 +835,7 @@
         <w:keepNext/>
       </w:pPr>
       <w:r>
-        <w:t>Status: Pending | Dependencies: MT-4.1</w:t>
+        <w:t>Dependencies: MT-4.1</w:t>
       </w:r>
     </w:p>
     <w:p>
@@ -906,7 +875,7 @@
         <w:keepNext/>
       </w:pPr>
       <w:r>
-        <w:t>Status: Pending | Dependencies: MT-4.2</w:t>
+        <w:t>Dependencies: MT-4.2</w:t>
       </w:r>
     </w:p>
     <w:p>
@@ -946,7 +915,7 @@
         <w:keepNext/>
       </w:pPr>
       <w:r>
-        <w:t>Status: Pending | Dependencies: MT-4.3</w:t>
+        <w:t>Dependencies: MT-4.3</w:t>
       </w:r>
     </w:p>
     <w:p>
@@ -995,12 +964,6 @@
       </w:r>
     </w:p>
     <w:p>
-      <w:pPr/>
-      <w:r>
-        <w:t>Stage status: Pending</w:t>
-      </w:r>
-    </w:p>
-    <w:p>
       <w:pPr>
         <w:pStyle w:val="Heading2"/>
       </w:pPr>
@@ -1013,7 +976,7 @@
         <w:keepNext/>
       </w:pPr>
       <w:r>
-        <w:t>Status: Pending | Dependencies: MT-4.4</w:t>
+        <w:t>Dependencies: MT-4.4</w:t>
       </w:r>
     </w:p>
     <w:p>
@@ -1053,7 +1016,7 @@
         <w:keepNext/>
       </w:pPr>
       <w:r>
-        <w:t>Status: Pending | Dependencies: MT-5.1</w:t>
+        <w:t>Dependencies: MT-5.1</w:t>
       </w:r>
     </w:p>
     <w:p>
@@ -1093,7 +1056,7 @@
         <w:keepNext/>
       </w:pPr>
       <w:r>
-        <w:t>Status: Pending | Dependencies: MT-5.2</w:t>
+        <w:t>Dependencies: MT-5.2</w:t>
       </w:r>
     </w:p>
     <w:p>
@@ -1133,7 +1096,7 @@
         <w:keepNext/>
       </w:pPr>
       <w:r>
-        <w:t>Status: Pending | Dependencies: MT-5.3</w:t>
+        <w:t>Dependencies: MT-5.3</w:t>
       </w:r>
     </w:p>
     <w:p>
@@ -1182,12 +1145,6 @@
       </w:r>
     </w:p>
     <w:p>
-      <w:pPr/>
-      <w:r>
-        <w:t>Stage status: Pending</w:t>
-      </w:r>
-    </w:p>
-    <w:p>
       <w:pPr>
         <w:pStyle w:val="Heading2"/>
       </w:pPr>
@@ -1200,7 +1157,7 @@
         <w:keepNext/>
       </w:pPr>
       <w:r>
-        <w:t>Status: Pending | Dependencies: MT-5.4</w:t>
+        <w:t>Dependencies: MT-5.4</w:t>
       </w:r>
     </w:p>
     <w:p>
@@ -1240,7 +1197,7 @@
         <w:keepNext/>
       </w:pPr>
       <w:r>
-        <w:t>Status: Pending | Dependencies: MT-6.1</w:t>
+        <w:t>Dependencies: MT-6.1</w:t>
       </w:r>
     </w:p>
     <w:p>
@@ -1280,7 +1237,7 @@
         <w:keepNext/>
       </w:pPr>
       <w:r>
-        <w:t>Status: Pending | Dependencies: MT-6.2</w:t>
+        <w:t>Dependencies: MT-6.2</w:t>
       </w:r>
     </w:p>
     <w:p>
@@ -1329,12 +1286,6 @@
       </w:r>
     </w:p>
     <w:p>
-      <w:pPr/>
-      <w:r>
-        <w:t>Stage status: Pending</w:t>
-      </w:r>
-    </w:p>
-    <w:p>
       <w:pPr>
         <w:pStyle w:val="Heading2"/>
       </w:pPr>
@@ -1347,7 +1298,7 @@
         <w:keepNext/>
       </w:pPr>
       <w:r>
-        <w:t>Status: Pending | Dependencies: MT-6.3</w:t>
+        <w:t>Dependencies: MT-6.3</w:t>
       </w:r>
     </w:p>
     <w:p>
@@ -1387,7 +1338,7 @@
         <w:keepNext/>
       </w:pPr>
       <w:r>
-        <w:t>Status: Pending | Dependencies: MT-7.1</w:t>
+        <w:t>Dependencies: MT-7.1</w:t>
       </w:r>
     </w:p>
     <w:p>
@@ -1427,7 +1378,7 @@
         <w:keepNext/>
       </w:pPr>
       <w:r>
-        <w:t>Status: Pending | Dependencies: MT-7.2</w:t>
+        <w:t>Dependencies: MT-7.2</w:t>
       </w:r>
     </w:p>
     <w:p>
@@ -1467,7 +1418,7 @@
         <w:keepNext/>
       </w:pPr>
       <w:r>
-        <w:t>Status: Pending | Dependencies: MT-7.3</w:t>
+        <w:t>Dependencies: MT-7.3</w:t>
       </w:r>
     </w:p>
     <w:p>
@@ -1507,7 +1458,7 @@
         <w:keepNext/>
       </w:pPr>
       <w:r>
-        <w:t>Status: Pending | Dependencies: MT-7.4</w:t>
+        <w:t>Dependencies: MT-7.4</w:t>
       </w:r>
     </w:p>
     <w:p>
@@ -1556,12 +1507,6 @@
       </w:r>
     </w:p>
     <w:p>
-      <w:pPr/>
-      <w:r>
-        <w:t>Stage status: Pending</w:t>
-      </w:r>
-    </w:p>
-    <w:p>
       <w:pPr>
         <w:pStyle w:val="Heading2"/>
       </w:pPr>
@@ -1574,7 +1519,7 @@
         <w:keepNext/>
       </w:pPr>
       <w:r>
-        <w:t>Status: Pending | Dependencies: MT-7.5</w:t>
+        <w:t>Dependencies: MT-7.5</w:t>
       </w:r>
     </w:p>
     <w:p>

</xml_diff>

<commit_message>
Reconcile approved requirements addendum v1.1
</commit_message>
<xml_diff>
--- a/docs/PROJECT_IMPLEMENTATION_ROADMAP.docx
+++ b/docs/PROJECT_IMPLEMENTATION_ROADMAP.docx
@@ -13,7 +13,7 @@
     <w:p>
       <w:pPr/>
       <w:r>
-        <w:t>Version: 1.5 | Date: 2026-08-31</w:t>
+        <w:t>Version: 1.6 | Date: 2026-09-01</w:t>
       </w:r>
     </w:p>
     <w:p>
@@ -26,6 +26,18 @@
       <w:pPr/>
       <w:r>
         <w:t>Binding Preferences: docs/PROJECT_PREFERENCES.md</w:t>
+      </w:r>
+    </w:p>
+    <w:p>
+      <w:pPr/>
+      <w:r>
+        <w:t>Approved scope expansion: docs/PROJECT_REQUIREMENTS_ADDENDUM_v1.1.md</w:t>
+      </w:r>
+    </w:p>
+    <w:p>
+      <w:pPr/>
+      <w:r>
+        <w:t>Addendum traceability: docs/REQUIREMENTS_ADDENDUM_v1.1_RECONCILIATION.md</w:t>
       </w:r>
     </w:p>
     <w:p>
@@ -75,13 +87,19 @@
     <w:p>
       <w:pPr/>
       <w:r>
-        <w:t>Both Goal and Preferences apply. For working features, assess reuse/adapt/refactor/migrate before rewrite; rewrite requires a verified reason. Verify parity, data consistency, integration and regression incrementally rather than using a big-bang rewrite. Prefer conventional solutions, justified Redis roles and a Laravel-only business backend; do not introduce a parallel Node/Express business backend. Record stack deviations only for verified unavoidable blockers and never silently resolve a Goal conflict.</w:t>
+        <w:t>Goal, Preferences and approved addendum v1.1 apply. For working features, assess reuse/adapt/refactor/migrate before rewrite; rewrite requires a verified reason. Verify parity, data consistency, integration and regression incrementally rather than using a big-bang rewrite. Prefer conventional solutions, justified Redis roles and a Laravel-only business backend; do not introduce a parallel Node/Express business backend. Record stack deviations only for verified unavoidable blockers and never silently resolve a Goal conflict.</w:t>
       </w:r>
     </w:p>
     <w:p>
       <w:pPr/>
       <w:r>
         <w:t>Roman Urdu is limited to assistant chat/UI communication. Git-tracked project documentation and technical artifacts use standard English unless the user explicitly requests another language for a specific artifact. User-supplied Goal/Preferences remain byte-preserved in their original language/content.</w:t>
+      </w:r>
+    </w:p>
+    <w:p>
+      <w:pPr/>
+      <w:r>
+        <w:t>Addendum v1.1 adds dependency-ordered points without renumbering existing IDs. Follow document order and explicit dependencies, not numeric ID sorting. P1/P2/P3 are implementation priorities within dependency constraints, not permission to defer required work. Optional loyalty/repair/booking features must be implemented with disablement; they are not silently removed from scope. Full clause traceability is in docs/REQUIREMENTS_ADDENDUM_v1.1_RECONCILIATION.md.</w:t>
       </w:r>
     </w:p>
     <w:p>
@@ -465,7 +483,7 @@
         <w:pStyle w:val="Heading2"/>
       </w:pPr>
       <w:r>
-        <w:t>MT-2.5 - Sales, invoices and returns migration</w:t>
+        <w:t>MT-2.8 - Addendum foundations and capability contracts</w:t>
       </w:r>
     </w:p>
     <w:p>
@@ -485,7 +503,7 @@
         <w:t>Scope:</w:t>
       </w:r>
       <w:r>
-        <w:t xml:space="preserve"> Migrate sales, invoice totals/discounts, operational customer records and verified return behavior.</w:t>
+        <w:t xml:space="preserve"> Define and implement only backward-compatible schema primitives and versioned contracts required by addendum v1.1 before sales migration: Website capabilities, inventory custody/procurement references, monetary adjustment and milestone identities, reset preservation classifications and permission namespaces. Reuse current services; leave feature workflows to their named later points.</w:t>
       </w:r>
     </w:p>
     <w:p>
@@ -497,7 +515,7 @@
         <w:t>Acceptance:</w:t>
       </w:r>
       <w:r>
-        <w:t xml:space="preserve"> Money precision, identifiers, historical snapshots, return adjustments and stock/accounting effects match legacy acceptance. MT-1.1 found stock-return behavior but no full routed sale-refund flow; Goal-required sale returns need an explicit verified contract and fresh tests.</w:t>
+        <w:t xml:space="preserve"> Document the complete addendum entity/API/permission matrix; verify additive MySQL apply/rollback/reapply and existing regressions. Resolve transfer identity versus immutable product/unit history, reset preservation versus transaction references, and sale/payment extension seams without rewriting completed migrations or enabling new public flows.</w:t>
       </w:r>
     </w:p>
     <w:p>
@@ -505,7 +523,7 @@
         <w:pStyle w:val="Heading2"/>
       </w:pPr>
       <w:r>
-        <w:t>MT-2.6 - Warranty and claim migration</w:t>
+        <w:t>MT-2.5 - Sales, invoices and returns migration</w:t>
       </w:r>
     </w:p>
     <w:p>
@@ -513,7 +531,7 @@
         <w:keepNext/>
       </w:pPr>
       <w:r>
-        <w:t>Dependencies: MT-2.5</w:t>
+        <w:t>Dependencies: MT-2.8</w:t>
       </w:r>
     </w:p>
     <w:p>
@@ -525,7 +543,7 @@
         <w:t>Scope:</w:t>
       </w:r>
       <w:r>
-        <w:t xml:space="preserve"> Preserve warranty duration, versioned clauses, claim lifecycle and historical document relationships.</w:t>
+        <w:t xml:space="preserve"> Migrate sales, invoice totals/discounts, operational customer records and verified return behavior. Use the MT-2.8 extension contracts for later promotion, loyalty, trade-in and cash effects; do not hard-code a second money authority.</w:t>
       </w:r>
     </w:p>
     <w:p>
@@ -537,7 +555,7 @@
         <w:t>Acceptance:</w:t>
       </w:r>
       <w:r>
-        <w:t xml:space="preserve"> Sale-time snapshots, permissions, expiry/boundary conditions and historical warranty/claim output parity pass.</w:t>
+        <w:t xml:space="preserve"> Money precision, identifiers, historical snapshots, return adjustments and stock/accounting effects match legacy acceptance. MT-1.1 found stock-return behavior but no full routed sale-refund flow; Goal-required sale returns need an explicit verified contract and fresh tests. Preserve extension identifiers/snapshots and stock custody history; later feature engines remain their own points.</w:t>
       </w:r>
     </w:p>
     <w:p>
@@ -545,7 +563,7 @@
         <w:pStyle w:val="Heading2"/>
       </w:pPr>
       <w:r>
-        <w:t>MT-2.7 - Unified orders, reservations and payments</w:t>
+        <w:t>MT-2.6 - Warranty and claim migration</w:t>
       </w:r>
     </w:p>
     <w:p>
@@ -553,7 +571,7 @@
         <w:keepNext/>
       </w:pPr>
       <w:r>
-        <w:t>Dependencies: MT-2.6</w:t>
+        <w:t>Dependencies: MT-2.5</w:t>
       </w:r>
     </w:p>
     <w:p>
@@ -565,7 +583,7 @@
         <w:t>Scope:</w:t>
       </w:r>
       <w:r>
-        <w:t xml:space="preserve"> Migrate Website order/payment/COD/project-payment services into shared transactions and prove replacement of obsolete cross-database synchronization.</w:t>
+        <w:t xml:space="preserve"> Preserve warranty duration, versioned clauses, claim lifecycle and historical document relationships.</w:t>
       </w:r>
     </w:p>
     <w:p>
@@ -577,7 +595,407 @@
         <w:t>Acceptance:</w:t>
       </w:r>
       <w:r>
-        <w:t xml:space="preserve"> Price/amount/ownership verification, retry/replay, expiration, confirmation-versus-release, reconciliation and payment-failure recovery tests pass. Disabled providers remain safe.</w:t>
+        <w:t xml:space="preserve"> Sale-time snapshots, permissions, expiry/boundary conditions and historical warranty/claim output parity pass.</w:t>
+      </w:r>
+    </w:p>
+    <w:p>
+      <w:pPr>
+        <w:pStyle w:val="Heading2"/>
+      </w:pPr>
+      <w:r>
+        <w:t>MT-2.7 - Unified orders, reservations and payments</w:t>
+      </w:r>
+    </w:p>
+    <w:p>
+      <w:pPr>
+        <w:keepNext/>
+      </w:pPr>
+      <w:r>
+        <w:t>Dependencies: MT-2.6</w:t>
+      </w:r>
+    </w:p>
+    <w:p>
+      <w:pPr/>
+      <w:r>
+        <w:rPr>
+          <w:b/>
+        </w:rPr>
+        <w:t>Scope:</w:t>
+      </w:r>
+      <w:r>
+        <w:t xml:space="preserve"> Migrate Website order/payment/COD/project-payment services into shared transactions and prove replacement of obsolete cross-database synchronization. Consume versioned Website capabilities for new order creation versus legitimate historical access and preserve project/milestone extension identities.</w:t>
+      </w:r>
+    </w:p>
+    <w:p>
+      <w:pPr/>
+      <w:r>
+        <w:rPr>
+          <w:b/>
+        </w:rPr>
+        <w:t>Acceptance:</w:t>
+      </w:r>
+      <w:r>
+        <w:t xml:space="preserve"> Price/amount/ownership verification, retry/replay, expiration, confirmation-versus-release, reconciliation and payment-failure recovery tests pass. Disabled providers remain safe. Mode-denied new commerce flows cannot bypass backend checks; callbacks and authorized historical resources remain safe across switching.</w:t>
+      </w:r>
+    </w:p>
+    <w:p>
+      <w:pPr>
+        <w:pStyle w:val="Heading2"/>
+      </w:pPr>
+      <w:r>
+        <w:t>MT-2.9 - Supplier and procurement services</w:t>
+      </w:r>
+    </w:p>
+    <w:p>
+      <w:pPr>
+        <w:keepNext/>
+      </w:pPr>
+      <w:r>
+        <w:t>Dependencies: MT-2.7</w:t>
+      </w:r>
+    </w:p>
+    <w:p>
+      <w:pPr/>
+      <w:r>
+        <w:rPr>
+          <w:b/>
+        </w:rPr>
+        <w:t>Scope:</w:t>
+      </w:r>
+      <w:r>
+        <w:t xml:space="preserve"> Extend acquisition-source capture with supplier/vendor profiles, contacts, purchase orders, lines, status, expected dates, partial receiving, landed/unit costs and supplier-to-acquisition history (P1). Add outlet/product reorder thresholds, low/out-of-stock alerts and actionable procurement recommendations (P2).</w:t>
+      </w:r>
+    </w:p>
+    <w:p>
+      <w:pPr/>
+      <w:r>
+        <w:rPr>
+          <w:b/>
+        </w:rPr>
+        <w:t>Acceptance:</w:t>
+      </w:r>
+      <w:r>
+        <w:t xml:space="preserve"> Receiving, cancellation and retry are permissioned, idempotent and concurrency-safe; quantities/costs reconcile to existing acquisitions. Threshold changes and recommendation queries are scoped, indexed and tested; no full accounting/ERP is introduced.</w:t>
+      </w:r>
+    </w:p>
+    <w:p>
+      <w:pPr>
+        <w:pStyle w:val="Heading2"/>
+      </w:pPr>
+      <w:r>
+        <w:t>MT-2.10 - Stocktake and cycle-count services</w:t>
+      </w:r>
+    </w:p>
+    <w:p>
+      <w:pPr>
+        <w:keepNext/>
+      </w:pPr>
+      <w:r>
+        <w:t>Dependencies: MT-2.9</w:t>
+      </w:r>
+    </w:p>
+    <w:p>
+      <w:pPr/>
+      <w:r>
+        <w:rPr>
+          <w:b/>
+        </w:rPr>
+        <w:t>Scope:</w:t>
+      </w:r>
+      <w:r>
+        <w:t xml:space="preserve"> Add physical count sessions for quantity and serialized/IMEI stock, expected/count variance, reason codes, approvals, recounts and audited reconciliation (P1).</w:t>
+      </w:r>
+    </w:p>
+    <w:p>
+      <w:pPr/>
+      <w:r>
+        <w:rPr>
+          <w:b/>
+        </w:rPr>
+        <w:t>Acceptance:</w:t>
+      </w:r>
+      <w:r>
+        <w:t xml:space="preserve"> Concurrent sale/reservation versus counting is reconciled against an explicit count baseline; only approved differences produce stock adjustments. Duplicate counts, stale approvals, rollback and cross-outlet access are tested; history is never fabricated.</w:t>
+      </w:r>
+    </w:p>
+    <w:p>
+      <w:pPr>
+        <w:pStyle w:val="Heading2"/>
+      </w:pPr>
+      <w:r>
+        <w:t>MT-2.11 - Inter-outlet stock transfer services</w:t>
+      </w:r>
+    </w:p>
+    <w:p>
+      <w:pPr>
+        <w:keepNext/>
+      </w:pPr>
+      <w:r>
+        <w:t>Dependencies: MT-2.10</w:t>
+      </w:r>
+    </w:p>
+    <w:p>
+      <w:pPr/>
+      <w:r>
+        <w:rPr>
+          <w:b/>
+        </w:rPr>
+        <w:t>Scope:</w:t>
+      </w:r>
+      <w:r>
+        <w:t xml:space="preserve"> Add authorized dispatch, in-transit custody, receive/reject/partial-receive and transfer history for quantity and serialized stock (P1).</w:t>
+      </w:r>
+    </w:p>
+    <w:p>
+      <w:pPr/>
+      <w:r>
+        <w:rPr>
+          <w:b/>
+        </w:rPr>
+        <w:t>Acceptance:</w:t>
+      </w:r>
+      <w:r>
+        <w:t xml:space="preserve"> MySQL races prove one owner and one active IMEI claim, no double receipt/dispatch or sale of in-transit units, balanced movements and rollback. Stable origin identifiers and historical sale/acquisition references survive destination custody changes.</w:t>
+      </w:r>
+    </w:p>
+    <w:p>
+      <w:pPr>
+        <w:pStyle w:val="Heading2"/>
+      </w:pPr>
+      <w:r>
+        <w:t>MT-2.12 - Cash sessions and operational expense services</w:t>
+      </w:r>
+    </w:p>
+    <w:p>
+      <w:pPr>
+        <w:keepNext/>
+      </w:pPr>
+      <w:r>
+        <w:t>Dependencies: MT-2.11</w:t>
+      </w:r>
+    </w:p>
+    <w:p>
+      <w:pPr/>
+      <w:r>
+        <w:rPr>
+          <w:b/>
+        </w:rPr>
+        <w:t>Scope:</w:t>
+      </w:r>
+      <w:r>
+        <w:t xml:space="preserve"> Add operator/outlet cash sessions, opening cash, receipts, authorized expenses/payouts, closing counts, expected/actual variance, daily closing and reporting (P1).</w:t>
+      </w:r>
+    </w:p>
+    <w:p>
+      <w:pPr/>
+      <w:r>
+        <w:rPr>
+          <w:b/>
+        </w:rPr>
+        <w:t>Acceptance:</w:t>
+      </w:r>
+      <w:r>
+        <w:t xml:space="preserve"> Exact cash reconciliation includes sale/return/payment effects with scoped approval, audit, retry and concurrent-close guards. Closed snapshots remain historical; operational cash control is not a general ledger.</w:t>
+      </w:r>
+    </w:p>
+    <w:p>
+      <w:pPr>
+        <w:pStyle w:val="Heading2"/>
+      </w:pPr>
+      <w:r>
+        <w:t>MT-2.13 - Trade-in and buyback services</w:t>
+      </w:r>
+    </w:p>
+    <w:p>
+      <w:pPr>
+        <w:keepNext/>
+      </w:pPr>
+      <w:r>
+        <w:t>Dependencies: MT-2.12</w:t>
+      </w:r>
+    </w:p>
+    <w:p>
+      <w:pPr/>
+      <w:r>
+        <w:rPr>
+          <w:b/>
+        </w:rPr>
+        <w:t>Scope:</w:t>
+      </w:r>
+      <w:r>
+        <w:t xml:space="preserve"> Formalize individual-seller intake with device/IMEI identity, condition/diagnostics, valuation, ownership/source details and purchase or sale-credit treatment (P2).</w:t>
+      </w:r>
+    </w:p>
+    <w:p>
+      <w:pPr/>
+      <w:r>
+        <w:rPr>
+          <w:b/>
+        </w:rPr>
+        <w:t>Acceptance:</w:t>
+      </w:r>
+      <w:r>
+        <w:t xml:space="preserve"> Authorized valuations and exact purchase/credit amounts link to acquisition and sale snapshots without double credit/intake. Active identifier uniqueness, source privacy, cancellation and transactional rollback pass.</w:t>
+      </w:r>
+    </w:p>
+    <w:p>
+      <w:pPr>
+        <w:pStyle w:val="Heading2"/>
+      </w:pPr>
+      <w:r>
+        <w:t>MT-2.14 - Promotion and coupon services</w:t>
+      </w:r>
+    </w:p>
+    <w:p>
+      <w:pPr>
+        <w:keepNext/>
+      </w:pPr>
+      <w:r>
+        <w:t>Dependencies: MT-2.13</w:t>
+      </w:r>
+    </w:p>
+    <w:p>
+      <w:pPr/>
+      <w:r>
+        <w:rPr>
+          <w:b/>
+        </w:rPr>
+        <w:t>Scope:</w:t>
+      </w:r>
+      <w:r>
+        <w:t xml:space="preserve"> Implement shared fixed/percentage promotion and coupon calculations with validity, minimum/maximum conditions, product/category scope, usage limits, customer/order restrictions and explicit stacking rules (P2).</w:t>
+      </w:r>
+    </w:p>
+    <w:p>
+      <w:pPr/>
+      <w:r>
+        <w:rPr>
+          <w:b/>
+        </w:rPr>
+        <w:t>Acceptance:</w:t>
+      </w:r>
+      <w:r>
+        <w:t xml:space="preserve"> POS and Website use identical server calculations and immutable discount snapshots. Concurrent usage-limit claims, tampering, retries, expiry, cancellation and return effects pass with audit.</w:t>
+      </w:r>
+    </w:p>
+    <w:p>
+      <w:pPr>
+        <w:pStyle w:val="Heading2"/>
+      </w:pPr>
+      <w:r>
+        <w:t>MT-2.17 - Validated bulk data workflows</w:t>
+      </w:r>
+    </w:p>
+    <w:p>
+      <w:pPr>
+        <w:keepNext/>
+      </w:pPr>
+      <w:r>
+        <w:t>Dependencies: MT-2.14</w:t>
+      </w:r>
+    </w:p>
+    <w:p>
+      <w:pPr/>
+      <w:r>
+        <w:rPr>
+          <w:b/>
+        </w:rPr>
+        <w:t>Scope:</w:t>
+      </w:r>
+      <w:r>
+        <w:t xml:space="preserve"> Provide CSV/XLSX-style catalogue, price, master-data and inventory import/export with scoped fields, preview, row-level errors and explicit operational versus historical-import boundaries (P2).</w:t>
+      </w:r>
+    </w:p>
+    <w:p>
+      <w:pPr/>
+      <w:r>
+        <w:rPr>
+          <w:b/>
+        </w:rPr>
+        <w:t>Acceptance:</w:t>
+      </w:r>
+      <w:r>
+        <w:t xml:space="preserve"> Permissions, malicious file/formula handling, exact values, row/whole-batch recovery, idempotency and stock/hold invariants pass. Exports exclude unnecessary sensitive fields; imports never write raw stock counters around shared services.</w:t>
+      </w:r>
+    </w:p>
+    <w:p>
+      <w:pPr>
+        <w:pStyle w:val="Heading2"/>
+      </w:pPr>
+      <w:r>
+        <w:t>MT-2.15 - Customer loyalty services</w:t>
+      </w:r>
+    </w:p>
+    <w:p>
+      <w:pPr>
+        <w:keepNext/>
+      </w:pPr>
+      <w:r>
+        <w:t>Dependencies: MT-2.17</w:t>
+      </w:r>
+    </w:p>
+    <w:p>
+      <w:pPr/>
+      <w:r>
+        <w:rPr>
+          <w:b/>
+        </w:rPr>
+        <w:t>Scope:</w:t>
+      </w:r>
+      <w:r>
+        <w:t xml:space="preserve"> Add an optional disableable rewards framework with earning, redemption, expiry, cancellation/return reversal, fraud controls, audit and configuration (P3).</w:t>
+      </w:r>
+    </w:p>
+    <w:p>
+      <w:pPr/>
+      <w:r>
+        <w:rPr>
+          <w:b/>
+        </w:rPr>
+        <w:t>Acceptance:</w:t>
+      </w:r>
+      <w:r>
+        <w:t xml:space="preserve"> Concurrent earn/redeem/replay and reversal tests prove consistent reward balances. Rewards remain separate from authoritative money; disabled operation preserves history and existing obligations without silently changing sale totals.</w:t>
+      </w:r>
+    </w:p>
+    <w:p>
+      <w:pPr>
+        <w:pStyle w:val="Heading2"/>
+      </w:pPr>
+      <w:r>
+        <w:t>MT-2.16 - Paid repair job services</w:t>
+      </w:r>
+    </w:p>
+    <w:p>
+      <w:pPr>
+        <w:keepNext/>
+      </w:pPr>
+      <w:r>
+        <w:t>Dependencies: MT-2.15</w:t>
+      </w:r>
+    </w:p>
+    <w:p>
+      <w:pPr/>
+      <w:r>
+        <w:rPr>
+          <w:b/>
+        </w:rPr>
+        <w:t>Scope:</w:t>
+      </w:r>
+      <w:r>
+        <w:t xml:space="preserve"> Add optional disableable out-of-warranty repair intake, identifiers, diagnosis, estimate/approval, parts/labor, status, collection, payment linkage and history (P3).</w:t>
+      </w:r>
+    </w:p>
+    <w:p>
+      <w:pPr/>
+      <w:r>
+        <w:rPr>
+          <w:b/>
+        </w:rPr>
+        <w:t>Acceptance:</w:t>
+      </w:r>
+      <w:r>
+        <w:t xml:space="preserve"> Permission, estimate/amount ownership, stock parts, replay, payment and lifecycle tests pass. Warranty claims remain distinct, disabled new intake does not strand existing jobs, and historical estimates are preserved.</w:t>
       </w:r>
     </w:p>
     <w:p>
@@ -614,7 +1032,7 @@
         <w:keepNext/>
       </w:pPr>
       <w:r>
-        <w:t>Dependencies: MT-2.7</w:t>
+        <w:t>Dependencies: MT-2.16</w:t>
       </w:r>
     </w:p>
     <w:p>
@@ -626,7 +1044,7 @@
         <w:t>Scope:</w:t>
       </w:r>
       <w:r>
-        <w:t xml:space="preserve"> Migrate verified reports, dashboards, A4/Thermal output, invoice/warranty documents and safe communication templates.</w:t>
+        <w:t xml:space="preserve"> Migrate verified reports, dashboards, A4/Thermal output, invoice/warranty documents and safe communication templates. Include new procurement, stocktake/transfer, cash/expense, trade-in, promotion/loyalty and optional repair histories in scoped reporting and retail labels.</w:t>
       </w:r>
     </w:p>
     <w:p>
@@ -638,7 +1056,7 @@
         <w:t>Acceptance:</w:t>
       </w:r>
       <w:r>
-        <w:t xml:space="preserve"> Role-scoped totals/exports, history, print/download and protected-template-placeholder parity tests pass; no real messages are sent.</w:t>
+        <w:t xml:space="preserve"> Role-scoped totals/exports, history, print/download and protected-template-placeholder parity tests pass; no real messages are sent. Reconciled reports never conflate rewards with money or private supplier/client data with public exports.</w:t>
       </w:r>
     </w:p>
     <w:p>
@@ -666,7 +1084,7 @@
         <w:t>Scope:</w:t>
       </w:r>
       <w:r>
-        <w:t xml:space="preserve"> Migrate Website-managed pages, navigation, homepage/catalogue, SEO/legal/promotion settings, media, themes and branding controls into the backend.</w:t>
+        <w:t xml:space="preserve"> Migrate Website-managed pages, navigation, homepage/catalogue, SEO/legal/promotion settings, media, themes and branding controls into the backend. Extend modular content with service landing schemas, managed case studies, client/industry disclosure, digital testimonials separate from retail reviews, reusable FAQs, insights/blog/guides and service associations.</w:t>
       </w:r>
     </w:p>
     <w:p>
@@ -678,7 +1096,7 @@
         <w:t>Acceptance:</w:t>
       </w:r>
       <w:r>
-        <w:t xml:space="preserve"> Draft/preview/publish, revisions/rollback, safe uploads/content, cache invalidation and distinct POS/Website settings are preserved.</w:t>
+        <w:t xml:space="preserve"> Draft/preview/publish, revisions/rollback, safe uploads/content, cache invalidation and distinct POS/Website settings are preserved. Draft/preview/publish/revisions, consent/moderation, disclosure, metadata and safe media handling cover each added content family; common plus capability/mode variants avoid three page-tree copies.</w:t>
       </w:r>
     </w:p>
     <w:p>
@@ -686,7 +1104,7 @@
         <w:pStyle w:val="Heading2"/>
       </w:pPr>
       <w:r>
-        <w:t>MT-3.3 - Audit, configuration, backups and integrations</w:t>
+        <w:t>MT-3.7 - Website operating mode publication</w:t>
       </w:r>
     </w:p>
     <w:p>
@@ -706,7 +1124,7 @@
         <w:t>Scope:</w:t>
       </w:r>
       <w:r>
-        <w:t xml:space="preserve"> Migrate audit/redaction, safe configuration recovery, backup/history/restore guards and valid external-integration contracts.</w:t>
+        <w:t xml:space="preserve"> Publish one Laravel-owned Website profile: digital_only, hybrid or commerce_only. Evolve common/digital/commerce modular content with explicit mode copy variants; define route/API/CTA/SEO/sitemap and historical-access capability rules.</w:t>
       </w:r>
     </w:p>
     <w:p>
@@ -718,7 +1136,7 @@
         <w:t>Acceptance:</w:t>
       </w:r>
       <w:r>
-        <w:t xml:space="preserve"> Secret masking, key-dependent recovery, target-only backup/restore rehearsal and disabled-by-default external jobs are verified; no arbitrary commands/endpoints are introduced.</w:t>
+        <w:t xml:space="preserve"> Preview/diff validates affected sections/routes; separate publish permission, audit/revisions and one-click rollback pass. Mode switches delete no data; authorized orders/invoices/project-payment history remain accessible. Versioned cache-safe reads and affected-cache revalidation prevent stale capability exposure.</w:t>
       </w:r>
     </w:p>
     <w:p>
@@ -726,7 +1144,7 @@
         <w:pStyle w:val="Heading2"/>
       </w:pPr>
       <w:r>
-        <w:t>MT-3.4 - Versioned REST API and contract acceptance</w:t>
+        <w:t>MT-3.5 - Digital service catalogue and lead services</w:t>
       </w:r>
     </w:p>
     <w:p>
@@ -734,7 +1152,7 @@
         <w:keepNext/>
       </w:pPr>
       <w:r>
-        <w:t>Dependencies: MT-3.3</w:t>
+        <w:t>Dependencies: MT-3.7</w:t>
       </w:r>
     </w:p>
     <w:p>
@@ -746,7 +1164,7 @@
         <w:t>Scope:</w:t>
       </w:r>
       <w:r>
-        <w:t xml:space="preserve"> Define and expose public catalogue/content plus authenticated account/cart/order/payment APIs for Next.js.</w:t>
+        <w:t xml:space="preserve"> Extend service landing content and low-friction progressive enquiries (P1); add quote/fixed/starting-from/package pricing, add-ons, timezone-safe optional consultation/callback windows and lightweight assigned lead pipeline, notes/follow-ups/history (P2).</w:t>
       </w:r>
     </w:p>
     <w:p>
@@ -758,7 +1176,207 @@
         <w:t>Acceptance:</w:t>
       </w:r>
       <w:r>
-        <w:t xml:space="preserve"> Documented payload/error/pagination contracts, authorization, rate limits, public-data allowlists and freshness tests pass; writes use shared services.</w:t>
+        <w:t xml:space="preserve"> Service identity, optional fields, safe reference uploads, spam/rate controls, permissions and authoritative pricing are tested. Mode gates block new inactive leads without removing history. External calendars remain optional/disabled unless configured; no general CRM is built.</w:t>
+      </w:r>
+    </w:p>
+    <w:p>
+      <w:pPr>
+        <w:pStyle w:val="Heading2"/>
+      </w:pPr>
+      <w:r>
+        <w:t>MT-3.6 - Client projects, proposals and milestone services</w:t>
+      </w:r>
+    </w:p>
+    <w:p>
+      <w:pPr>
+        <w:keepNext/>
+      </w:pPr>
+      <w:r>
+        <w:t>Dependencies: MT-3.5</w:t>
+      </w:r>
+    </w:p>
+    <w:p>
+      <w:pPr/>
+      <w:r>
+        <w:rPr>
+          <w:b/>
+        </w:rPr>
+        <w:t>Scope:</w:t>
+      </w:r>
+      <w:r>
+        <w:t xml:space="preserve"> Evolve requests/quotes into owned project lifecycle and approved scope/deliverable proposals with deposit/milestone/final schedules (P1), private client reference/delivery files and privacy-conscious aggregate conversion reporting (P2).</w:t>
+      </w:r>
+    </w:p>
+    <w:p>
+      <w:pPr/>
+      <w:r>
+        <w:rPr>
+          <w:b/>
+        </w:rPr>
+        <w:t>Acceptance:</w:t>
+      </w:r>
+      <w:r>
+        <w:t xml:space="preserve"> Exact approved amounts, validity/expiry, immutable paid milestones, ownership and payment replay/reconciliation pass. Private files require content/type/size checks, audited immutable references and retention. Mode changes retain authorized portal/payment access; analytics minimize sensitive data.</w:t>
+      </w:r>
+    </w:p>
+    <w:p>
+      <w:pPr>
+        <w:pStyle w:val="Heading2"/>
+      </w:pPr>
+      <w:r>
+        <w:t>MT-3.9 - Customer engagement and notification services</w:t>
+      </w:r>
+    </w:p>
+    <w:p>
+      <w:pPr>
+        <w:keepNext/>
+      </w:pPr>
+      <w:r>
+        <w:t>Dependencies: MT-3.6</w:t>
+      </w:r>
+    </w:p>
+    <w:p>
+      <w:pPr/>
+      <w:r>
+        <w:rPr>
+          <w:b/>
+        </w:rPr>
+        <w:t>Scope:</w:t>
+      </w:r>
+      <w:r>
+        <w:t xml:space="preserve"> Add opt-in back-in-stock/price-drop notifications (P2) and wishlist/save-for-later persistence (P3), using verified product/customer references and Website capabilities.</w:t>
+      </w:r>
+    </w:p>
+    <w:p>
+      <w:pPr/>
+      <w:r>
+        <w:rPr>
+          <w:b/>
+        </w:rPr>
+        <w:t>Acceptance:</w:t>
+      </w:r>
+      <w:r>
+        <w:t xml:space="preserve"> Consent, preferences, unsubscribe, rate limits, deduplication, unavailable products and guest/account ownership pass. No inactive-mode discovery/delivery leakage; external delivery is disabled by default and tested using safe fakes.</w:t>
+      </w:r>
+    </w:p>
+    <w:p>
+      <w:pPr>
+        <w:pStyle w:val="Heading2"/>
+      </w:pPr>
+      <w:r>
+        <w:t>MT-3.3 - Audit, configuration, backups and integrations</w:t>
+      </w:r>
+    </w:p>
+    <w:p>
+      <w:pPr>
+        <w:keepNext/>
+      </w:pPr>
+      <w:r>
+        <w:t>Dependencies: MT-3.9</w:t>
+      </w:r>
+    </w:p>
+    <w:p>
+      <w:pPr/>
+      <w:r>
+        <w:rPr>
+          <w:b/>
+        </w:rPr>
+        <w:t>Scope:</w:t>
+      </w:r>
+      <w:r>
+        <w:t xml:space="preserve"> Migrate audit/redaction, safe configuration recovery, backup/history/restore guards and valid external-integration contracts.</w:t>
+      </w:r>
+    </w:p>
+    <w:p>
+      <w:pPr/>
+      <w:r>
+        <w:rPr>
+          <w:b/>
+        </w:rPr>
+        <w:t>Acceptance:</w:t>
+      </w:r>
+      <w:r>
+        <w:t xml:space="preserve"> Secret masking, key-dependent recovery, target-only backup/restore rehearsal and disabled-by-default external jobs are verified; no arbitrary commands/endpoints are introduced.</w:t>
+      </w:r>
+    </w:p>
+    <w:p>
+      <w:pPr>
+        <w:pStyle w:val="Heading2"/>
+      </w:pPr>
+      <w:r>
+        <w:t>MT-3.8 - Guarded data reset services</w:t>
+      </w:r>
+    </w:p>
+    <w:p>
+      <w:pPr>
+        <w:keepNext/>
+      </w:pPr>
+      <w:r>
+        <w:t>Dependencies: MT-3.3</w:t>
+      </w:r>
+    </w:p>
+    <w:p>
+      <w:pPr/>
+      <w:r>
+        <w:rPr>
+          <w:b/>
+        </w:rPr>
+        <w:t>Scope:</w:t>
+      </w:r>
+      <w:r>
+        <w:t xml:space="preserve"> Implement Transactional Data Reset, Business Data Reset and Factory Reset with explicit domain selection and documented preservation/bootstrap matrices across all approved business domains and private objects.</w:t>
+      </w:r>
+    </w:p>
+    <w:p>
+      <w:pPr/>
+      <w:r>
+        <w:rPr>
+          <w:b/>
+        </w:rPr>
+        <w:t>Acceptance:</w:t>
+      </w:r>
+      <w:r>
+        <w:t xml:space="preserve"> Permission plus recent re-authentication, record/file-count dry-run, typed reset-level confirmation, mandatory automatic verified backup, dependency-safe deletion and integrity checks pass. Stop if backup is impossible. Actor/scope/time/backup/result audit survives reset; private object cleanup matches DB semantics. Never use migrate:fresh, indiscriminate truncation or schema destruction; production execution remains separately authorized.</w:t>
+      </w:r>
+    </w:p>
+    <w:p>
+      <w:pPr>
+        <w:pStyle w:val="Heading2"/>
+      </w:pPr>
+      <w:r>
+        <w:t>MT-3.4 - Versioned REST API and contract acceptance</w:t>
+      </w:r>
+    </w:p>
+    <w:p>
+      <w:pPr>
+        <w:keepNext/>
+      </w:pPr>
+      <w:r>
+        <w:t>Dependencies: MT-3.8</w:t>
+      </w:r>
+    </w:p>
+    <w:p>
+      <w:pPr/>
+      <w:r>
+        <w:rPr>
+          <w:b/>
+        </w:rPr>
+        <w:t>Scope:</w:t>
+      </w:r>
+      <w:r>
+        <w:t xml:space="preserve"> Define and expose public catalogue/content plus authenticated account/cart/order/payment APIs for Next.js. Add documented approved-domain and operating-profile APIs, mode-aware queries/cache keys and indexed pagination; no public page may fetch the full inventory.</w:t>
+      </w:r>
+    </w:p>
+    <w:p>
+      <w:pPr/>
+      <w:r>
+        <w:rPr>
+          <w:b/>
+        </w:rPr>
+        <w:t>Acceptance:</w:t>
+      </w:r>
+      <w:r>
+        <w:t xml:space="preserve"> Documented payload/error/pagination contracts, authorization, rate limits, public-data allowlists and freshness tests pass; writes use shared services. Direct route/API capability denial, authenticated historical exceptions, selective cache invalidation and all-mode payload/request budgets pass before Website integration.</w:t>
       </w:r>
     </w:p>
     <w:p>
@@ -847,7 +1465,7 @@
         <w:t>Scope:</w:t>
       </w:r>
       <w:r>
-        <w:t xml:space="preserve"> Migrate product/unit/IMEI, acquisition, stock, sale and return workflows onto verified backend services.</w:t>
+        <w:t xml:space="preserve"> Migrate product/unit/IMEI, acquisition, stock, sale and return workflows onto verified backend services. Add barcode/QR/IMEI scanner-friendly lookup/entry and controlled product/unit retail label generation/printing.</w:t>
       </w:r>
     </w:p>
     <w:p>
@@ -859,7 +1477,7 @@
         <w:t>Acceptance:</w:t>
       </w:r>
       <w:r>
-        <w:t xml:space="preserve"> Keyboard/form validation, pagination, conflict handling, totals and critical transaction-completion journeys pass.</w:t>
+        <w:t xml:space="preserve"> Keyboard/form validation, pagination, conflict handling, totals and critical transaction-completion journeys pass. Scanning and label requests retain validation and permissions; shared promotion/coupon and optional loyalty adjustments are server-calculated and visible in sale/return journeys.</w:t>
       </w:r>
     </w:p>
     <w:p>
@@ -867,7 +1485,7 @@
         <w:pStyle w:val="Heading2"/>
       </w:pPr>
       <w:r>
-        <w:t>MT-4.3 - POS customer, warranty and reporting interfaces</w:t>
+        <w:t>MT-4.5 - Procurement and stock control interfaces</w:t>
       </w:r>
     </w:p>
     <w:p>
@@ -887,7 +1505,7 @@
         <w:t>Scope:</w:t>
       </w:r>
       <w:r>
-        <w:t xml:space="preserve"> Migrate required customer/history, invoice, warranty/claim, dashboard, report and export UI.</w:t>
+        <w:t xml:space="preserve"> Build supplier/PO/partial receiving, stocktake/variance/recount/approval, transfer dispatch/in-transit/receive/reject, low-stock reorder and validated bulk preview/error/export interfaces over verified services.</w:t>
       </w:r>
     </w:p>
     <w:p>
@@ -899,7 +1517,7 @@
         <w:t>Acceptance:</w:t>
       </w:r>
       <w:r>
-        <w:t xml:space="preserve"> Role-scoped flows, historical records, Thermal 80mm/A4 preview-download-print and mobile layouts are verified.</w:t>
+        <w:t xml:space="preserve"> Role/outlet, scanner-friendly entry, concurrent conflicts, partial operations, count approvals, recovery and privacy journeys pass in Playwright on supported layouts; the UI cannot bypass stock/procurement validation.</w:t>
       </w:r>
     </w:p>
     <w:p>
@@ -907,7 +1525,7 @@
         <w:pStyle w:val="Heading2"/>
       </w:pPr>
       <w:r>
-        <w:t>MT-4.4 - Website CMS and platform administration interfaces</w:t>
+        <w:t>MT-4.6 - Cash, trade-in and repair interfaces</w:t>
       </w:r>
     </w:p>
     <w:p>
@@ -915,7 +1533,7 @@
         <w:keepNext/>
       </w:pPr>
       <w:r>
-        <w:t>Dependencies: MT-4.3</w:t>
+        <w:t>Dependencies: MT-4.5</w:t>
       </w:r>
     </w:p>
     <w:p>
@@ -927,7 +1545,7 @@
         <w:t>Scope:</w:t>
       </w:r>
       <w:r>
-        <w:t xml:space="preserve"> Migrate protected React admin screens for Website CMS and POS configuration, revisions/media/branding/payment settings.</w:t>
+        <w:t xml:space="preserve"> Provide opening/expenses/payout/closing cash journeys, individual-seller valuation/intake/sale-credit, optional paid-repair estimate/approval/collection and linked histories.</w:t>
       </w:r>
     </w:p>
     <w:p>
@@ -939,7 +1557,167 @@
         <w:t>Acceptance:</w:t>
       </w:r>
       <w:r>
-        <w:t xml:space="preserve"> Separate permissions, preview/publish/rollback, safe recovery, secret masking and Dynamic Platform parity acceptance pass.</w:t>
+        <w:t xml:space="preserve"> Exact money, variance/approval, double-submit, privacy and role controls pass. Disabled repair behavior retains legitimate historical access; warranties remain a separate workflow.</w:t>
+      </w:r>
+    </w:p>
+    <w:p>
+      <w:pPr>
+        <w:pStyle w:val="Heading2"/>
+      </w:pPr>
+      <w:r>
+        <w:t>MT-4.3 - POS customer, warranty and reporting interfaces</w:t>
+      </w:r>
+    </w:p>
+    <w:p>
+      <w:pPr>
+        <w:keepNext/>
+      </w:pPr>
+      <w:r>
+        <w:t>Dependencies: MT-4.6</w:t>
+      </w:r>
+    </w:p>
+    <w:p>
+      <w:pPr/>
+      <w:r>
+        <w:rPr>
+          <w:b/>
+        </w:rPr>
+        <w:t>Scope:</w:t>
+      </w:r>
+      <w:r>
+        <w:t xml:space="preserve"> Migrate required customer/history, invoice, warranty/claim, dashboard, report and export UI.</w:t>
+      </w:r>
+    </w:p>
+    <w:p>
+      <w:pPr/>
+      <w:r>
+        <w:rPr>
+          <w:b/>
+        </w:rPr>
+        <w:t>Acceptance:</w:t>
+      </w:r>
+      <w:r>
+        <w:t xml:space="preserve"> Role-scoped flows, historical records, Thermal 80mm/A4 preview-download-print and mobile layouts are verified.</w:t>
+      </w:r>
+    </w:p>
+    <w:p>
+      <w:pPr>
+        <w:pStyle w:val="Heading2"/>
+      </w:pPr>
+      <w:r>
+        <w:t>MT-4.4 - Website CMS and platform administration interfaces</w:t>
+      </w:r>
+    </w:p>
+    <w:p>
+      <w:pPr>
+        <w:keepNext/>
+      </w:pPr>
+      <w:r>
+        <w:t>Dependencies: MT-4.3</w:t>
+      </w:r>
+    </w:p>
+    <w:p>
+      <w:pPr/>
+      <w:r>
+        <w:rPr>
+          <w:b/>
+        </w:rPr>
+        <w:t>Scope:</w:t>
+      </w:r>
+      <w:r>
+        <w:t xml:space="preserve"> Migrate protected React admin screens for Website CMS and POS configuration, revisions/media/branding/payment settings. Include three-way Website mode selector, per-mode preview and publish impact, revision rollback, case studies/digital testimonials/knowledge content, promotion/coupon and optional loyalty settings.</w:t>
+      </w:r>
+    </w:p>
+    <w:p>
+      <w:pPr/>
+      <w:r>
+        <w:rPr>
+          <w:b/>
+        </w:rPr>
+        <w:t>Acceptance:</w:t>
+      </w:r>
+      <w:r>
+        <w:t xml:space="preserve"> Separate permissions, preview/publish/rollback, safe recovery, secret masking and Dynamic Platform parity acceptance pass. Publish permissions remain distinct from editing; publication triggers verified cache/sitemap/SEO revalidation and does not delete historical data.</w:t>
+      </w:r>
+    </w:p>
+    <w:p>
+      <w:pPr>
+        <w:pStyle w:val="Heading2"/>
+      </w:pPr>
+      <w:r>
+        <w:t>MT-4.8 - Digital operations administration interfaces</w:t>
+      </w:r>
+    </w:p>
+    <w:p>
+      <w:pPr>
+        <w:keepNext/>
+      </w:pPr>
+      <w:r>
+        <w:t>Dependencies: MT-4.4</w:t>
+      </w:r>
+    </w:p>
+    <w:p>
+      <w:pPr/>
+      <w:r>
+        <w:rPr>
+          <w:b/>
+        </w:rPr>
+        <w:t>Scope:</w:t>
+      </w:r>
+      <w:r>
+        <w:t xml:space="preserve"> Provide service/package/add-on management, enquiry/lead ownership and follow-ups, booking administration, project lifecycle, proposal/milestone approvals, private file exchange and aggregate conversion reporting.</w:t>
+      </w:r>
+    </w:p>
+    <w:p>
+      <w:pPr/>
+      <w:r>
+        <w:rPr>
+          <w:b/>
+        </w:rPr>
+        <w:t>Acceptance:</w:t>
+      </w:r>
+      <w:r>
+        <w:t xml:space="preserve"> Role/ownership, safe upload/download, approved monetary snapshots, paid milestone immutability and mode preview/history behavior pass in Playwright; client data is not leaked in internal notes or analytics.</w:t>
+      </w:r>
+    </w:p>
+    <w:p>
+      <w:pPr>
+        <w:pStyle w:val="Heading2"/>
+      </w:pPr>
+      <w:r>
+        <w:t>MT-4.7 - Data reset administration interface</w:t>
+      </w:r>
+    </w:p>
+    <w:p>
+      <w:pPr>
+        <w:keepNext/>
+      </w:pPr>
+      <w:r>
+        <w:t>Dependencies: MT-4.8</w:t>
+      </w:r>
+    </w:p>
+    <w:p>
+      <w:pPr/>
+      <w:r>
+        <w:rPr>
+          <w:b/>
+        </w:rPr>
+        <w:t>Scope:</w:t>
+      </w:r>
+      <w:r>
+        <w:t xml:space="preserve"> Provide three clearly labeled reset levels, domain selection, preservation display, preview counts, recent re-authentication, verified-backup evidence, typed confirmation and outcome/audit reporting.</w:t>
+      </w:r>
+    </w:p>
+    <w:p>
+      <w:pPr/>
+      <w:r>
+        <w:rPr>
+          <w:b/>
+        </w:rPr>
+        <w:t>Acceptance:</w:t>
+      </w:r>
+      <w:r>
+        <w:t xml:space="preserve"> End-to-end dry-run, denied access, stale preview, failed backup, cancellation, partial failure/recovery and minimum-bootstrap access are verified only on disposable target fixtures; production reset remains HOLD.</w:t>
       </w:r>
     </w:p>
     <w:p>
@@ -976,7 +1754,7 @@
         <w:keepNext/>
       </w:pPr>
       <w:r>
-        <w:t>Dependencies: MT-4.4</w:t>
+        <w:t>Dependencies: MT-4.7</w:t>
       </w:r>
     </w:p>
     <w:p>
@@ -988,7 +1766,7 @@
         <w:t>Scope:</w:t>
       </w:r>
       <w:r>
-        <w:t xml:space="preserve"> Migrate the Next.js storefront, search/filtering, categories, product pages, variants, availability and SEO onto defined APIs.</w:t>
+        <w:t xml:space="preserve"> Migrate the Next.js storefront, search/filtering, categories, product pages, variants, availability and SEO onto defined APIs. Apply central mode to home/navigation/footer/CTAs, catalogue/category/compare/cart/checkout discovery, sitemap/indexability, canonical/structured/social metadata and appropriate copy variants. Prefer Server Components, freshness-appropriate SSR/SSG/ISR, route splitting and optimized responsive media.</w:t>
       </w:r>
     </w:p>
     <w:p>
@@ -1000,7 +1778,7 @@
         <w:t>Acceptance:</w:t>
       </w:r>
       <w:r>
-        <w:t xml:space="preserve"> Public-payload privacy, metadata, responsive layouts, pagination and POS-write-to-Website freshness are verified; zero-stock visibility behavior is preserved.</w:t>
+        <w:t xml:space="preserve"> Public-payload privacy, metadata, responsive layouts, pagination and POS-write-to-Website freshness are verified; zero-stock visibility behavior is preserved. Production-build audits in digital_only, hybrid and commerce_only verify inactive capabilities add no unnecessary JS, API fetches, hydration, rendering, media, preloads or background requests. Target LCP &lt;= 2.5 s, INP &lt;= 200 ms, CLS &lt;= 0.1 and representative mobile Lighthouse 90+; record environment, measurements and justified exceptions.</w:t>
       </w:r>
     </w:p>
     <w:p>
@@ -1028,7 +1806,7 @@
         <w:t>Scope:</w:t>
       </w:r>
       <w:r>
-        <w:t xml:space="preserve"> Migrate registration/login/account, multi-line cart, customer order history/access and review eligibility.</w:t>
+        <w:t xml:space="preserve"> Migrate registration/login/account, multi-line cart, customer order history/access and review eligibility. Add mode-aware wishlist/save-for-later, availability/price opt-in preferences and unsubscribe controls; expose optional loyalty state through owned contracts.</w:t>
       </w:r>
     </w:p>
     <w:p>
@@ -1040,7 +1818,7 @@
         <w:t>Acceptance:</w:t>
       </w:r>
       <w:r>
-        <w:t xml:space="preserve"> Session boundaries, ownership, guest-to-account behavior, cart recovery and eligible-review Playwright/API journeys pass.</w:t>
+        <w:t xml:space="preserve"> Session boundaries, ownership, guest-to-account behavior, cart recovery and eligible-review Playwright/API journeys pass. Unavailable products, guest-to-account ownership and consent/deduplication pass; inactive marketing does not remove required order/invoice access or add unused client bundles.</w:t>
       </w:r>
     </w:p>
     <w:p>
@@ -1068,7 +1846,7 @@
         <w:t>Scope:</w:t>
       </w:r>
       <w:r>
-        <w:t xml:space="preserve"> Connect checkout, COD, pending/retry/cancel, invoice/status and provider-hosted payment boundaries.</w:t>
+        <w:t xml:space="preserve"> Connect checkout, COD, pending/retry/cancel, invoice/status and provider-hosted payment boundaries. Use shared promotion/coupon/loyalty calculations and mode-aware creation rules while retaining approved historical payment/status links.</w:t>
       </w:r>
     </w:p>
     <w:p>
@@ -1080,7 +1858,7 @@
         <w:t>Acceptance:</w:t>
       </w:r>
       <w:r>
-        <w:t xml:space="preserve"> Duplicate submit, price/stock changes, failed payments and verified confirmation pass end-to-end; sandbox claims are made only for authentically configured providers.</w:t>
+        <w:t xml:space="preserve"> Duplicate submit, price/stock changes, failed payments and verified confirmation pass end-to-end; sandbox claims are made only for authentically configured providers. Measure mode-specific checkout loading with production builds; price/discount/reward tampering and usage-limit races fail safely.</w:t>
       </w:r>
     </w:p>
     <w:p>
@@ -1108,7 +1886,7 @@
         <w:t>Scope:</w:t>
       </w:r>
       <w:r>
-        <w:t xml:space="preserve"> Migrate managed pages/menu/homepage/themes, promotions, legal content, digital services, service requests and approved project quote/payment flows.</w:t>
+        <w:t xml:space="preserve"> Migrate managed pages/menu/homepage/themes, promotions, legal content, digital services, service requests and approved project quote/payment flows. Add rich service landing pages, case studies, digital testimonials, FAQs/insights/guides, package/add-on presentation and progressive optional-field enquiry/booking flows. Apply common/digital/commerce content and digital_only/hybrid/commerce_only hero/About/Contact/CTA variants.</w:t>
       </w:r>
     </w:p>
     <w:p>
@@ -1120,7 +1898,47 @@
         <w:t>Acceptance:</w:t>
       </w:r>
       <w:r>
-        <w:t xml:space="preserve"> CMS publication/revision is reflected on the Website; safe content/media, protected routes and digital quote amount/token/ownership parity pass.</w:t>
+        <w:t xml:space="preserve"> CMS publication/revision is reflected on the Website; safe content/media, protected routes and digital quote amount/token/ownership parity pass. Mode-aware discovery/enquiry, SEO/social metadata, safe attachments and low-friction journeys pass. Production-build measurements meet the MT-5.1 targets or record cause, measured impact and explicit remediation/acceptance; minimize global JS, scripts, libraries and fonts.</w:t>
+      </w:r>
+    </w:p>
+    <w:p>
+      <w:pPr>
+        <w:pStyle w:val="Heading2"/>
+      </w:pPr>
+      <w:r>
+        <w:t>MT-5.5 - Client project portal and digital conversion journeys</w:t>
+      </w:r>
+    </w:p>
+    <w:p>
+      <w:pPr>
+        <w:keepNext/>
+      </w:pPr>
+      <w:r>
+        <w:t>Dependencies: MT-5.4</w:t>
+      </w:r>
+    </w:p>
+    <w:p>
+      <w:pPr/>
+      <w:r>
+        <w:rPr>
+          <w:b/>
+        </w:rPr>
+        <w:t>Scope:</w:t>
+      </w:r>
+      <w:r>
+        <w:t xml:space="preserve"> Provide private client request/discussion/proposal/approved/in-progress/review/delivered/completed journeys, secure milestone payment links and reference/delivery exchange. Integrate optional consultation and privacy-conscious conversion events.</w:t>
+      </w:r>
+    </w:p>
+    <w:p>
+      <w:pPr/>
+      <w:r>
+        <w:rPr>
+          <w:b/>
+        </w:rPr>
+        <w:t>Acceptance:</w:t>
+      </w:r>
+      <w:r>
+        <w:t xml:space="preserve"> Ownership, safe file access, proposal expiry/tampering, replay, paid milestone history and secure historical access in all three Website modes pass. Production-build loading/performance and low-friction enquiries are verified without activating external providers.</w:t>
       </w:r>
     </w:p>
     <w:p>
@@ -1157,7 +1975,7 @@
         <w:keepNext/>
       </w:pPr>
       <w:r>
-        <w:t>Dependencies: MT-5.4</w:t>
+        <w:t>Dependencies: MT-5.5</w:t>
       </w:r>
     </w:p>
     <w:p>
@@ -1310,7 +2128,7 @@
         <w:t>Scope:</w:t>
       </w:r>
       <w:r>
-        <w:t xml:space="preserve"> Perform an isolated MySQL migration dry-run from protected exports/sanitized fixtures; verify recovery design for ID maps, history, media and keys.</w:t>
+        <w:t xml:space="preserve"> Perform an isolated MySQL migration dry-run from protected exports/sanitized fixtures; verify recovery design for ID maps, history, media and keys. Rehearse addendum domain mappings and all reset-level backup/preservation/object semantics against approved disposable fixtures.</w:t>
       </w:r>
     </w:p>
     <w:p>
@@ -1322,7 +2140,7 @@
         <w:t>Acceptance:</w:t>
       </w:r>
       <w:r>
-        <w:t xml:space="preserve"> Record/relation/control-total reconciliation, rerun/idempotency, rollback and verified restore pass. Real export/cutover authorization remains separate; originals are never written.</w:t>
+        <w:t xml:space="preserve"> Record/relation/control-total reconciliation, rerun/idempotency, rollback and verified restore pass. Real export/cutover authorization remains separate; originals are never written. Existing data/history, minimum bootstrap, reset audit and dependent references survive the selected preservation rules; no real reset/export is authorized here.</w:t>
       </w:r>
     </w:p>
     <w:p>
@@ -1350,7 +2168,7 @@
         <w:t>Scope:</w:t>
       </w:r>
       <w:r>
-        <w:t xml:space="preserve"> Audit authentication/authorization, uploads/content, secrets, payments, stock concurrency, queues, API/cache performance and recovery.</w:t>
+        <w:t xml:space="preserve"> Audit authentication/authorization, uploads/content, secrets, payments, stock concurrency, queues, API/cache performance and recovery. Audit every added domain, capability switching/history exceptions and continuous per-mode performance budgets under production-like builds.</w:t>
       </w:r>
     </w:p>
     <w:p>
@@ -1362,7 +2180,7 @@
         <w:t>Acceptance:</w:t>
       </w:r>
       <w:r>
-        <w:t xml:space="preserve"> MySQL concurrency, cache outage/stale-data behavior, worker retries, negative paths, dependency audits and focused/full regression pass; verified gaps are remediated.</w:t>
+        <w:t xml:space="preserve"> MySQL concurrency, cache outage/stale-data behavior, worker retries, negative paths, dependency audits and focused/full regression pass; verified gaps are remediated. Record representative LCP &lt;= 2.5 s, INP &lt;= 200 ms, CLS &lt;= 0.1 and stable mobile Lighthouse 90+ targets across all modes; do not substitute Lighthouse for interaction evidence. Document cause, measured impact and remediation/acceptance for each justified exception.</w:t>
       </w:r>
     </w:p>
     <w:p>
@@ -1390,7 +2208,7 @@
         <w:t>Scope:</w:t>
       </w:r>
       <w:r>
-        <w:t xml:space="preserve"> Automate backend tests, MySQL/Redis services, TypeScript/frontend checks, builds and Playwright in GitHub Actions.</w:t>
+        <w:t xml:space="preserve"> Automate backend tests, MySQL/Redis services, TypeScript/frontend checks, builds and Playwright in GitHub Actions. Include new MySQL stock/payment/procurement/reset races, mode matrices and production-build performance regression evidence in CI.</w:t>
       </w:r>
     </w:p>
     <w:p>
@@ -1402,7 +2220,7 @@
         <w:t>Acceptance:</w:t>
       </w:r>
       <w:r>
-        <w:t xml:space="preserve"> Clean-checkout CI passes on the new private remote; lockfiles/caches/artifacts remain secret-safe and original-repository workflows are untouched.</w:t>
+        <w:t xml:space="preserve"> Clean-checkout CI passes on the new private remote; lockfiles/caches/artifacts remain secret-safe and original-repository workflows are untouched. Disabled integrations and public bundle/request budgets remain reproducible and secret-safe.</w:t>
       </w:r>
     </w:p>
     <w:p>
@@ -1470,7 +2288,7 @@
         <w:t>Scope:</w:t>
       </w:r>
       <w:r>
-        <w:t xml:space="preserve"> Close every valid requirement in the complete source-to-target register with fresh target evidence and independently run operational journeys.</w:t>
+        <w:t xml:space="preserve"> Close every valid requirement in the complete source-to-target register with fresh target evidence and independently run operational journeys. Close the addendum clause traceability as well as original source parity; priorities and optional enablement do not waive implementation gates.</w:t>
       </w:r>
     </w:p>
     <w:p>
@@ -1482,7 +2300,7 @@
         <w:t>Acceptance:</w:t>
       </w:r>
       <w:r>
-        <w:t xml:space="preserve"> Pest/PHPUnit, MySQL, builds, Playwright, POS/Website/Control, documentation and recovery gates pass; no silent feature loss or unreviewed duplicate master remains.</w:t>
+        <w:t xml:space="preserve"> Pest/PHPUnit, MySQL, builds, Playwright, POS/Website/Control, documentation and recovery gates pass; no silent feature loss or unreviewed duplicate master remains. Every approved addendum clause has fresh backend/UI/API/performance evidence or an explicit unresolved gap; expansion is not treated as legacy completed behavior.</w:t>
       </w:r>
     </w:p>
     <w:p>
@@ -1531,7 +2349,7 @@
         <w:t>Scope:</w:t>
       </w:r>
       <w:r>
-        <w:t xml:space="preserve"> Independently audit the complete Goal and Preferences, requirement map, all completed-point claims, Git/code/data, migration/recovery, security, integrations, CI, documentation, HOLD register and source immutability.</w:t>
+        <w:t xml:space="preserve"> Independently audit the complete Goal and Preferences, requirement map, all completed-point claims, Git/code/data, migration/recovery, security, integrations, CI, documentation, HOLD register and source immutability. Include approved requirements addendum v1.1, safe reset, retail/digital expansion, all three Website modes and measured performance exceptions.</w:t>
       </w:r>
     </w:p>
     <w:p>
@@ -1543,7 +2361,7 @@
         <w:t>Acceptance:</w:t>
       </w:r>
       <w:r>
-        <w:t xml:space="preserve"> Reopen required gaps; the new repository must be clean and remote-aligned. Report `Project complete: 100%` only after a clean final audit; Deferred required work cannot substitute for completion.</w:t>
+        <w:t xml:space="preserve"> Reopen required gaps; the new repository must be clean and remote-aligned. Report `Project complete: 100%` only after a clean final audit; Deferred required work cannot substitute for completion. Verify original eight completed points were preserved and every subsequently required extension was independently accepted.</w:t>
       </w:r>
     </w:p>
     <w:p>
@@ -1582,13 +2400,13 @@
     <w:p>
       <w:pPr/>
       <w:r>
-        <w:t>H-03 - Source business-data export and destructive restore require authorization for the sensitive dataset and exact target before access/use. Synthetic/sanitized isolated migration tests may continue. Source repository/database writes are prohibited in this project.</w:t>
+        <w:t>H-03 - Source business-data export, destructive restore and production reset require authorization for the sensitive dataset and exact target before access/use. Synthetic/sanitized isolated migration tests may continue. Source repository/database writes are prohibited in this project.</w:t>
       </w:r>
     </w:p>
     <w:p>
       <w:pPr/>
       <w:r>
-        <w:t>H-04 - Arbitrary new top-level category semantics and unrelated new features are outside the approved Goal unless separately scoped. Existing protected IDs/business rules must be preserved.</w:t>
+        <w:t>H-04 - Addendum v1.1 is approved scope, not a HOLD. Arbitrary new top-level category semantics and unrelated features beyond Goal/Preferences/addendum remain outside scope. Marketplace, consumer lending, general subscription billing, arbitrary multi-currency accounting, full ERP/general ledger and unnecessary microservices remain excluded unless separately approved. Existing protected IDs/business rules must be preserved.</w:t>
       </w:r>
     </w:p>
     <w:p>

</xml_diff>

<commit_message>
Complete MT-2.18 unified Admin and Google integrations
</commit_message>
<xml_diff>
--- a/docs/PROJECT_IMPLEMENTATION_ROADMAP.docx
+++ b/docs/PROJECT_IMPLEMENTATION_ROADMAP.docx
@@ -13,7 +13,7 @@
     <w:p>
       <w:pPr/>
       <w:r>
-        <w:t>Version: 1.6 | Date: 2026-09-01</w:t>
+        <w:t>Version: 1.7 | Date: 2026-09-01</w:t>
       </w:r>
     </w:p>
     <w:p>
@@ -43,51 +43,63 @@
     <w:p>
       <w:pPr/>
       <w:r>
-        <w:t>Source of Truth: docs/PROJECT_SOURCE_OF_TRUTH.md</w:t>
+        <w:t>Approved superseding requirement: docs/PROJECT_REQUIREMENTS_UNIFIED_ADMIN_GOOGLE_v1.0.md</w:t>
       </w:r>
     </w:p>
     <w:p>
       <w:pPr/>
       <w:r>
-        <w:t>Status ledger: docs/PROJECT_IMPLEMENTATION_STATUS.md</w:t>
+        <w:t>Superseding reconciliation: docs/remediation/RECONCILIATION.md</w:t>
       </w:r>
     </w:p>
     <w:p>
       <w:pPr/>
       <w:r>
-        <w:t>Word mirror: docs/PROJECT_IMPLEMENTATION_ROADMAP.docx</w:t>
-      </w:r>
-    </w:p>
-    <w:p>
-      <w:pPr>
-        <w:pStyle w:val="Heading1"/>
-      </w:pPr>
-      <w:r>
-        <w:t>Scope and execution rules</w:t>
+        <w:t>Source of Truth: docs/PROJECT_SOURCE_OF_TRUTH.md</w:t>
       </w:r>
     </w:p>
     <w:p>
       <w:pPr/>
       <w:r>
-        <w:t>This is the single active structural roadmap for the controlled migration. Live Completed/In Progress/Pending state, last/current/next position and progress counts are recorded only in `docs/PROJECT_IMPLEMENTATION_STATUS.md`. Each Proceed executes one point through its required gates and intended new-repository commit/push, then stops. Dependencies are ordered; point IDs and exact titles remain stable.</w:t>
+        <w:t>Status ledger: docs/PROJECT_IMPLEMENTATION_STATUS.md</w:t>
       </w:r>
     </w:p>
     <w:p>
       <w:pPr/>
       <w:r>
-        <w:t>The original POS/Website folders, remotes and data are immutable references. All implementation, copied-source tests and migration rehearsals must run under `C:\mobisttech` or isolated approved target resources. Do not run tests/builds against the originals. Do not replace the single shared Laravel/MySQL authority with duplicate authoritative databases.</w:t>
+        <w:t>Word mirror: docs/PROJECT_IMPLEMENTATION_ROADMAP.docx</w:t>
+      </w:r>
+    </w:p>
+    <w:p>
+      <w:pPr>
+        <w:pStyle w:val="Heading1"/>
+      </w:pPr>
+      <w:r>
+        <w:t>Scope and execution rules</w:t>
       </w:r>
     </w:p>
     <w:p>
       <w:pPr/>
       <w:r>
-        <w:t>Every point includes applicable focused/full tests, parity evidence, secrets review, source-boundary checks and ledger updates. Routine execution progress updates the ledger only and must not edit this roadmap or regenerate its DOCX. Regenerate/verify the DOCX only when roadmap structure/content materially changes. MT-1.1 detailed inventory may refine this roadmap from evidence, but valid functionality must not be silently dropped and completed IDs must not be renumbered.</w:t>
+        <w:t>This is the single active structural roadmap for the controlled migration. Live Completed/In Progress/Pending state, last/current/next position and progress counts are recorded only in `docs/PROJECT_IMPLEMENTATION_STATUS.md`. Each Proceed executes one point through its required gates and intended new-repository commit/push, then stops. Dependencies are ordered; point IDs and exact titles remain stable.</w:t>
       </w:r>
     </w:p>
     <w:p>
       <w:pPr/>
       <w:r>
-        <w:t>Goal, Preferences and approved addendum v1.1 apply. For working features, assess reuse/adapt/refactor/migrate before rewrite; rewrite requires a verified reason. Verify parity, data consistency, integration and regression incrementally rather than using a big-bang rewrite. Prefer conventional solutions, justified Redis roles and a Laravel-only business backend; do not introduce a parallel Node/Express business backend. Record stack deviations only for verified unavoidable blockers and never silently resolve a Goal conflict.</w:t>
+        <w:t>The original POS/Website folders, remotes and data are immutable references. All implementation, copied-source tests and migration rehearsals must run under `C:\mobisttech` or isolated approved target resources. Do not run tests/builds against the originals. Do not replace the single shared Laravel/MySQL authority with duplicate authoritative databases.</w:t>
+      </w:r>
+    </w:p>
+    <w:p>
+      <w:pPr/>
+      <w:r>
+        <w:t>Every point includes applicable focused/full tests, parity evidence, secrets review, source-boundary checks and ledger updates. Routine execution progress updates the ledger only and must not edit this roadmap or regenerate its DOCX. Regenerate/verify the DOCX only when roadmap structure/content materially changes. MT-1.1 detailed inventory may refine this roadmap from evidence, but valid functionality must not be silently dropped and completed IDs must not be renumbered.</w:t>
+      </w:r>
+    </w:p>
+    <w:p>
+      <w:pPr/>
+      <w:r>
+        <w:t>Goal, Preferences, approved addendum v1.1 and the approved unified Admin/Google integrations superseding requirement apply. For working features, assess reuse/adapt/refactor/migrate before rewrite; rewrite requires a verified reason. Verify parity, data consistency, integration and regression incrementally rather than using a big-bang rewrite. Prefer conventional solutions, justified Redis roles and a Laravel-only business backend; do not introduce a parallel Node/Express business backend. Record stack deviations only for verified unavoidable blockers and never silently resolve a Goal conflict.</w:t>
       </w:r>
     </w:p>
     <w:p>
@@ -603,7 +615,7 @@
         <w:pStyle w:val="Heading2"/>
       </w:pPr>
       <w:r>
-        <w:t>MT-2.7 - Unified orders, reservations and payments</w:t>
+        <w:t>MT-2.18 - Unified Admin identity and Google integrations remediation</w:t>
       </w:r>
     </w:p>
     <w:p>
@@ -612,6 +624,46 @@
       </w:pPr>
       <w:r>
         <w:t>Dependencies: MT-2.6</w:t>
+      </w:r>
+    </w:p>
+    <w:p>
+      <w:pPr/>
+      <w:r>
+        <w:rPr>
+          <w:b/>
+        </w:rPr>
+        <w:t>Scope:</w:t>
+      </w:r>
+      <w:r>
+        <w:t xml:space="preserve"> Prospectively supersede the completed MT-2.2 separate administrative credential model with one Admin credential shared by POS and Website administration. Require explicit verified legacy administrative mapping, reconcile POS/Website permissions, outlet access, session/reset behavior and customer isolation. Establish the canonical `mobiST Technologies` / `mobisttech@gmail.com` / `https://mobisttech.com` business profile. Implement backend-controlled Gmail OAuth/Gmail API send with only `gmail.send`, secure tokens, test/reconnect/disconnect and reset/transactional delivery. Implement dynamic Google Drive/rclone connection, private portable configuration, read/write/delete validation, Backup Now, schedule/retention and Windows/Linux provisioning without migrating old archives.</w:t>
+      </w:r>
+    </w:p>
+    <w:p>
+      <w:pPr/>
+      <w:r>
+        <w:rPr>
+          <w:b/>
+        </w:rPr>
+        <w:t>Acceptance:</w:t>
+      </w:r>
+      <w:r>
+        <w:t xml:space="preserve"> Removed Superadmin/Website-admin credential routes cannot authenticate; one Admin password/reset/session serves both administrative surfaces with explicit least-privilege permissions and outlet assignments. Same-email legacy records never union privileges. Current runtime consumers use the canonical business profile. Gmail remains Not Connected without authorization, uses exact approved account/scope, reports Connected only after an actual backend test send, never exposes secrets and addresses production OAuth publishing/verification. Drive detects or connects `mobisttech-drive:`, proves backend read/write/delete cleanup, keeps frontend away from rclone, executes encrypted new backups through backend jobs/scheduler, provisions portable private runtime/config, and leaves `mobist-drive:`/old archives untouched. Focused/full security, migration, integration, schema, build and DOCX parity/render/visual gates pass; historical MT-2.2 evidence remains unchanged.</w:t>
+      </w:r>
+    </w:p>
+    <w:p>
+      <w:pPr>
+        <w:pStyle w:val="Heading2"/>
+      </w:pPr>
+      <w:r>
+        <w:t>MT-2.7 - Unified orders, reservations and payments</w:t>
+      </w:r>
+    </w:p>
+    <w:p>
+      <w:pPr>
+        <w:keepNext/>
+      </w:pPr>
+      <w:r>
+        <w:t>Dependencies: MT-2.18</w:t>
       </w:r>
     </w:p>
     <w:p>

</xml_diff>

<commit_message>
Complete MT-2.19 team member session security
</commit_message>
<xml_diff>
--- a/docs/PROJECT_IMPLEMENTATION_ROADMAP.docx
+++ b/docs/PROJECT_IMPLEMENTATION_ROADMAP.docx
@@ -13,7 +13,7 @@
     <w:p>
       <w:pPr/>
       <w:r>
-        <w:t>Version: 1.7 | Date: 2026-09-01</w:t>
+        <w:t>Version: 1.8 | Date: 2026-09-01</w:t>
       </w:r>
     </w:p>
     <w:p>
@@ -55,51 +55,63 @@
     <w:p>
       <w:pPr/>
       <w:r>
-        <w:t>Source of Truth: docs/PROJECT_SOURCE_OF_TRUTH.md</w:t>
+        <w:t>Approved Team Member/session requirement: docs/PROJECT_REQUIREMENTS_TEAM_MEMBERS_SESSION_POLICY_v1.0.md</w:t>
       </w:r>
     </w:p>
     <w:p>
       <w:pPr/>
       <w:r>
-        <w:t>Status ledger: docs/PROJECT_IMPLEMENTATION_STATUS.md</w:t>
+        <w:t>Team Member/session reconciliation: docs/team-members/RECONCILIATION.md</w:t>
       </w:r>
     </w:p>
     <w:p>
       <w:pPr/>
       <w:r>
-        <w:t>Word mirror: docs/PROJECT_IMPLEMENTATION_ROADMAP.docx</w:t>
-      </w:r>
-    </w:p>
-    <w:p>
-      <w:pPr>
-        <w:pStyle w:val="Heading1"/>
-      </w:pPr>
-      <w:r>
-        <w:t>Scope and execution rules</w:t>
+        <w:t>Source of Truth: docs/PROJECT_SOURCE_OF_TRUTH.md</w:t>
       </w:r>
     </w:p>
     <w:p>
       <w:pPr/>
       <w:r>
-        <w:t>This is the single active structural roadmap for the controlled migration. Live Completed/In Progress/Pending state, last/current/next position and progress counts are recorded only in `docs/PROJECT_IMPLEMENTATION_STATUS.md`. Each Proceed executes one point through its required gates and intended new-repository commit/push, then stops. Dependencies are ordered; point IDs and exact titles remain stable.</w:t>
+        <w:t>Status ledger: docs/PROJECT_IMPLEMENTATION_STATUS.md</w:t>
       </w:r>
     </w:p>
     <w:p>
       <w:pPr/>
       <w:r>
-        <w:t>The original POS/Website folders, remotes and data are immutable references. All implementation, copied-source tests and migration rehearsals must run under `C:\mobisttech` or isolated approved target resources. Do not run tests/builds against the originals. Do not replace the single shared Laravel/MySQL authority with duplicate authoritative databases.</w:t>
+        <w:t>Word mirror: docs/PROJECT_IMPLEMENTATION_ROADMAP.docx</w:t>
+      </w:r>
+    </w:p>
+    <w:p>
+      <w:pPr>
+        <w:pStyle w:val="Heading1"/>
+      </w:pPr>
+      <w:r>
+        <w:t>Scope and execution rules</w:t>
       </w:r>
     </w:p>
     <w:p>
       <w:pPr/>
       <w:r>
-        <w:t>Every point includes applicable focused/full tests, parity evidence, secrets review, source-boundary checks and ledger updates. Routine execution progress updates the ledger only and must not edit this roadmap or regenerate its DOCX. Regenerate/verify the DOCX only when roadmap structure/content materially changes. MT-1.1 detailed inventory may refine this roadmap from evidence, but valid functionality must not be silently dropped and completed IDs must not be renumbered.</w:t>
+        <w:t>This is the single active structural roadmap for the controlled migration. Live Completed/In Progress/Pending state, last/current/next position and progress counts are recorded only in `docs/PROJECT_IMPLEMENTATION_STATUS.md`. Each Proceed executes one point through its required gates and intended new-repository commit/push, then stops. Dependencies are ordered; point IDs and exact titles remain stable.</w:t>
       </w:r>
     </w:p>
     <w:p>
       <w:pPr/>
       <w:r>
-        <w:t>Goal, Preferences, approved addendum v1.1 and the approved unified Admin/Google integrations superseding requirement apply. For working features, assess reuse/adapt/refactor/migrate before rewrite; rewrite requires a verified reason. Verify parity, data consistency, integration and regression incrementally rather than using a big-bang rewrite. Prefer conventional solutions, justified Redis roles and a Laravel-only business backend; do not introduce a parallel Node/Express business backend. Record stack deviations only for verified unavoidable blockers and never silently resolve a Goal conflict.</w:t>
+        <w:t>The original POS/Website folders, remotes and data are immutable references. All implementation, copied-source tests and migration rehearsals must run under `C:\mobisttech` or isolated approved target resources. Do not run tests/builds against the originals. Do not replace the single shared Laravel/MySQL authority with duplicate authoritative databases.</w:t>
+      </w:r>
+    </w:p>
+    <w:p>
+      <w:pPr/>
+      <w:r>
+        <w:t>Every point includes applicable focused/full tests, parity evidence, secrets review, source-boundary checks and ledger updates. Routine execution progress updates the ledger only and must not edit this roadmap or regenerate its DOCX. Regenerate/verify the DOCX only when roadmap structure/content materially changes. MT-1.1 detailed inventory may refine this roadmap from evidence, but valid functionality must not be silently dropped and completed IDs must not be renumbered.</w:t>
+      </w:r>
+    </w:p>
+    <w:p>
+      <w:pPr/>
+      <w:r>
+        <w:t>Goal, Preferences, approved addendum v1.1, the approved unified Admin/Google integrations superseding requirement and the approved Team Member/session security requirement apply. For working features, assess reuse/adapt/refactor/migrate before rewrite; rewrite requires a verified reason. Verify parity, data consistency, integration and regression incrementally rather than using a big-bang rewrite. Prefer conventional solutions, justified Redis roles and a Laravel-only business backend; do not introduce a parallel Node/Express business backend. Record stack deviations only for verified unavoidable blockers and never silently resolve a Goal conflict.</w:t>
       </w:r>
     </w:p>
     <w:p>
@@ -695,7 +707,7 @@
         <w:pStyle w:val="Heading2"/>
       </w:pPr>
       <w:r>
-        <w:t>MT-2.9 - Supplier and procurement services</w:t>
+        <w:t>MT-2.19 - Team member roles, delegated access and session security remediation</w:t>
       </w:r>
     </w:p>
     <w:p>
@@ -715,7 +727,7 @@
         <w:t>Scope:</w:t>
       </w:r>
       <w:r>
-        <w:t xml:space="preserve"> Extend acquisition-source capture with supplier/vendor profiles, contacts, purchase orders, lines, status, expected dates, partial receiving, landed/unit costs and supplier-to-acquisition history (P1). Add outlet/product reorder thresholds, low/out-of-stock alerts and actionable procurement recommendations (P2).</w:t>
+        <w:t xml:space="preserve"> Preserve exactly the Admin and Customer credential realms while presenting internal personnel as individual Team Members. Implement explicit default and safe Custom Role permission bundles, protected Full Access authority, separate outlet assignments, server-side delegation ceilings, privilege-escalation prevention, per-human auditability and historical actor/role/outlet snapshots. Centralize realm session policy: Admin uses a 30-minute true inactivity timeout, no Remember Me and browser-close sessions across POS and Website administration; Customer uses a separate 120-minute inactivity policy and optional remembered login capped at 30 days. Provide a five-minute Admin inactivity warning contract/UI, ensure background requests do not extend human activity, revoke sessions/remembered state after password or security changes, and require centralized recent authentication for classified sensitive Admin actions.</w:t>
       </w:r>
     </w:p>
     <w:p>
@@ -727,7 +739,7 @@
         <w:t>Acceptance:</w:t>
       </w:r>
       <w:r>
-        <w:t xml:space="preserve"> Receiving, cancellation and retry are permissioned, idempotent and concurrency-safe; quantities/costs reconcile to existing acquisitions. Threshold changes and recommendation queries are scoped, indexed and tested; no full accounting/ERP is introduced.</w:t>
+        <w:t xml:space="preserve"> Only Admin and Customer human guards exist; supplied roles and Custom Roles are authorization bundles rather than credential providers, and Job Title grants no authority. Fresh negative tests prove Customer/Admin isolation, direct API authorization, permission/outlet delegation ceilings, protected Full Access, no self-promotion, Custom Role validation, disabled/revoked sessions, Admin no-remember/30-minute inactivity/background behavior, Customer 120-minute/capped-remember/browser-close behavior, password/reset revocation and stale recent-auth rejection. Existing unified Admin/device/CSRF/origin/ownership protections and durable business records remain intact; focused/full security, migration/schema, frontend/backend build and regression gates pass.</w:t>
       </w:r>
     </w:p>
     <w:p>
@@ -735,7 +747,7 @@
         <w:pStyle w:val="Heading2"/>
       </w:pPr>
       <w:r>
-        <w:t>MT-2.10 - Stocktake and cycle-count services</w:t>
+        <w:t>MT-2.9 - Supplier and procurement services</w:t>
       </w:r>
     </w:p>
     <w:p>
@@ -743,7 +755,7 @@
         <w:keepNext/>
       </w:pPr>
       <w:r>
-        <w:t>Dependencies: MT-2.9</w:t>
+        <w:t>Dependencies: MT-2.19</w:t>
       </w:r>
     </w:p>
     <w:p>
@@ -755,7 +767,7 @@
         <w:t>Scope:</w:t>
       </w:r>
       <w:r>
-        <w:t xml:space="preserve"> Add physical count sessions for quantity and serialized/IMEI stock, expected/count variance, reason codes, approvals, recounts and audited reconciliation (P1).</w:t>
+        <w:t xml:space="preserve"> Extend acquisition-source capture with supplier/vendor profiles, contacts, purchase orders, lines, status, expected dates, partial receiving, landed/unit costs and supplier-to-acquisition history (P1). Add outlet/product reorder thresholds, low/out-of-stock alerts and actionable procurement recommendations (P2).</w:t>
       </w:r>
     </w:p>
     <w:p>
@@ -767,7 +779,7 @@
         <w:t>Acceptance:</w:t>
       </w:r>
       <w:r>
-        <w:t xml:space="preserve"> Concurrent sale/reservation versus counting is reconciled against an explicit count baseline; only approved differences produce stock adjustments. Duplicate counts, stale approvals, rollback and cross-outlet access are tested; history is never fabricated.</w:t>
+        <w:t xml:space="preserve"> Receiving, cancellation and retry are permissioned, idempotent and concurrency-safe; quantities/costs reconcile to existing acquisitions. Threshold changes and recommendation queries are scoped, indexed and tested; no full accounting/ERP is introduced.</w:t>
       </w:r>
     </w:p>
     <w:p>
@@ -775,7 +787,7 @@
         <w:pStyle w:val="Heading2"/>
       </w:pPr>
       <w:r>
-        <w:t>MT-2.11 - Inter-outlet stock transfer services</w:t>
+        <w:t>MT-2.10 - Stocktake and cycle-count services</w:t>
       </w:r>
     </w:p>
     <w:p>
@@ -783,7 +795,7 @@
         <w:keepNext/>
       </w:pPr>
       <w:r>
-        <w:t>Dependencies: MT-2.10</w:t>
+        <w:t>Dependencies: MT-2.9</w:t>
       </w:r>
     </w:p>
     <w:p>
@@ -795,7 +807,7 @@
         <w:t>Scope:</w:t>
       </w:r>
       <w:r>
-        <w:t xml:space="preserve"> Add authorized dispatch, in-transit custody, receive/reject/partial-receive and transfer history for quantity and serialized stock (P1).</w:t>
+        <w:t xml:space="preserve"> Add physical count sessions for quantity and serialized/IMEI stock, expected/count variance, reason codes, approvals, recounts and audited reconciliation (P1).</w:t>
       </w:r>
     </w:p>
     <w:p>
@@ -807,7 +819,7 @@
         <w:t>Acceptance:</w:t>
       </w:r>
       <w:r>
-        <w:t xml:space="preserve"> MySQL races prove one owner and one active IMEI claim, no double receipt/dispatch or sale of in-transit units, balanced movements and rollback. Stable origin identifiers and historical sale/acquisition references survive destination custody changes.</w:t>
+        <w:t xml:space="preserve"> Concurrent sale/reservation versus counting is reconciled against an explicit count baseline; only approved differences produce stock adjustments. Duplicate counts, stale approvals, rollback and cross-outlet access are tested; history is never fabricated.</w:t>
       </w:r>
     </w:p>
     <w:p>
@@ -815,7 +827,7 @@
         <w:pStyle w:val="Heading2"/>
       </w:pPr>
       <w:r>
-        <w:t>MT-2.12 - Cash sessions and operational expense services</w:t>
+        <w:t>MT-2.11 - Inter-outlet stock transfer services</w:t>
       </w:r>
     </w:p>
     <w:p>
@@ -823,7 +835,7 @@
         <w:keepNext/>
       </w:pPr>
       <w:r>
-        <w:t>Dependencies: MT-2.11</w:t>
+        <w:t>Dependencies: MT-2.10</w:t>
       </w:r>
     </w:p>
     <w:p>
@@ -835,7 +847,7 @@
         <w:t>Scope:</w:t>
       </w:r>
       <w:r>
-        <w:t xml:space="preserve"> Add operator/outlet cash sessions, opening cash, receipts, authorized expenses/payouts, closing counts, expected/actual variance, daily closing and reporting (P1).</w:t>
+        <w:t xml:space="preserve"> Add authorized dispatch, in-transit custody, receive/reject/partial-receive and transfer history for quantity and serialized stock (P1).</w:t>
       </w:r>
     </w:p>
     <w:p>
@@ -847,7 +859,7 @@
         <w:t>Acceptance:</w:t>
       </w:r>
       <w:r>
-        <w:t xml:space="preserve"> Exact cash reconciliation includes sale/return/payment effects with scoped approval, audit, retry and concurrent-close guards. Closed snapshots remain historical; operational cash control is not a general ledger.</w:t>
+        <w:t xml:space="preserve"> MySQL races prove one owner and one active IMEI claim, no double receipt/dispatch or sale of in-transit units, balanced movements and rollback. Stable origin identifiers and historical sale/acquisition references survive destination custody changes.</w:t>
       </w:r>
     </w:p>
     <w:p>
@@ -855,7 +867,7 @@
         <w:pStyle w:val="Heading2"/>
       </w:pPr>
       <w:r>
-        <w:t>MT-2.13 - Trade-in and buyback services</w:t>
+        <w:t>MT-2.12 - Cash sessions and operational expense services</w:t>
       </w:r>
     </w:p>
     <w:p>
@@ -863,7 +875,7 @@
         <w:keepNext/>
       </w:pPr>
       <w:r>
-        <w:t>Dependencies: MT-2.12</w:t>
+        <w:t>Dependencies: MT-2.11</w:t>
       </w:r>
     </w:p>
     <w:p>
@@ -875,7 +887,7 @@
         <w:t>Scope:</w:t>
       </w:r>
       <w:r>
-        <w:t xml:space="preserve"> Formalize individual-seller intake with device/IMEI identity, condition/diagnostics, valuation, ownership/source details and purchase or sale-credit treatment (P2).</w:t>
+        <w:t xml:space="preserve"> Add operator/outlet cash sessions, opening cash, receipts, authorized expenses/payouts, closing counts, expected/actual variance, daily closing and reporting (P1).</w:t>
       </w:r>
     </w:p>
     <w:p>
@@ -887,7 +899,7 @@
         <w:t>Acceptance:</w:t>
       </w:r>
       <w:r>
-        <w:t xml:space="preserve"> Authorized valuations and exact purchase/credit amounts link to acquisition and sale snapshots without double credit/intake. Active identifier uniqueness, source privacy, cancellation and transactional rollback pass.</w:t>
+        <w:t xml:space="preserve"> Exact cash reconciliation includes sale/return/payment effects with scoped approval, audit, retry and concurrent-close guards. Closed snapshots remain historical; operational cash control is not a general ledger.</w:t>
       </w:r>
     </w:p>
     <w:p>
@@ -895,7 +907,7 @@
         <w:pStyle w:val="Heading2"/>
       </w:pPr>
       <w:r>
-        <w:t>MT-2.14 - Promotion and coupon services</w:t>
+        <w:t>MT-2.13 - Trade-in and buyback services</w:t>
       </w:r>
     </w:p>
     <w:p>
@@ -903,7 +915,7 @@
         <w:keepNext/>
       </w:pPr>
       <w:r>
-        <w:t>Dependencies: MT-2.13</w:t>
+        <w:t>Dependencies: MT-2.12</w:t>
       </w:r>
     </w:p>
     <w:p>
@@ -915,7 +927,7 @@
         <w:t>Scope:</w:t>
       </w:r>
       <w:r>
-        <w:t xml:space="preserve"> Implement shared fixed/percentage promotion and coupon calculations with validity, minimum/maximum conditions, product/category scope, usage limits, customer/order restrictions and explicit stacking rules (P2).</w:t>
+        <w:t xml:space="preserve"> Formalize individual-seller intake with device/IMEI identity, condition/diagnostics, valuation, ownership/source details and purchase or sale-credit treatment (P2).</w:t>
       </w:r>
     </w:p>
     <w:p>
@@ -927,7 +939,7 @@
         <w:t>Acceptance:</w:t>
       </w:r>
       <w:r>
-        <w:t xml:space="preserve"> POS and Website use identical server calculations and immutable discount snapshots. Concurrent usage-limit claims, tampering, retries, expiry, cancellation and return effects pass with audit.</w:t>
+        <w:t xml:space="preserve"> Authorized valuations and exact purchase/credit amounts link to acquisition and sale snapshots without double credit/intake. Active identifier uniqueness, source privacy, cancellation and transactional rollback pass.</w:t>
       </w:r>
     </w:p>
     <w:p>
@@ -935,7 +947,7 @@
         <w:pStyle w:val="Heading2"/>
       </w:pPr>
       <w:r>
-        <w:t>MT-2.17 - Validated bulk data workflows</w:t>
+        <w:t>MT-2.14 - Promotion and coupon services</w:t>
       </w:r>
     </w:p>
     <w:p>
@@ -943,7 +955,7 @@
         <w:keepNext/>
       </w:pPr>
       <w:r>
-        <w:t>Dependencies: MT-2.14</w:t>
+        <w:t>Dependencies: MT-2.13</w:t>
       </w:r>
     </w:p>
     <w:p>
@@ -955,7 +967,7 @@
         <w:t>Scope:</w:t>
       </w:r>
       <w:r>
-        <w:t xml:space="preserve"> Provide CSV/XLSX-style catalogue, price, master-data and inventory import/export with scoped fields, preview, row-level errors and explicit operational versus historical-import boundaries (P2).</w:t>
+        <w:t xml:space="preserve"> Implement shared fixed/percentage promotion and coupon calculations with validity, minimum/maximum conditions, product/category scope, usage limits, customer/order restrictions and explicit stacking rules (P2).</w:t>
       </w:r>
     </w:p>
     <w:p>
@@ -967,7 +979,7 @@
         <w:t>Acceptance:</w:t>
       </w:r>
       <w:r>
-        <w:t xml:space="preserve"> Permissions, malicious file/formula handling, exact values, row/whole-batch recovery, idempotency and stock/hold invariants pass. Exports exclude unnecessary sensitive fields; imports never write raw stock counters around shared services.</w:t>
+        <w:t xml:space="preserve"> POS and Website use identical server calculations and immutable discount snapshots. Concurrent usage-limit claims, tampering, retries, expiry, cancellation and return effects pass with audit.</w:t>
       </w:r>
     </w:p>
     <w:p>
@@ -975,7 +987,7 @@
         <w:pStyle w:val="Heading2"/>
       </w:pPr>
       <w:r>
-        <w:t>MT-2.15 - Customer loyalty services</w:t>
+        <w:t>MT-2.17 - Validated bulk data workflows</w:t>
       </w:r>
     </w:p>
     <w:p>
@@ -983,7 +995,7 @@
         <w:keepNext/>
       </w:pPr>
       <w:r>
-        <w:t>Dependencies: MT-2.17</w:t>
+        <w:t>Dependencies: MT-2.14</w:t>
       </w:r>
     </w:p>
     <w:p>
@@ -995,7 +1007,7 @@
         <w:t>Scope:</w:t>
       </w:r>
       <w:r>
-        <w:t xml:space="preserve"> Add an optional disableable rewards framework with earning, redemption, expiry, cancellation/return reversal, fraud controls, audit and configuration (P3).</w:t>
+        <w:t xml:space="preserve"> Provide CSV/XLSX-style catalogue, price, master-data and inventory import/export with scoped fields, preview, row-level errors and explicit operational versus historical-import boundaries (P2).</w:t>
       </w:r>
     </w:p>
     <w:p>
@@ -1007,7 +1019,7 @@
         <w:t>Acceptance:</w:t>
       </w:r>
       <w:r>
-        <w:t xml:space="preserve"> Concurrent earn/redeem/replay and reversal tests prove consistent reward balances. Rewards remain separate from authoritative money; disabled operation preserves history and existing obligations without silently changing sale totals.</w:t>
+        <w:t xml:space="preserve"> Permissions, malicious file/formula handling, exact values, row/whole-batch recovery, idempotency and stock/hold invariants pass. Exports exclude unnecessary sensitive fields; imports never write raw stock counters around shared services.</w:t>
       </w:r>
     </w:p>
     <w:p>
@@ -1015,7 +1027,7 @@
         <w:pStyle w:val="Heading2"/>
       </w:pPr>
       <w:r>
-        <w:t>MT-2.16 - Paid repair job services</w:t>
+        <w:t>MT-2.15 - Customer loyalty services</w:t>
       </w:r>
     </w:p>
     <w:p>
@@ -1023,7 +1035,7 @@
         <w:keepNext/>
       </w:pPr>
       <w:r>
-        <w:t>Dependencies: MT-2.15</w:t>
+        <w:t>Dependencies: MT-2.17</w:t>
       </w:r>
     </w:p>
     <w:p>
@@ -1035,7 +1047,7 @@
         <w:t>Scope:</w:t>
       </w:r>
       <w:r>
-        <w:t xml:space="preserve"> Add optional disableable out-of-warranty repair intake, identifiers, diagnosis, estimate/approval, parts/labor, status, collection, payment linkage and history (P3).</w:t>
+        <w:t xml:space="preserve"> Add an optional disableable rewards framework with earning, redemption, expiry, cancellation/return reversal, fraud controls, audit and configuration (P3).</w:t>
       </w:r>
     </w:p>
     <w:p>
@@ -1047,6 +1059,46 @@
         <w:t>Acceptance:</w:t>
       </w:r>
       <w:r>
+        <w:t xml:space="preserve"> Concurrent earn/redeem/replay and reversal tests prove consistent reward balances. Rewards remain separate from authoritative money; disabled operation preserves history and existing obligations without silently changing sale totals.</w:t>
+      </w:r>
+    </w:p>
+    <w:p>
+      <w:pPr>
+        <w:pStyle w:val="Heading2"/>
+      </w:pPr>
+      <w:r>
+        <w:t>MT-2.16 - Paid repair job services</w:t>
+      </w:r>
+    </w:p>
+    <w:p>
+      <w:pPr>
+        <w:keepNext/>
+      </w:pPr>
+      <w:r>
+        <w:t>Dependencies: MT-2.15</w:t>
+      </w:r>
+    </w:p>
+    <w:p>
+      <w:pPr/>
+      <w:r>
+        <w:rPr>
+          <w:b/>
+        </w:rPr>
+        <w:t>Scope:</w:t>
+      </w:r>
+      <w:r>
+        <w:t xml:space="preserve"> Add optional disableable out-of-warranty repair intake, identifiers, diagnosis, estimate/approval, parts/labor, status, collection, payment linkage and history (P3).</w:t>
+      </w:r>
+    </w:p>
+    <w:p>
+      <w:pPr/>
+      <w:r>
+        <w:rPr>
+          <w:b/>
+        </w:rPr>
+        <w:t>Acceptance:</w:t>
+      </w:r>
+      <w:r>
         <w:t xml:space="preserve"> Permission, estimate/amount ownership, stock parts, replay, payment and lifecycle tests pass. Warranty claims remain distinct, disabled new intake does not strand existing jobs, and historical estimates are preserved.</w:t>
       </w:r>
     </w:p>
@@ -1477,7 +1529,7 @@
         <w:t>Scope:</w:t>
       </w:r>
       <w:r>
-        <w:t xml:space="preserve"> Build the React/TypeScript/Inertia/Tailwind POS shell, role landing pages, authentication and safe navigation.</w:t>
+        <w:t xml:space="preserve"> Build the React/TypeScript/Inertia/Tailwind POS shell, Team Member role landing pages, authentication and safe navigation. Consume the Laravel-owned MT-2.19 Admin session policy, effective permissions, outlet assignments and centralized inactivity warning/continuation contract.</w:t>
       </w:r>
     </w:p>
     <w:p>
@@ -1489,7 +1541,7 @@
         <w:t>Acceptance:</w:t>
       </w:r>
       <w:r>
-        <w:t xml:space="preserve"> Desktop/mobile role journeys and direct-route permissions pass in Playwright; menu hiding is not treated as authorization.</w:t>
+        <w:t xml:space="preserve"> Desktop/mobile role journeys and direct-route permissions pass in Playwright; menu hiding is not treated as authorization. Every POS employee uses an individual Team Member credential; background refresh cannot preserve an otherwise inactive Admin session.</w:t>
       </w:r>
     </w:p>
     <w:p>
@@ -1677,7 +1729,7 @@
         <w:t>Scope:</w:t>
       </w:r>
       <w:r>
-        <w:t xml:space="preserve"> Migrate protected React admin screens for Website CMS and POS configuration, revisions/media/branding/payment settings. Include three-way Website mode selector, per-mode preview and publish impact, revision rollback, case studies/digital testimonials/knowledge content, promotion/coupon and optional loyalty settings.</w:t>
+        <w:t xml:space="preserve"> Migrate protected React admin screens for Website CMS and POS configuration, Team Member/Role administration, revisions/media/branding/payment settings. Consume the same Laravel-owned Admin realm, effective permissions, outlet/delegation ceilings and session/recent-auth policy as POS. Include three-way Website mode selector, per-mode preview and publish impact, revision rollback, case studies/digital testimonials/knowledge content, promotion/coupon and optional loyalty settings.</w:t>
       </w:r>
     </w:p>
     <w:p>
@@ -1689,7 +1741,7 @@
         <w:t>Acceptance:</w:t>
       </w:r>
       <w:r>
-        <w:t xml:space="preserve"> Separate permissions, preview/publish/rollback, safe recovery, secret masking and Dynamic Platform parity acceptance pass. Publish permissions remain distinct from editing; publication triggers verified cache/sitemap/SEO revalidation and does not delete historical data.</w:t>
+        <w:t xml:space="preserve"> Separate permissions, safe delegated Team Member/Custom Role changes, protected Full Access, preview/publish/rollback, safe recovery, secret masking and Dynamic Platform parity acceptance pass. Publish permissions remain distinct from editing; publication triggers verified cache/sitemap/SEO revalidation and does not delete historical data.</w:t>
       </w:r>
     </w:p>
     <w:p>
@@ -1858,7 +1910,7 @@
         <w:t>Scope:</w:t>
       </w:r>
       <w:r>
-        <w:t xml:space="preserve"> Migrate registration/login/account, multi-line cart, customer order history/access and review eligibility. Add mode-aware wishlist/save-for-later, availability/price opt-in preferences and unsubscribe controls; expose optional loyalty state through owned contracts.</w:t>
+        <w:t xml:space="preserve"> Migrate registration/login/account under the separate Customer realm, multi-line cart, customer order history/access and review eligibility. Consume the MT-2.19 120-minute Customer inactivity, optional capped remembered-login, browser-close and re-authentication contracts. Add mode-aware wishlist/save-for-later, availability/price opt-in preferences and unsubscribe controls; expose optional loyalty state through owned contracts.</w:t>
       </w:r>
     </w:p>
     <w:p>
@@ -1870,7 +1922,7 @@
         <w:t>Acceptance:</w:t>
       </w:r>
       <w:r>
-        <w:t xml:space="preserve"> Session boundaries, ownership, guest-to-account behavior, cart recovery and eligible-review Playwright/API journeys pass. Unavailable products, guest-to-account ownership and consent/deduplication pass; inactive marketing does not remove required order/invoice access or add unused client bundles.</w:t>
+        <w:t xml:space="preserve"> Session boundaries, capped remembered login, password/reset revocation, ownership, guest-to-account behavior, durable cart recovery and eligible-review Playwright/API journeys pass. Unavailable products, guest-to-account ownership and consent/deduplication pass; inactive marketing does not remove required order/invoice/client history or add unused client bundles.</w:t>
       </w:r>
     </w:p>
     <w:p>
@@ -2220,7 +2272,7 @@
         <w:t>Scope:</w:t>
       </w:r>
       <w:r>
-        <w:t xml:space="preserve"> Audit authentication/authorization, uploads/content, secrets, payments, stock concurrency, queues, API/cache performance and recovery. Audit every added domain, capability switching/history exceptions and continuous per-mode performance budgets under production-like builds.</w:t>
+        <w:t xml:space="preserve"> Audit authentication/authorization, Team Member RBAC/delegation/outlet boundaries, Admin/Customer session and recent-auth policy, uploads/content, secrets, payments, stock concurrency, queues, API/cache performance and recovery. Audit every added domain, capability switching/history exceptions and continuous per-mode performance budgets under production-like builds.</w:t>
       </w:r>
     </w:p>
     <w:p>
@@ -2401,7 +2453,7 @@
         <w:t>Scope:</w:t>
       </w:r>
       <w:r>
-        <w:t xml:space="preserve"> Independently audit the complete Goal and Preferences, requirement map, all completed-point claims, Git/code/data, migration/recovery, security, integrations, CI, documentation, HOLD register and source immutability. Include approved requirements addendum v1.1, safe reset, retail/digital expansion, all three Website modes and measured performance exceptions.</w:t>
+        <w:t xml:space="preserve"> Independently audit the complete Goal and Preferences, requirement map, all completed-point claims, Git/code/data, migration/recovery, security, integrations, CI, documentation, HOLD register and source immutability. Include approved requirements addendum v1.1, the unified Admin/Google requirement, the Team Member/delegated-access/session-security requirement, safe reset, retail/digital expansion, all three Website modes and measured performance exceptions.</w:t>
       </w:r>
     </w:p>
     <w:p>

</xml_diff>

<commit_message>
Reconcile documents payments legal and manual requirements
</commit_message>
<xml_diff>
--- a/docs/PROJECT_IMPLEMENTATION_ROADMAP.docx
+++ b/docs/PROJECT_IMPLEMENTATION_ROADMAP.docx
@@ -13,7 +13,7 @@
     <w:p>
       <w:pPr/>
       <w:r>
-        <w:t>Version: 1.8 | Date: 2026-09-01</w:t>
+        <w:t>Version: 1.9 | Date: 2026-09-02</w:t>
       </w:r>
     </w:p>
     <w:p>
@@ -67,6 +67,18 @@
     <w:p>
       <w:pPr/>
       <w:r>
+        <w:t>Approved consolidated documents/payments/legal/manual requirement: docs/PROJECT_REQUIREMENTS_DOCUMENTS_PAYMENTS_LEGAL_MANUAL_v1.0.md</w:t>
+      </w:r>
+    </w:p>
+    <w:p>
+      <w:pPr/>
+      <w:r>
+        <w:t>Consolidated requirement reconciliation: docs/consolidated-requirements/RECONCILIATION.md</w:t>
+      </w:r>
+    </w:p>
+    <w:p>
+      <w:pPr/>
+      <w:r>
         <w:t>Source of Truth: docs/PROJECT_SOURCE_OF_TRUTH.md</w:t>
       </w:r>
     </w:p>
@@ -111,7 +123,7 @@
     <w:p>
       <w:pPr/>
       <w:r>
-        <w:t>Goal, Preferences, approved addendum v1.1, the approved unified Admin/Google integrations superseding requirement and the approved Team Member/session security requirement apply. For working features, assess reuse/adapt/refactor/migrate before rewrite; rewrite requires a verified reason. Verify parity, data consistency, integration and regression incrementally rather than using a big-bang rewrite. Prefer conventional solutions, justified Redis roles and a Laravel-only business backend; do not introduce a parallel Node/Express business backend. Record stack deviations only for verified unavoidable blockers and never silently resolve a Goal conflict.</w:t>
+        <w:t>Goal, Preferences, approved addendum v1.1, the approved unified Admin/Google integrations superseding requirement, the approved Team Member/session security requirement and the approved consolidated documents/payments/legal/manual requirement apply. For working features, assess reuse/adapt/refactor/migrate before rewrite; rewrite requires a verified reason. Verify parity, data consistency, integration and regression incrementally rather than using a big-bang rewrite. Prefer conventional solutions, justified Redis roles and a Laravel-only business backend; do not introduce a parallel Node/Express business backend. Record stack deviations only for verified unavoidable blockers and never silently resolve a Goal conflict.</w:t>
       </w:r>
     </w:p>
     <w:p>
@@ -867,7 +879,7 @@
         <w:pStyle w:val="Heading2"/>
       </w:pPr>
       <w:r>
-        <w:t>MT-2.12 - Cash sessions and operational expense services</w:t>
+        <w:t>MT-2.20 - POS payment channels, split tenders and settlement reconciliation</w:t>
       </w:r>
     </w:p>
     <w:p>
@@ -887,7 +899,7 @@
         <w:t>Scope:</w:t>
       </w:r>
       <w:r>
-        <w:t xml:space="preserve"> Add operator/outlet cash sessions, opening cash, receipts, authorized expenses/payouts, closing counts, expected/actual variance, daily closing and reporting (P1).</w:t>
+        <w:t xml:space="preserve"> Implement backend authority for POS Payment Methods, configurable outlet-aware Payment Destinations, multiple tender allocations per Invoice, exact-money split tender, safe payment references, Cash tender/change, original-payment/refund traceability, settlement/merchant-fee evidence, reconciliation state and audit. Preserve the Website's fixed COD, JazzCash, Easypaisa and Credit / Debit Card checkout unchanged; do not introduce Website Bank Transfer, Website split tender, multiple customer-selectable merchant destinations or a general ledger/ERP.</w:t>
       </w:r>
     </w:p>
     <w:p>
@@ -899,7 +911,7 @@
         <w:t>Acceptance:</w:t>
       </w:r>
       <w:r>
-        <w:t xml:space="preserve"> Exact cash reconciliation includes sale/return/payment effects with scoped approval, audit, retry and concurrent-close guards. Closed snapshots remain historical; operational cash control is not a general ledger.</w:t>
+        <w:t xml:space="preserve"> Exact tender sums atomically match the authoritative Invoice payable amount. Inactive/wrong-outlet destinations, client total overrides, sensitive card data, concurrent/double submit and changed idempotency replays fail. Cash/change math, safe terminal references, merchant-fee separation, refund override/reason/approval traceability, destination reconciliation state/audit and Website fixed-four-channel regressions pass with focused/full backend, MySQL schema and transaction gates.</w:t>
       </w:r>
     </w:p>
     <w:p>
@@ -907,7 +919,7 @@
         <w:pStyle w:val="Heading2"/>
       </w:pPr>
       <w:r>
-        <w:t>MT-2.13 - Trade-in and buyback services</w:t>
+        <w:t>MT-2.12 - Cash sessions and operational expense services</w:t>
       </w:r>
     </w:p>
     <w:p>
@@ -915,7 +927,7 @@
         <w:keepNext/>
       </w:pPr>
       <w:r>
-        <w:t>Dependencies: MT-2.12</w:t>
+        <w:t>Dependencies: MT-2.20</w:t>
       </w:r>
     </w:p>
     <w:p>
@@ -927,7 +939,7 @@
         <w:t>Scope:</w:t>
       </w:r>
       <w:r>
-        <w:t xml:space="preserve"> Formalize individual-seller intake with device/IMEI identity, condition/diagnostics, valuation, ownership/source details and purchase or sale-credit treatment (P2).</w:t>
+        <w:t xml:space="preserve"> Add operator/outlet cash sessions, opening cash, authorized cash-in, expenses/payouts, refunds, closing counts, daily closing and reporting (P1). Consume POS tender allocations while keeping Cash expected drawer movement separate from non-cash expected receipts and destination settlement/reconciliation.</w:t>
       </w:r>
     </w:p>
     <w:p>
@@ -939,7 +951,7 @@
         <w:t>Acceptance:</w:t>
       </w:r>
       <w:r>
-        <w:t xml:space="preserve"> Authorized valuations and exact purchase/credit amounts link to acquisition and sale snapshots without double credit/intake. Active identifier uniqueness, source privacy, cancellation and transactional rollback pass.</w:t>
+        <w:t xml:space="preserve"> Exact reconciliation proves Opening Cash + Cash Sales + approved Cash In - Cash Refunds - Expenses/Payouts = Expected Cash, compares Actual Count and records variance. Non-cash destination totals, confirmed settlement, fees/adjustments and variance remain distinct. Scoped approval, audit, retry and concurrent-close guards pass; closed snapshots remain historical and operational closing is not a general ledger.</w:t>
       </w:r>
     </w:p>
     <w:p>
@@ -947,7 +959,7 @@
         <w:pStyle w:val="Heading2"/>
       </w:pPr>
       <w:r>
-        <w:t>MT-2.14 - Promotion and coupon services</w:t>
+        <w:t>MT-2.13 - Trade-in and buyback services</w:t>
       </w:r>
     </w:p>
     <w:p>
@@ -955,7 +967,7 @@
         <w:keepNext/>
       </w:pPr>
       <w:r>
-        <w:t>Dependencies: MT-2.13</w:t>
+        <w:t>Dependencies: MT-2.12</w:t>
       </w:r>
     </w:p>
     <w:p>
@@ -967,7 +979,7 @@
         <w:t>Scope:</w:t>
       </w:r>
       <w:r>
-        <w:t xml:space="preserve"> Implement shared fixed/percentage promotion and coupon calculations with validity, minimum/maximum conditions, product/category scope, usage limits, customer/order restrictions and explicit stacking rules (P2).</w:t>
+        <w:t xml:space="preserve"> Formalize individual-seller intake with device/IMEI identity, condition/diagnostics, valuation, ownership/source details and purchase or sale-credit treatment (P2).</w:t>
       </w:r>
     </w:p>
     <w:p>
@@ -979,7 +991,7 @@
         <w:t>Acceptance:</w:t>
       </w:r>
       <w:r>
-        <w:t xml:space="preserve"> POS and Website use identical server calculations and immutable discount snapshots. Concurrent usage-limit claims, tampering, retries, expiry, cancellation and return effects pass with audit.</w:t>
+        <w:t xml:space="preserve"> Authorized valuations and exact purchase/credit amounts link to acquisition and sale snapshots without double credit/intake. Active identifier uniqueness, source privacy, cancellation and transactional rollback pass.</w:t>
       </w:r>
     </w:p>
     <w:p>
@@ -987,7 +999,7 @@
         <w:pStyle w:val="Heading2"/>
       </w:pPr>
       <w:r>
-        <w:t>MT-2.17 - Validated bulk data workflows</w:t>
+        <w:t>MT-2.14 - Promotion and coupon services</w:t>
       </w:r>
     </w:p>
     <w:p>
@@ -995,7 +1007,7 @@
         <w:keepNext/>
       </w:pPr>
       <w:r>
-        <w:t>Dependencies: MT-2.14</w:t>
+        <w:t>Dependencies: MT-2.13</w:t>
       </w:r>
     </w:p>
     <w:p>
@@ -1007,7 +1019,7 @@
         <w:t>Scope:</w:t>
       </w:r>
       <w:r>
-        <w:t xml:space="preserve"> Provide CSV/XLSX-style catalogue, price, master-data and inventory import/export with scoped fields, preview, row-level errors and explicit operational versus historical-import boundaries (P2).</w:t>
+        <w:t xml:space="preserve"> Implement shared fixed/percentage promotion and coupon calculations with validity, minimum/maximum conditions, product/category scope, usage limits, customer/order restrictions and explicit stacking rules (P2).</w:t>
       </w:r>
     </w:p>
     <w:p>
@@ -1019,7 +1031,7 @@
         <w:t>Acceptance:</w:t>
       </w:r>
       <w:r>
-        <w:t xml:space="preserve"> Permissions, malicious file/formula handling, exact values, row/whole-batch recovery, idempotency and stock/hold invariants pass. Exports exclude unnecessary sensitive fields; imports never write raw stock counters around shared services.</w:t>
+        <w:t xml:space="preserve"> POS and Website use identical server calculations and immutable discount snapshots. Concurrent usage-limit claims, tampering, retries, expiry, cancellation and return effects pass with audit.</w:t>
       </w:r>
     </w:p>
     <w:p>
@@ -1027,7 +1039,7 @@
         <w:pStyle w:val="Heading2"/>
       </w:pPr>
       <w:r>
-        <w:t>MT-2.15 - Customer loyalty services</w:t>
+        <w:t>MT-2.17 - Validated bulk data workflows</w:t>
       </w:r>
     </w:p>
     <w:p>
@@ -1035,7 +1047,7 @@
         <w:keepNext/>
       </w:pPr>
       <w:r>
-        <w:t>Dependencies: MT-2.17</w:t>
+        <w:t>Dependencies: MT-2.14</w:t>
       </w:r>
     </w:p>
     <w:p>
@@ -1047,7 +1059,7 @@
         <w:t>Scope:</w:t>
       </w:r>
       <w:r>
-        <w:t xml:space="preserve"> Add an optional disableable rewards framework with earning, redemption, expiry, cancellation/return reversal, fraud controls, audit and configuration (P3).</w:t>
+        <w:t xml:space="preserve"> Provide CSV/XLSX-style catalogue, price, master-data and inventory import/export with scoped fields, preview, row-level errors and explicit operational versus historical-import boundaries (P2).</w:t>
       </w:r>
     </w:p>
     <w:p>
@@ -1059,7 +1071,7 @@
         <w:t>Acceptance:</w:t>
       </w:r>
       <w:r>
-        <w:t xml:space="preserve"> Concurrent earn/redeem/replay and reversal tests prove consistent reward balances. Rewards remain separate from authoritative money; disabled operation preserves history and existing obligations without silently changing sale totals.</w:t>
+        <w:t xml:space="preserve"> Permissions, malicious file/formula handling, exact values, row/whole-batch recovery, idempotency and stock/hold invariants pass. Exports exclude unnecessary sensitive fields; imports never write raw stock counters around shared services.</w:t>
       </w:r>
     </w:p>
     <w:p>
@@ -1067,7 +1079,7 @@
         <w:pStyle w:val="Heading2"/>
       </w:pPr>
       <w:r>
-        <w:t>MT-2.16 - Paid repair job services</w:t>
+        <w:t>MT-2.15 - Customer loyalty services</w:t>
       </w:r>
     </w:p>
     <w:p>
@@ -1075,7 +1087,7 @@
         <w:keepNext/>
       </w:pPr>
       <w:r>
-        <w:t>Dependencies: MT-2.15</w:t>
+        <w:t>Dependencies: MT-2.17</w:t>
       </w:r>
     </w:p>
     <w:p>
@@ -1087,7 +1099,7 @@
         <w:t>Scope:</w:t>
       </w:r>
       <w:r>
-        <w:t xml:space="preserve"> Add optional disableable out-of-warranty repair intake, identifiers, diagnosis, estimate/approval, parts/labor, status, collection, payment linkage and history (P3).</w:t>
+        <w:t xml:space="preserve"> Add an optional disableable rewards framework with earning, redemption, expiry, cancellation/return reversal, fraud controls, audit and configuration (P3).</w:t>
       </w:r>
     </w:p>
     <w:p>
@@ -1099,6 +1111,46 @@
         <w:t>Acceptance:</w:t>
       </w:r>
       <w:r>
+        <w:t xml:space="preserve"> Concurrent earn/redeem/replay and reversal tests prove consistent reward balances. Rewards remain separate from authoritative money; disabled operation preserves history and existing obligations without silently changing sale totals.</w:t>
+      </w:r>
+    </w:p>
+    <w:p>
+      <w:pPr>
+        <w:pStyle w:val="Heading2"/>
+      </w:pPr>
+      <w:r>
+        <w:t>MT-2.16 - Paid repair job services</w:t>
+      </w:r>
+    </w:p>
+    <w:p>
+      <w:pPr>
+        <w:keepNext/>
+      </w:pPr>
+      <w:r>
+        <w:t>Dependencies: MT-2.15</w:t>
+      </w:r>
+    </w:p>
+    <w:p>
+      <w:pPr/>
+      <w:r>
+        <w:rPr>
+          <w:b/>
+        </w:rPr>
+        <w:t>Scope:</w:t>
+      </w:r>
+      <w:r>
+        <w:t xml:space="preserve"> Add optional disableable out-of-warranty repair intake, identifiers, diagnosis, estimate/approval, parts/labor, status, collection, payment linkage and history (P3).</w:t>
+      </w:r>
+    </w:p>
+    <w:p>
+      <w:pPr/>
+      <w:r>
+        <w:rPr>
+          <w:b/>
+        </w:rPr>
+        <w:t>Acceptance:</w:t>
+      </w:r>
+      <w:r>
         <w:t xml:space="preserve"> Permission, estimate/amount ownership, stock parts, replay, payment and lifecycle tests pass. Warranty claims remain distinct, disabled new intake does not strand existing jobs, and historical estimates are preserved.</w:t>
       </w:r>
     </w:p>
@@ -1148,7 +1200,7 @@
         <w:t>Scope:</w:t>
       </w:r>
       <w:r>
-        <w:t xml:space="preserve"> Migrate verified reports, dashboards, A4/Thermal output, invoice/warranty documents and safe communication templates. Include new procurement, stocktake/transfer, cash/expense, trade-in, promotion/loyalty and optional repair histories in scoped reporting and retail labels.</w:t>
+        <w:t xml:space="preserve"> Establish one backend-owned canonical document-generation/delivery boundary for persisted Invoice and Warranty snapshots across Preview, Thermal 80mm where applicable, A4, Print, explicit Save PDF, Gmail API attachment delivery and assisted WhatsApp sharing. Add backward-compatible nullable sale/invoice-time customer email snapshots, separately managed Invoice/Warranty Email and WhatsApp templates, truthful delivery states and idempotent send/audit history. Migrate verified reports/dashboards and include procurement, stocktake/transfer, cash/expense, trade-in, promotion/loyalty, optional repair, payment method/destination/mix, settlement, fee and variance histories in scoped reporting and retail labels.</w:t>
       </w:r>
     </w:p>
     <w:p>
@@ -1160,7 +1212,7 @@
         <w:t>Acceptance:</w:t>
       </w:r>
       <w:r>
-        <w:t xml:space="preserve"> Role-scoped totals/exports, history, print/download and protected-template-placeholder parity tests pass; no real messages are sent. Reconciled reports never conflate rewards with money or private supplier/client data with public exports.</w:t>
+        <w:t xml:space="preserve"> Preview/Print/Save PDF/Email use the same historical values and finalization never forces download or delivery. Gmail uses the approved sender and `gmail.send` architecture, fails truthfully when unavailable, validates headers/recipients, attaches the canonical PDF and separates send permission from integration management. Assisted WhatsApp reports Prepared/Opened rather than Sent, downloads only when manual attachment needs it and instructs the operator accurately. Role/outlet authorization, template safety, document hash/version, explicit resend, retry deduplication and all required delivery failures pass with safe fakes only. Payment reports do not double-count split tenders or conflate sales, customer payments, provider fees, settlements, rewards or private data.</w:t>
       </w:r>
     </w:p>
     <w:p>
@@ -1188,7 +1240,7 @@
         <w:t>Scope:</w:t>
       </w:r>
       <w:r>
-        <w:t xml:space="preserve"> Migrate Website-managed pages, navigation, homepage/catalogue, SEO/legal/promotion settings, media, themes and branding controls into the backend. Extend modular content with service landing schemas, managed case studies, client/industry disclosure, digital testimonials separate from retail reviews, reusable FAQs, insights/blog/guides and service associations.</w:t>
+        <w:t xml:space="preserve"> Migrate Website-managed pages, navigation, homepage/catalogue, SEO/promotion settings, media, themes and branding controls into the backend. Make Legal Content an explicit typed policy system for Privacy Policy, Terms &amp; Conditions, Return &amp; Refund Policy, Shipping / Delivery Policy, Warranty Policy and conditionally required Cookie Policy, Digital Services / Project Terms and payment disclosures, with purpose, version/effective date, approval state, protected slugs and footer destinations. Extend modular content with service landing schemas, managed case studies, client/industry disclosure, digital testimonials separate from retail reviews, reusable FAQs, insights/blog/guides and service associations.</w:t>
       </w:r>
     </w:p>
     <w:p>
@@ -1200,7 +1252,7 @@
         <w:t>Acceptance:</w:t>
       </w:r>
       <w:r>
-        <w:t xml:space="preserve"> Draft/preview/publish, revisions/rollback, safe uploads/content, cache invalidation and distinct POS/Website settings are preserved. Draft/preview/publish/revisions, consent/moderation, disclosure, metadata and safe media handling cover each added content family; common plus capability/mode variants avoid three page-tree copies.</w:t>
+        <w:t xml:space="preserve"> Draft/preview/publish, revisions/rollback, safe rich content/uploads, cache invalidation and distinct POS/Website settings are preserved. Policy types, effective/version dates, approval state, protected routes, footer links and factual-data-flow review are enforced; unresolved owner/legal decisions remain explicit and no draft is falsely labeled lawyer-approved. Cookie coverage follows actual tracking behavior, public payment claims retain the fixed Website model, public policy changes never rewrite historical transaction/proposal/warranty snapshots, and content editors cannot replace protected routes. Consent/moderation, disclosure, metadata and safe media handling cover every other added content family; common plus capability/mode variants avoid three page-tree copies.</w:t>
       </w:r>
     </w:p>
     <w:p>
@@ -1569,7 +1621,7 @@
         <w:t>Scope:</w:t>
       </w:r>
       <w:r>
-        <w:t xml:space="preserve"> Migrate product/unit/IMEI, acquisition, stock, sale and return workflows onto verified backend services. Add barcode/QR/IMEI scanner-friendly lookup/entry and controlled product/unit retail label generation/printing.</w:t>
+        <w:t xml:space="preserve"> Migrate product/unit/IMEI, acquisition, stock, sale and return workflows onto verified backend services. Add the POS payment editor: Payment Method, authorized outlet Payment Destination, amount, optional safe reference and Add Payment; support split tender, Cash tendered/change and authoritative Invoice Total/Payments/Remaining. Add barcode/QR/IMEI scanner-friendly lookup/entry and controlled product/unit retail label generation/printing.</w:t>
       </w:r>
     </w:p>
     <w:p>
@@ -1581,7 +1633,7 @@
         <w:t>Acceptance:</w:t>
       </w:r>
       <w:r>
-        <w:t xml:space="preserve"> Keyboard/form validation, pagination, conflict handling, totals and critical transaction-completion journeys pass. Scanning and label requests retain validation and permissions; shared promotion/coupon and optional loyalty adjustments are server-calculated and visible in sale/return journeys.</w:t>
+        <w:t xml:space="preserve"> Keyboard/form validation, pagination, conflict handling, totals and critical transaction-completion journeys pass. Finalization is blocked unless valid allocations exactly cover the authoritative payable amount; inactive/wrong-outlet destinations, secret payment credentials and prohibited card data remain unavailable. Split tender, cash/change and retry/conflict UI consume MT-2.20 without client-owned arithmetic. Scanning and label requests retain validation/permissions; shared promotion/coupon and optional loyalty adjustments are server-calculated and visible in sale/return journeys.</w:t>
       </w:r>
     </w:p>
     <w:p>
@@ -1649,7 +1701,7 @@
         <w:t>Scope:</w:t>
       </w:r>
       <w:r>
-        <w:t xml:space="preserve"> Provide opening/expenses/payout/closing cash journeys, individual-seller valuation/intake/sale-credit, optional paid-repair estimate/approval/collection and linked histories.</w:t>
+        <w:t xml:space="preserve"> Provide opening/expenses/payout/closing cash journeys and Day Closing reconciliation for Opening Cash, Cash Sales, Cash Refunds, Expenses/Payouts, Expected Cash, Actual Count and Cash Variance. Show non-cash expected receipts, destination-level confirmed settlement, fees/adjustments, variance, reconciliation state and approval/audit through drill-down. Also provide individual-seller valuation/intake/sale-credit, optional paid-repair estimate/approval/collection and linked histories.</w:t>
       </w:r>
     </w:p>
     <w:p>
@@ -1661,7 +1713,7 @@
         <w:t>Acceptance:</w:t>
       </w:r>
       <w:r>
-        <w:t xml:space="preserve"> Exact money, variance/approval, double-submit, privacy and role controls pass. Disabled repair behavior retains legitimate historical access; warranties remain a separate workflow.</w:t>
+        <w:t xml:space="preserve"> Exact money, destination/outlet scope, reconciliation state, fee/variance separation, approval, double-submit, privacy and audit controls pass. The home dashboard remains compact and destination detail uses drill-down. Disabled repair behavior retains legitimate historical access; warranties remain a separate workflow.</w:t>
       </w:r>
     </w:p>
     <w:p>
@@ -1689,7 +1741,7 @@
         <w:t>Scope:</w:t>
       </w:r>
       <w:r>
-        <w:t xml:space="preserve"> Migrate required customer/history, invoice, warranty/claim, dashboard, report and export UI.</w:t>
+        <w:t xml:space="preserve"> Migrate required customer/history, invoice, warranty/claim, dashboard, report and export UI. Invoice uses Prepare Sale -&gt; Preview/output choice -&gt; Finalize -&gt; Document Actions with `Send via WhatsApp`, `Send via Email`, `Print`, `Save PDF` and Done/New Invoice; finalization does not auto-download. Warranty Claim Receipt uses the same applicable Preview/delivery/Print/Save PDF model. Add optional customer email, controlled email composer, historical resend/reprint/redownload and a compact Payment Mix summary with destination drill-down.</w:t>
       </w:r>
     </w:p>
     <w:p>
@@ -1701,7 +1753,7 @@
         <w:t>Acceptance:</w:t>
       </w:r>
       <w:r>
-        <w:t xml:space="preserve"> Role-scoped flows, historical records, Thermal 80mm/A4 preview-download-print and mobile layouts are verified.</w:t>
+        <w:t xml:space="preserve"> Role-scoped historical Invoice/Warranty actions, Thermal 80mm/A4 parity, explicit Print/Save PDF, delivery error/retry, controlled Email fields and assisted WhatsApp instructions pass on supported layouts. Delivery failure never rolls back an already-finalized transaction; no finalization-triggered automatic download/send occurs. Payment Mix avoids destination-card clutter and preserves Website/POS classification.</w:t>
       </w:r>
     </w:p>
     <w:p>
@@ -1729,7 +1781,7 @@
         <w:t>Scope:</w:t>
       </w:r>
       <w:r>
-        <w:t xml:space="preserve"> Migrate protected React admin screens for Website CMS and POS configuration, Team Member/Role administration, revisions/media/branding/payment settings. Consume the same Laravel-owned Admin realm, effective permissions, outlet/delegation ceilings and session/recent-auth policy as POS. Include three-way Website mode selector, per-mode preview and publish impact, revision rollback, case studies/digital testimonials/knowledge content, promotion/coupon and optional loyalty settings.</w:t>
+        <w:t xml:space="preserve"> Migrate protected React admin screens for Website CMS and POS configuration, Team Member/Role administration, revisions/media/branding/payment settings. Manage six separate Invoice/Warranty Email and WhatsApp templates, POS Payment Destinations with masked identifiers, typed legal/policy content with publish/revision/effective-date controls, applicable document/output defaults and the existing Gmail connection/status entry point. Consume the same Laravel-owned Admin realm, effective permissions, outlet/delegation ceilings and session/recent-auth policy as POS. Include three-way Website mode selector, per-mode preview and publish impact, revision rollback, case studies/digital testimonials/knowledge content, promotion/coupon and optional loyalty settings.</w:t>
       </w:r>
     </w:p>
     <w:p>
@@ -1741,7 +1793,7 @@
         <w:t>Acceptance:</w:t>
       </w:r>
       <w:r>
-        <w:t xml:space="preserve"> Separate permissions, safe delegated Team Member/Custom Role changes, protected Full Access, preview/publish/rollback, safe recovery, secret masking and Dynamic Platform parity acceptance pass. Publish permissions remain distinct from editing; publication triggers verified cache/sitemap/SEO revalidation and does not delete historical data.</w:t>
+        <w:t xml:space="preserve"> Separate permissions, safe delegated Team Member/Custom Role changes, protected Full Access, preview/publish/rollback, safe recovery, secret masking and Dynamic Platform parity acceptance pass. Ordinary document senders cannot manage integrations/templates/destinations; destination metadata exposes no provider secrets. Policy publication and Gmail configuration retain their own authorization/recent-auth boundaries. Publication triggers verified cache/sitemap/SEO revalidation and does not delete historical data.</w:t>
       </w:r>
     </w:p>
     <w:p>
@@ -1950,7 +2002,7 @@
         <w:t>Scope:</w:t>
       </w:r>
       <w:r>
-        <w:t xml:space="preserve"> Connect checkout, COD, pending/retry/cancel, invoice/status and provider-hosted payment boundaries. Use shared promotion/coupon/loyalty calculations and mode-aware creation rules while retaining approved historical payment/status links.</w:t>
+        <w:t xml:space="preserve"> Connect checkout to exactly four customer-facing channels: Cash on Delivery, one configured JazzCash integration, one configured Easypaisa integration and one approved hosted/tokenized Credit / Debit Card processor. Support pending/retry/cancel, invoice/status and provider boundaries. Do not add Website Bank Transfer, split tender, multiple selectable merchant accounts or exposure of internal POS Payment Destinations. Use shared promotion/coupon/loyalty calculations and mode-aware creation rules while retaining approved historical payment/status links.</w:t>
       </w:r>
     </w:p>
     <w:p>
@@ -1962,7 +2014,7 @@
         <w:t>Acceptance:</w:t>
       </w:r>
       <w:r>
-        <w:t xml:space="preserve"> Duplicate submit, price/stock changes, failed payments and verified confirmation pass end-to-end; sandbox claims are made only for authentically configured providers. Measure mode-specific checkout loading with production builds; price/discount/reward tampering and usage-limit races fail safely.</w:t>
+        <w:t xml:space="preserve"> Duplicate submit, price/stock changes, failed payments, verified confirmation and the fixed-four-channel contract pass end-to-end; sandbox claims are made only for authentically configured providers. Website transactions classify into shared reporting/reconciliation without changing checkout choices. Measure mode-specific checkout loading with production builds; price/discount/reward tampering and usage-limit races fail safely.</w:t>
       </w:r>
     </w:p>
     <w:p>
@@ -1990,7 +2042,7 @@
         <w:t>Scope:</w:t>
       </w:r>
       <w:r>
-        <w:t xml:space="preserve"> Migrate managed pages/menu/homepage/themes, promotions, legal content, digital services, service requests and approved project quote/payment flows. Add rich service landing pages, case studies, digital testimonials, FAQs/insights/guides, package/add-on presentation and progressive optional-field enquiry/booking flows. Apply common/digital/commerce content and digital_only/hybrid/commerce_only hero/About/Contact/CTA variants.</w:t>
+        <w:t xml:space="preserve"> Migrate managed pages/menu/homepage/themes, promotions, legal content, digital services, service requests and approved project quote/payment flows. Publish responsive footer-linked Privacy, Terms, Return/Refund, Shipping/Delivery, Warranty and applicable Cookie/Digital Services/Project Terms pages from approved typed policy revisions. Add rich service landing pages, case studies, digital testimonials, FAQs/insights/guides, package/add-on presentation and progressive optional-field enquiry/booking flows. Apply common/digital/commerce content and digital_only/hybrid/commerce_only hero/About/Contact/CTA variants; distinguish fixed/package prices, starting-from indications and custom quotations.</w:t>
       </w:r>
     </w:p>
     <w:p>
@@ -2002,7 +2054,7 @@
         <w:t>Acceptance:</w:t>
       </w:r>
       <w:r>
-        <w:t xml:space="preserve"> CMS publication/revision is reflected on the Website; safe content/media, protected routes and digital quote amount/token/ownership parity pass. Mode-aware discovery/enquiry, SEO/social metadata, safe attachments and low-friction journeys pass. Production-build measurements meet the MT-5.1 targets or record cause, measured impact and explicit remediation/acceptance; minimize global JS, scripts, libraries and fonts.</w:t>
+        <w:t xml:space="preserve"> CMS publication/revision is reflected on the Website; every applicable approved policy route/footer destination works, shows version/effective date and matches actual business/data/payment behavior. No placeholder or unapproved commercial/legal term is treated as final, and mutable Website copy cannot rewrite approved proposal/milestone/warranty/Invoice snapshots. Safe content/media, protected routes, digital quote amount/token/ownership, mode-aware discovery/enquiry, SEO/social metadata, safe attachments and low-friction journeys pass. Production-build measurements meet the MT-5.1 targets or record cause, measured impact and explicit remediation/acceptance; minimize global JS, scripts, libraries and fonts.</w:t>
       </w:r>
     </w:p>
     <w:p>
@@ -2272,7 +2324,7 @@
         <w:t>Scope:</w:t>
       </w:r>
       <w:r>
-        <w:t xml:space="preserve"> Audit authentication/authorization, Team Member RBAC/delegation/outlet boundaries, Admin/Customer session and recent-auth policy, uploads/content, secrets, payments, stock concurrency, queues, API/cache performance and recovery. Audit every added domain, capability switching/history exceptions and continuous per-mode performance budgets under production-like builds.</w:t>
+        <w:t xml:space="preserve"> Audit authentication/authorization, Team Member RBAC/delegation/outlet boundaries, Admin/Customer session and recent-auth policy, uploads/content, secrets, payments, stock concurrency, queues, API/cache performance and recovery. For document delivery audit recipient/header validation, Gmail token isolation, canonical attachment integrity, wrong-outlet access, retries/templates/audit privacy and truthful WhatsApp states. For POS payments audit split-tender arithmetic, destination scope, sensitive card-data exclusion, fee/settlement separation, refund traceability and reconciliation tampering. Verify legal/privacy drafts against actual data, cookies/tracking, providers, retention/reset and public/private boundaries; review project ownership/licensing plus distributed dependency/asset notices without treating framework metadata as an application license. Audit every added domain, capability switching/history exceptions and continuous per-mode performance budgets under production-like builds.</w:t>
       </w:r>
     </w:p>
     <w:p>
@@ -2284,7 +2336,7 @@
         <w:t>Acceptance:</w:t>
       </w:r>
       <w:r>
-        <w:t xml:space="preserve"> MySQL concurrency, cache outage/stale-data behavior, worker retries, negative paths, dependency audits and focused/full regression pass; verified gaps are remediated. Record representative LCP &lt;= 2.5 s, INP &lt;= 200 ms, CLS &lt;= 0.1 and stable mobile Lighthouse 90+ targets across all modes; do not substitute Lighthouse for interaction evidence. Document cause, measured impact and remediation/acceptance for each justified exception.</w:t>
+        <w:t xml:space="preserve"> MySQL concurrency, cache outage/stale-data behavior, worker retries, required document-delivery/payment/security/legal negative paths, dependency/license/notice audits and focused/full regression pass; verified gaps are remediated. No PAN/CVV/PIN/stripe data or OAuth/provider secrets appear in storage, frontend, audit or normal logs. Policy approval status and unresolved owner/legal decisions remain truthful. Record representative LCP &lt;= 2.5 s, INP &lt;= 200 ms, CLS &lt;= 0.1 and stable mobile Lighthouse 90+ targets across all modes; do not substitute Lighthouse for interaction evidence. Document cause, measured impact and remediation/acceptance for each justified exception.</w:t>
       </w:r>
     </w:p>
     <w:p>
@@ -2392,7 +2444,7 @@
         <w:t>Scope:</w:t>
       </w:r>
       <w:r>
-        <w:t xml:space="preserve"> Close every valid requirement in the complete source-to-target register with fresh target evidence and independently run operational journeys. Close the addendum clause traceability as well as original source parity; priorities and optional enablement do not waive implementation gates.</w:t>
+        <w:t xml:space="preserve"> Close every valid requirement in the complete source-to-target register with fresh target evidence and independently run operational journeys. Close the addendum and consolidated-requirement traceability as well as original source parity; priorities and optional enablement do not waive implementation gates. Include Invoice/Warranty no-auto-download, Preview/Save PDF/Print/safe Email/assisted WhatsApp/history; POS Cash/Card/Mobile Wallet/Bank Transfer, split tender, cash change, destination authorization, Day Closing, payment mix/fees/refund reconciliation; Website fixed-four-channel regression; and legal-policy/licensing/notice acceptance.</w:t>
       </w:r>
     </w:p>
     <w:p>
@@ -2404,7 +2456,47 @@
         <w:t>Acceptance:</w:t>
       </w:r>
       <w:r>
-        <w:t xml:space="preserve"> Pest/PHPUnit, MySQL, builds, Playwright, POS/Website/Control, documentation and recovery gates pass; no silent feature loss or unreviewed duplicate master remains. Every approved addendum clause has fresh backend/UI/API/performance evidence or an explicit unresolved gap; expansion is not treated as legacy completed behavior.</w:t>
+        <w:t xml:space="preserve"> Pest/PHPUnit, MySQL, builds, Playwright, POS/Website/Control, documentation and recovery gates pass; no silent feature loss or unreviewed duplicate master remains. Every approved addendum and consolidated-requirement clause has fresh backend/UI/API/performance evidence or an explicit unresolved gap. Policy coverage matches final product behavior with approved versions/effective dates and working footer links; Privacy claims match real data flows; software ownership and third-party notice posture are deliberate.</w:t>
+      </w:r>
+    </w:p>
+    <w:p>
+      <w:pPr>
+        <w:pStyle w:val="Heading2"/>
+      </w:pPr>
+      <w:r>
+        <w:t>MT-7.6 - Product user manual and administrator operations guide</w:t>
+      </w:r>
+    </w:p>
+    <w:p>
+      <w:pPr>
+        <w:keepNext/>
+      </w:pPr>
+      <w:r>
+        <w:t>Dependencies: MT-7.5</w:t>
+      </w:r>
+    </w:p>
+    <w:p>
+      <w:pPr/>
+      <w:r>
+        <w:rPr>
+          <w:b/>
+        </w:rPr>
+        <w:t>Scope:</w:t>
+      </w:r>
+      <w:r>
+        <w:t xml:space="preserve"> Create the complete role-aware mobiST Tech operational user manual from the final verified product, including current safe UI screenshots and coverage of POS, payments/reconciliation, documents/Email/WhatsApp, inventory/procurement, warranty, cash closing, Website CMS/legal content/Digital Services, integrations, backup/reset safety, mobiST Control and the customer Website. Produce canonical `docs/user-manual/USER_MANUAL.md`, verified same-content DOCX and PDF mirrors, and controlled screenshot assets.</w:t>
+      </w:r>
+    </w:p>
+    <w:p>
+      <w:pPr/>
+      <w:r>
+        <w:rPr>
+          <w:b/>
+        </w:rPr>
+        <w:t>Acceptance:</w:t>
+      </w:r>
+      <w:r>
+        <w:t xml:space="preserve"> Every applicable final user-facing feature maps to its real navigation, permission and procedure; instructions are executed against the final product and no legacy/placeholder UI is presented as final. Screenshots use safe demo data and remain readable. Markdown/DOCX/PDF content parity, TOC/references, render and every-page visual QA pass. Security/destructive warnings and the documented release/Git checkpoint are accurate; no material supported workflow is undocumented.</w:t>
       </w:r>
     </w:p>
     <w:p>
@@ -2441,7 +2533,7 @@
         <w:keepNext/>
       </w:pPr>
       <w:r>
-        <w:t>Dependencies: MT-7.5</w:t>
+        <w:t>Dependencies: MT-7.6</w:t>
       </w:r>
     </w:p>
     <w:p>
@@ -2453,7 +2545,7 @@
         <w:t>Scope:</w:t>
       </w:r>
       <w:r>
-        <w:t xml:space="preserve"> Independently audit the complete Goal and Preferences, requirement map, all completed-point claims, Git/code/data, migration/recovery, security, integrations, CI, documentation, HOLD register and source immutability. Include approved requirements addendum v1.1, the unified Admin/Google requirement, the Team Member/delegated-access/session-security requirement, safe reset, retail/digital expansion, all three Website modes and measured performance exceptions.</w:t>
+        <w:t xml:space="preserve"> Independently audit the complete Goal and Preferences, requirement map, all completed-point claims, Git/code/data, migration/recovery, security, integrations, CI, documentation, HOLD register and source immutability. Include approved requirements addendum v1.1, the unified Admin/Google requirement, the Team Member/delegated-access/session-security requirement and the complete consolidated documents/payments/legal/manual requirement. Inspect actual Invoice/Warranty UX and canonical delivery, Gmail attachments, truthful WhatsApp, POS payment methods/destinations/split tender/refunds/settlement, Website fixed channels, Day Closing/payment mix, legal/privacy/service-pricing consistency, project ownership/third-party notices and the final User Manual.</w:t>
       </w:r>
     </w:p>
     <w:p>
@@ -2465,7 +2557,7 @@
         <w:t>Acceptance:</w:t>
       </w:r>
       <w:r>
-        <w:t xml:space="preserve"> Reopen required gaps; the new repository must be clean and remote-aligned. Report `Project complete: 100%` only after a clean final audit; Deferred required work cannot substitute for completion. Verify original eight completed points were preserved and every subsequently required extension was independently accepted.</w:t>
+        <w:t xml:space="preserve"> Reopen every material requirement, policy, manual, payment or document-delivery mismatch; the new repository must be clean and remote-aligned. Report `Project complete: 100%` only after a clean final audit; Deferred required work cannot substitute for completion. Verify original completed history was preserved and every subsequent extension was independently accepted.</w:t>
       </w:r>
     </w:p>
     <w:p>

</xml_diff>

<commit_message>
Add reusable software product publishing plan
</commit_message>
<xml_diff>
--- a/docs/PROJECT_IMPLEMENTATION_ROADMAP.docx
+++ b/docs/PROJECT_IMPLEMENTATION_ROADMAP.docx
@@ -11,85 +11,81 @@
       </w:r>
     </w:p>
     <w:p>
-      <w:pPr/>
-      <w:r>
-        <w:t>Version: 1.9 | Date: 2026-09-02</w:t>
-      </w:r>
-    </w:p>
-    <w:p>
-      <w:pPr/>
+      <w:r>
+        <w:t>Version: 1.10 | Date: 2026-09-06</w:t>
+      </w:r>
+    </w:p>
+    <w:p>
       <w:r>
         <w:t>Canonical Goal: docs/PROJECT_GOAL.md</w:t>
       </w:r>
     </w:p>
     <w:p>
-      <w:pPr/>
       <w:r>
         <w:t>Binding Preferences: docs/PROJECT_PREFERENCES.md</w:t>
       </w:r>
     </w:p>
     <w:p>
-      <w:pPr/>
       <w:r>
         <w:t>Approved scope expansion: docs/PROJECT_REQUIREMENTS_ADDENDUM_v1.1.md</w:t>
       </w:r>
     </w:p>
     <w:p>
-      <w:pPr/>
       <w:r>
         <w:t>Addendum traceability: docs/REQUIREMENTS_ADDENDUM_v1.1_RECONCILIATION.md</w:t>
       </w:r>
     </w:p>
     <w:p>
-      <w:pPr/>
       <w:r>
         <w:t>Approved superseding requirement: docs/PROJECT_REQUIREMENTS_UNIFIED_ADMIN_GOOGLE_v1.0.md</w:t>
       </w:r>
     </w:p>
     <w:p>
-      <w:pPr/>
       <w:r>
         <w:t>Superseding reconciliation: docs/remediation/RECONCILIATION.md</w:t>
       </w:r>
     </w:p>
     <w:p>
-      <w:pPr/>
       <w:r>
         <w:t>Approved Team Member/session requirement: docs/PROJECT_REQUIREMENTS_TEAM_MEMBERS_SESSION_POLICY_v1.0.md</w:t>
       </w:r>
     </w:p>
     <w:p>
-      <w:pPr/>
       <w:r>
         <w:t>Team Member/session reconciliation: docs/team-members/RECONCILIATION.md</w:t>
       </w:r>
     </w:p>
     <w:p>
-      <w:pPr/>
       <w:r>
         <w:t>Approved consolidated documents/payments/legal/manual requirement: docs/PROJECT_REQUIREMENTS_DOCUMENTS_PAYMENTS_LEGAL_MANUAL_v1.0.md</w:t>
       </w:r>
     </w:p>
     <w:p>
-      <w:pPr/>
       <w:r>
         <w:t>Consolidated requirement reconciliation: docs/consolidated-requirements/RECONCILIATION.md</w:t>
       </w:r>
     </w:p>
     <w:p>
-      <w:pPr/>
+      <w:r>
+        <w:t>Approved software product publishing requirement: docs/PROJECT_REQUIREMENTS_SOFTWARE_PRODUCT_PUBLISHING_v1.0.md</w:t>
+      </w:r>
+    </w:p>
+    <w:p>
+      <w:r>
+        <w:t>Software publishing reconciliation: docs/software-publishing/RECONCILIATION.md</w:t>
+      </w:r>
+    </w:p>
+    <w:p>
       <w:r>
         <w:t>Source of Truth: docs/PROJECT_SOURCE_OF_TRUTH.md</w:t>
       </w:r>
     </w:p>
     <w:p>
-      <w:pPr/>
       <w:r>
         <w:t>Status ledger: docs/PROJECT_IMPLEMENTATION_STATUS.md</w:t>
       </w:r>
     </w:p>
     <w:p>
-      <w:pPr/>
       <w:r>
         <w:t>Word mirror: docs/PROJECT_IMPLEMENTATION_ROADMAP.docx</w:t>
       </w:r>
@@ -103,37 +99,31 @@
       </w:r>
     </w:p>
     <w:p>
-      <w:pPr/>
       <w:r>
         <w:t>This is the single active structural roadmap for the controlled migration. Live Completed/In Progress/Pending state, last/current/next position and progress counts are recorded only in `docs/PROJECT_IMPLEMENTATION_STATUS.md`. Each Proceed executes one point through its required gates and intended new-repository commit/push, then stops. Dependencies are ordered; point IDs and exact titles remain stable.</w:t>
       </w:r>
     </w:p>
     <w:p>
-      <w:pPr/>
       <w:r>
         <w:t>The original POS/Website folders, remotes and data are immutable references. All implementation, copied-source tests and migration rehearsals must run under `C:\mobisttech` or isolated approved target resources. Do not run tests/builds against the originals. Do not replace the single shared Laravel/MySQL authority with duplicate authoritative databases.</w:t>
       </w:r>
     </w:p>
     <w:p>
-      <w:pPr/>
       <w:r>
         <w:t>Every point includes applicable focused/full tests, parity evidence, secrets review, source-boundary checks and ledger updates. Routine execution progress updates the ledger only and must not edit this roadmap or regenerate its DOCX. Regenerate/verify the DOCX only when roadmap structure/content materially changes. MT-1.1 detailed inventory may refine this roadmap from evidence, but valid functionality must not be silently dropped and completed IDs must not be renumbered.</w:t>
       </w:r>
     </w:p>
     <w:p>
-      <w:pPr/>
-      <w:r>
-        <w:t>Goal, Preferences, approved addendum v1.1, the approved unified Admin/Google integrations superseding requirement, the approved Team Member/session security requirement and the approved consolidated documents/payments/legal/manual requirement apply. For working features, assess reuse/adapt/refactor/migrate before rewrite; rewrite requires a verified reason. Verify parity, data consistency, integration and regression incrementally rather than using a big-bang rewrite. Prefer conventional solutions, justified Redis roles and a Laravel-only business backend; do not introduce a parallel Node/Express business backend. Record stack deviations only for verified unavoidable blockers and never silently resolve a Goal conflict.</w:t>
-      </w:r>
-    </w:p>
-    <w:p>
-      <w:pPr/>
+      <w:r>
+        <w:t>Goal, Preferences, approved addendum v1.1, the approved unified Admin/Google integrations superseding requirement, the approved Team Member/session security requirement, the approved consolidated documents/payments/legal/manual requirement and the approved software product publishing requirement apply. For working features, assess reuse/adapt/refactor/migrate before rewrite; rewrite requires a verified reason. Verify parity, data consistency, integration and regression incrementally rather than using a big-bang rewrite. Prefer conventional solutions, justified Redis roles and a Laravel-only business backend; do not introduce a parallel Node/Express business backend. Record stack deviations only for verified unavoidable blockers and never silently resolve a Goal conflict.</w:t>
+      </w:r>
+    </w:p>
+    <w:p>
       <w:r>
         <w:t>Roman Urdu is limited to assistant chat/UI communication. Git-tracked project documentation and technical artifacts use standard English unless the user explicitly requests another language for a specific artifact. User-supplied Goal/Preferences remain byte-preserved in their original language/content.</w:t>
       </w:r>
     </w:p>
     <w:p>
-      <w:pPr/>
       <w:r>
         <w:t>Addendum v1.1 adds dependency-ordered points without renumbering existing IDs. Follow document order and explicit dependencies, not numeric ID sorting. P1/P2/P3 are implementation priorities within dependency constraints, not permission to defer required work. Optional loyalty/repair/booking features must be implemented with disablement; they are not silently removed from scope. Full clause traceability is in docs/REQUIREMENTS_ADDENDUM_v1.1_RECONCILIATION.md.</w:t>
       </w:r>
@@ -155,15 +145,11 @@
       </w:r>
     </w:p>
     <w:p>
-      <w:pPr>
-        <w:keepNext/>
-      </w:pPr>
       <w:r>
         <w:t>Dependencies: None</w:t>
       </w:r>
     </w:p>
     <w:p>
-      <w:pPr/>
       <w:r>
         <w:rPr>
           <w:b/>
@@ -175,7 +161,6 @@
       </w:r>
     </w:p>
     <w:p>
-      <w:pPr/>
       <w:r>
         <w:rPr>
           <w:b/>
@@ -187,7 +172,6 @@
       </w:r>
     </w:p>
     <w:p>
-      <w:pPr/>
       <w:r>
         <w:rPr>
           <w:b/>
@@ -201,7 +185,6 @@
     <w:p>
       <w:pPr>
         <w:pStyle w:val="Heading1"/>
-        <w:pageBreakBefore/>
       </w:pPr>
       <w:r>
         <w:t>MT-1 - Migration inventory and design</w:t>
@@ -216,15 +199,11 @@
       </w:r>
     </w:p>
     <w:p>
-      <w:pPr>
-        <w:keepNext/>
-      </w:pPr>
       <w:r>
         <w:t>Dependencies: MT-0.1</w:t>
       </w:r>
     </w:p>
     <w:p>
-      <w:pPr/>
       <w:r>
         <w:rPr>
           <w:b/>
@@ -236,7 +215,6 @@
       </w:r>
     </w:p>
     <w:p>
-      <w:pPr/>
       <w:r>
         <w:rPr>
           <w:b/>
@@ -248,7 +226,6 @@
       </w:r>
     </w:p>
     <w:p>
-      <w:pPr/>
       <w:r>
         <w:t>Evidence: docs/migration/FEATURE_PARITY_REGISTER.md; isolated source tests passed, originals unchanged, target parity pending.</w:t>
       </w:r>
@@ -262,15 +239,11 @@
       </w:r>
     </w:p>
     <w:p>
-      <w:pPr>
-        <w:keepNext/>
-      </w:pPr>
       <w:r>
         <w:t>Dependencies: MT-1.1</w:t>
       </w:r>
     </w:p>
     <w:p>
-      <w:pPr/>
       <w:r>
         <w:rPr>
           <w:b/>
@@ -282,7 +255,6 @@
       </w:r>
     </w:p>
     <w:p>
-      <w:pPr/>
       <w:r>
         <w:rPr>
           <w:b/>
@@ -302,15 +274,11 @@
       </w:r>
     </w:p>
     <w:p>
-      <w:pPr>
-        <w:keepNext/>
-      </w:pPr>
       <w:r>
         <w:t>Dependencies: MT-1.2</w:t>
       </w:r>
     </w:p>
     <w:p>
-      <w:pPr/>
       <w:r>
         <w:rPr>
           <w:b/>
@@ -322,7 +290,6 @@
       </w:r>
     </w:p>
     <w:p>
-      <w:pPr/>
       <w:r>
         <w:rPr>
           <w:b/>
@@ -334,7 +301,6 @@
       </w:r>
     </w:p>
     <w:p>
-      <w:pPr/>
       <w:r>
         <w:rPr>
           <w:b/>
@@ -348,7 +314,6 @@
     <w:p>
       <w:pPr>
         <w:pStyle w:val="Heading1"/>
-        <w:pageBreakBefore/>
       </w:pPr>
       <w:r>
         <w:t>MT-2 - Shared backend and transactional migration</w:t>
@@ -363,15 +328,11 @@
       </w:r>
     </w:p>
     <w:p>
-      <w:pPr>
-        <w:keepNext/>
-      </w:pPr>
       <w:r>
         <w:t>Dependencies: MT-1.3</w:t>
       </w:r>
     </w:p>
     <w:p>
-      <w:pPr/>
       <w:r>
         <w:rPr>
           <w:b/>
@@ -383,7 +344,6 @@
       </w:r>
     </w:p>
     <w:p>
-      <w:pPr/>
       <w:r>
         <w:rPr>
           <w:b/>
@@ -403,15 +363,11 @@
       </w:r>
     </w:p>
     <w:p>
-      <w:pPr>
-        <w:keepNext/>
-      </w:pPr>
       <w:r>
         <w:t>Dependencies: MT-2.1</w:t>
       </w:r>
     </w:p>
     <w:p>
-      <w:pPr/>
       <w:r>
         <w:rPr>
           <w:b/>
@@ -423,7 +379,6 @@
       </w:r>
     </w:p>
     <w:p>
-      <w:pPr/>
       <w:r>
         <w:rPr>
           <w:b/>
@@ -443,15 +398,11 @@
       </w:r>
     </w:p>
     <w:p>
-      <w:pPr>
-        <w:keepNext/>
-      </w:pPr>
       <w:r>
         <w:t>Dependencies: MT-2.2</w:t>
       </w:r>
     </w:p>
     <w:p>
-      <w:pPr/>
       <w:r>
         <w:rPr>
           <w:b/>
@@ -463,7 +414,6 @@
       </w:r>
     </w:p>
     <w:p>
-      <w:pPr/>
       <w:r>
         <w:rPr>
           <w:b/>
@@ -483,15 +433,11 @@
       </w:r>
     </w:p>
     <w:p>
-      <w:pPr>
-        <w:keepNext/>
-      </w:pPr>
       <w:r>
         <w:t>Dependencies: MT-2.3</w:t>
       </w:r>
     </w:p>
     <w:p>
-      <w:pPr/>
       <w:r>
         <w:rPr>
           <w:b/>
@@ -503,7 +449,6 @@
       </w:r>
     </w:p>
     <w:p>
-      <w:pPr/>
       <w:r>
         <w:rPr>
           <w:b/>
@@ -523,15 +468,11 @@
       </w:r>
     </w:p>
     <w:p>
-      <w:pPr>
-        <w:keepNext/>
-      </w:pPr>
       <w:r>
         <w:t>Dependencies: MT-2.4</w:t>
       </w:r>
     </w:p>
     <w:p>
-      <w:pPr/>
       <w:r>
         <w:rPr>
           <w:b/>
@@ -543,7 +484,6 @@
       </w:r>
     </w:p>
     <w:p>
-      <w:pPr/>
       <w:r>
         <w:rPr>
           <w:b/>
@@ -563,15 +503,11 @@
       </w:r>
     </w:p>
     <w:p>
-      <w:pPr>
-        <w:keepNext/>
-      </w:pPr>
       <w:r>
         <w:t>Dependencies: MT-2.8</w:t>
       </w:r>
     </w:p>
     <w:p>
-      <w:pPr/>
       <w:r>
         <w:rPr>
           <w:b/>
@@ -583,7 +519,6 @@
       </w:r>
     </w:p>
     <w:p>
-      <w:pPr/>
       <w:r>
         <w:rPr>
           <w:b/>
@@ -603,15 +538,11 @@
       </w:r>
     </w:p>
     <w:p>
-      <w:pPr>
-        <w:keepNext/>
-      </w:pPr>
       <w:r>
         <w:t>Dependencies: MT-2.5</w:t>
       </w:r>
     </w:p>
     <w:p>
-      <w:pPr/>
       <w:r>
         <w:rPr>
           <w:b/>
@@ -623,7 +554,6 @@
       </w:r>
     </w:p>
     <w:p>
-      <w:pPr/>
       <w:r>
         <w:rPr>
           <w:b/>
@@ -643,15 +573,11 @@
       </w:r>
     </w:p>
     <w:p>
-      <w:pPr>
-        <w:keepNext/>
-      </w:pPr>
       <w:r>
         <w:t>Dependencies: MT-2.6</w:t>
       </w:r>
     </w:p>
     <w:p>
-      <w:pPr/>
       <w:r>
         <w:rPr>
           <w:b/>
@@ -663,7 +589,6 @@
       </w:r>
     </w:p>
     <w:p>
-      <w:pPr/>
       <w:r>
         <w:rPr>
           <w:b/>
@@ -683,15 +608,11 @@
       </w:r>
     </w:p>
     <w:p>
-      <w:pPr>
-        <w:keepNext/>
-      </w:pPr>
       <w:r>
         <w:t>Dependencies: MT-2.18</w:t>
       </w:r>
     </w:p>
     <w:p>
-      <w:pPr/>
       <w:r>
         <w:rPr>
           <w:b/>
@@ -703,7 +624,6 @@
       </w:r>
     </w:p>
     <w:p>
-      <w:pPr/>
       <w:r>
         <w:rPr>
           <w:b/>
@@ -723,15 +643,11 @@
       </w:r>
     </w:p>
     <w:p>
-      <w:pPr>
-        <w:keepNext/>
-      </w:pPr>
       <w:r>
         <w:t>Dependencies: MT-2.7</w:t>
       </w:r>
     </w:p>
     <w:p>
-      <w:pPr/>
       <w:r>
         <w:rPr>
           <w:b/>
@@ -743,7 +659,6 @@
       </w:r>
     </w:p>
     <w:p>
-      <w:pPr/>
       <w:r>
         <w:rPr>
           <w:b/>
@@ -763,15 +678,11 @@
       </w:r>
     </w:p>
     <w:p>
-      <w:pPr>
-        <w:keepNext/>
-      </w:pPr>
       <w:r>
         <w:t>Dependencies: MT-2.19</w:t>
       </w:r>
     </w:p>
     <w:p>
-      <w:pPr/>
       <w:r>
         <w:rPr>
           <w:b/>
@@ -783,7 +694,6 @@
       </w:r>
     </w:p>
     <w:p>
-      <w:pPr/>
       <w:r>
         <w:rPr>
           <w:b/>
@@ -803,15 +713,11 @@
       </w:r>
     </w:p>
     <w:p>
-      <w:pPr>
-        <w:keepNext/>
-      </w:pPr>
       <w:r>
         <w:t>Dependencies: MT-2.9</w:t>
       </w:r>
     </w:p>
     <w:p>
-      <w:pPr/>
       <w:r>
         <w:rPr>
           <w:b/>
@@ -823,7 +729,6 @@
       </w:r>
     </w:p>
     <w:p>
-      <w:pPr/>
       <w:r>
         <w:rPr>
           <w:b/>
@@ -843,15 +748,11 @@
       </w:r>
     </w:p>
     <w:p>
-      <w:pPr>
-        <w:keepNext/>
-      </w:pPr>
       <w:r>
         <w:t>Dependencies: MT-2.10</w:t>
       </w:r>
     </w:p>
     <w:p>
-      <w:pPr/>
       <w:r>
         <w:rPr>
           <w:b/>
@@ -863,7 +764,6 @@
       </w:r>
     </w:p>
     <w:p>
-      <w:pPr/>
       <w:r>
         <w:rPr>
           <w:b/>
@@ -883,15 +783,11 @@
       </w:r>
     </w:p>
     <w:p>
-      <w:pPr>
-        <w:keepNext/>
-      </w:pPr>
       <w:r>
         <w:t>Dependencies: MT-2.11</w:t>
       </w:r>
     </w:p>
     <w:p>
-      <w:pPr/>
       <w:r>
         <w:rPr>
           <w:b/>
@@ -903,7 +799,6 @@
       </w:r>
     </w:p>
     <w:p>
-      <w:pPr/>
       <w:r>
         <w:rPr>
           <w:b/>
@@ -923,15 +818,11 @@
       </w:r>
     </w:p>
     <w:p>
-      <w:pPr>
-        <w:keepNext/>
-      </w:pPr>
       <w:r>
         <w:t>Dependencies: MT-2.20</w:t>
       </w:r>
     </w:p>
     <w:p>
-      <w:pPr/>
       <w:r>
         <w:rPr>
           <w:b/>
@@ -943,7 +834,6 @@
       </w:r>
     </w:p>
     <w:p>
-      <w:pPr/>
       <w:r>
         <w:rPr>
           <w:b/>
@@ -963,15 +853,11 @@
       </w:r>
     </w:p>
     <w:p>
-      <w:pPr>
-        <w:keepNext/>
-      </w:pPr>
       <w:r>
         <w:t>Dependencies: MT-2.12</w:t>
       </w:r>
     </w:p>
     <w:p>
-      <w:pPr/>
       <w:r>
         <w:rPr>
           <w:b/>
@@ -983,7 +869,6 @@
       </w:r>
     </w:p>
     <w:p>
-      <w:pPr/>
       <w:r>
         <w:rPr>
           <w:b/>
@@ -1003,15 +888,11 @@
       </w:r>
     </w:p>
     <w:p>
-      <w:pPr>
-        <w:keepNext/>
-      </w:pPr>
       <w:r>
         <w:t>Dependencies: MT-2.13</w:t>
       </w:r>
     </w:p>
     <w:p>
-      <w:pPr/>
       <w:r>
         <w:rPr>
           <w:b/>
@@ -1023,7 +904,6 @@
       </w:r>
     </w:p>
     <w:p>
-      <w:pPr/>
       <w:r>
         <w:rPr>
           <w:b/>
@@ -1043,15 +923,11 @@
       </w:r>
     </w:p>
     <w:p>
-      <w:pPr>
-        <w:keepNext/>
-      </w:pPr>
       <w:r>
         <w:t>Dependencies: MT-2.14</w:t>
       </w:r>
     </w:p>
     <w:p>
-      <w:pPr/>
       <w:r>
         <w:rPr>
           <w:b/>
@@ -1063,7 +939,6 @@
       </w:r>
     </w:p>
     <w:p>
-      <w:pPr/>
       <w:r>
         <w:rPr>
           <w:b/>
@@ -1083,15 +958,11 @@
       </w:r>
     </w:p>
     <w:p>
-      <w:pPr>
-        <w:keepNext/>
-      </w:pPr>
       <w:r>
         <w:t>Dependencies: MT-2.17</w:t>
       </w:r>
     </w:p>
     <w:p>
-      <w:pPr/>
       <w:r>
         <w:rPr>
           <w:b/>
@@ -1103,7 +974,6 @@
       </w:r>
     </w:p>
     <w:p>
-      <w:pPr/>
       <w:r>
         <w:rPr>
           <w:b/>
@@ -1123,15 +993,11 @@
       </w:r>
     </w:p>
     <w:p>
-      <w:pPr>
-        <w:keepNext/>
-      </w:pPr>
       <w:r>
         <w:t>Dependencies: MT-2.15</w:t>
       </w:r>
     </w:p>
     <w:p>
-      <w:pPr/>
       <w:r>
         <w:rPr>
           <w:b/>
@@ -1143,7 +1009,6 @@
       </w:r>
     </w:p>
     <w:p>
-      <w:pPr/>
       <w:r>
         <w:rPr>
           <w:b/>
@@ -1155,7 +1020,6 @@
       </w:r>
     </w:p>
     <w:p>
-      <w:pPr/>
       <w:r>
         <w:rPr>
           <w:b/>
@@ -1169,7 +1033,6 @@
     <w:p>
       <w:pPr>
         <w:pStyle w:val="Heading1"/>
-        <w:pageBreakBefore/>
       </w:pPr>
       <w:r>
         <w:t>MT-3 - Administration, content and REST APIs</w:t>
@@ -1184,15 +1047,11 @@
       </w:r>
     </w:p>
     <w:p>
-      <w:pPr>
-        <w:keepNext/>
-      </w:pPr>
       <w:r>
         <w:t>Dependencies: MT-2.16</w:t>
       </w:r>
     </w:p>
     <w:p>
-      <w:pPr/>
       <w:r>
         <w:rPr>
           <w:b/>
@@ -1204,7 +1063,6 @@
       </w:r>
     </w:p>
     <w:p>
-      <w:pPr/>
       <w:r>
         <w:rPr>
           <w:b/>
@@ -1224,15 +1082,11 @@
       </w:r>
     </w:p>
     <w:p>
-      <w:pPr>
-        <w:keepNext/>
-      </w:pPr>
       <w:r>
         <w:t>Dependencies: MT-3.1</w:t>
       </w:r>
     </w:p>
     <w:p>
-      <w:pPr/>
       <w:r>
         <w:rPr>
           <w:b/>
@@ -1240,11 +1094,10 @@
         <w:t>Scope:</w:t>
       </w:r>
       <w:r>
-        <w:t xml:space="preserve"> Migrate Website-managed pages, navigation, homepage/catalogue, SEO/promotion settings, media, themes and branding controls into the backend. Make Legal Content an explicit typed policy system for Privacy Policy, Terms &amp; Conditions, Return &amp; Refund Policy, Shipping / Delivery Policy, Warranty Policy and conditionally required Cookie Policy, Digital Services / Project Terms and payment disclosures, with purpose, version/effective date, approval state, protected slugs and footer destinations. Extend modular content with service landing schemas, managed case studies, client/industry disclosure, digital testimonials separate from retail reviews, reusable FAQs, insights/blog/guides and service associations.</w:t>
-      </w:r>
-    </w:p>
-    <w:p>
-      <w:pPr/>
+        <w:t xml:space="preserve"> Migrate Website-managed pages, navigation, homepage/catalogue, SEO/promotion settings, media, themes and branding controls into the backend. Make Legal Content an explicit typed policy system for Privacy Policy, Terms &amp; Conditions, Return &amp; Refund Policy, Shipping / Delivery Policy, Warranty Policy and conditionally required Cookie Policy, Digital Services / Project Terms and payment disclosures, with purpose, version/effective date, approval state, protected slugs and footer destinations. Extend modular content with service landing schemas, managed case studies, client/industry disclosure, digital testimonials separate from retail reviews, reusable FAQs, insights/blog/guides and service associations. Add a first-party Software Product content family with stable protected slugs, one reusable product-page template, Overview/features/media/platform requirements, product-specific Privacy/Terms/FAQ, current version and immutable release history/release notes. Canonical public route identity is `/software/{software-slug}` with product-specific policy/FAQ/release child routes; live domain activation remains H-01.</w:t>
+      </w:r>
+    </w:p>
+    <w:p>
       <w:r>
         <w:rPr>
           <w:b/>
@@ -1252,7 +1105,7 @@
         <w:t>Acceptance:</w:t>
       </w:r>
       <w:r>
-        <w:t xml:space="preserve"> Draft/preview/publish, revisions/rollback, safe rich content/uploads, cache invalidation and distinct POS/Website settings are preserved. Policy types, effective/version dates, approval state, protected routes, footer links and factual-data-flow review are enforced; unresolved owner/legal decisions remain explicit and no draft is falsely labeled lawyer-approved. Cookie coverage follows actual tracking behavior, public payment claims retain the fixed Website model, public policy changes never rewrite historical transaction/proposal/warranty snapshots, and content editors cannot replace protected routes. Consent/moderation, disclosure, metadata and safe media handling cover every other added content family; common plus capability/mode variants avoid three page-tree copies.</w:t>
+        <w:t xml:space="preserve"> Draft/preview/publish, revisions/rollback, safe rich content/uploads, cache invalidation and distinct POS/Website settings are preserved. Policy types, effective/version dates, approval state, protected routes, footer links and factual-data-flow review are enforced; unresolved owner/legal decisions remain explicit and no draft is falsely labeled lawyer-approved. Cookie coverage follows actual tracking behavior, public payment claims retain the fixed Website model, public policy changes never rewrite historical transaction/proposal/warranty snapshots, and content editors cannot replace protected routes. Software slugs are unique/protected, the reusable template creates multiple products without copied page trees, draft/private software content never leaks, and release publication preserves prior versions while surfacing required Overview/Privacy/Terms/FAQ impact review. Consent/moderation, disclosure, metadata and safe media handling cover every other added content family; common plus capability/mode variants avoid three page-tree copies.</w:t>
       </w:r>
     </w:p>
     <w:p>
@@ -1264,15 +1117,11 @@
       </w:r>
     </w:p>
     <w:p>
-      <w:pPr>
-        <w:keepNext/>
-      </w:pPr>
       <w:r>
         <w:t>Dependencies: MT-3.2</w:t>
       </w:r>
     </w:p>
     <w:p>
-      <w:pPr/>
       <w:r>
         <w:rPr>
           <w:b/>
@@ -1284,7 +1133,6 @@
       </w:r>
     </w:p>
     <w:p>
-      <w:pPr/>
       <w:r>
         <w:rPr>
           <w:b/>
@@ -1304,15 +1152,11 @@
       </w:r>
     </w:p>
     <w:p>
-      <w:pPr>
-        <w:keepNext/>
-      </w:pPr>
       <w:r>
         <w:t>Dependencies: MT-3.7</w:t>
       </w:r>
     </w:p>
     <w:p>
-      <w:pPr/>
       <w:r>
         <w:rPr>
           <w:b/>
@@ -1324,7 +1168,6 @@
       </w:r>
     </w:p>
     <w:p>
-      <w:pPr/>
       <w:r>
         <w:rPr>
           <w:b/>
@@ -1344,15 +1187,11 @@
       </w:r>
     </w:p>
     <w:p>
-      <w:pPr>
-        <w:keepNext/>
-      </w:pPr>
       <w:r>
         <w:t>Dependencies: MT-3.5</w:t>
       </w:r>
     </w:p>
     <w:p>
-      <w:pPr/>
       <w:r>
         <w:rPr>
           <w:b/>
@@ -1364,7 +1203,6 @@
       </w:r>
     </w:p>
     <w:p>
-      <w:pPr/>
       <w:r>
         <w:rPr>
           <w:b/>
@@ -1384,15 +1222,11 @@
       </w:r>
     </w:p>
     <w:p>
-      <w:pPr>
-        <w:keepNext/>
-      </w:pPr>
       <w:r>
         <w:t>Dependencies: MT-3.6</w:t>
       </w:r>
     </w:p>
     <w:p>
-      <w:pPr/>
       <w:r>
         <w:rPr>
           <w:b/>
@@ -1404,7 +1238,6 @@
       </w:r>
     </w:p>
     <w:p>
-      <w:pPr/>
       <w:r>
         <w:rPr>
           <w:b/>
@@ -1424,15 +1257,11 @@
       </w:r>
     </w:p>
     <w:p>
-      <w:pPr>
-        <w:keepNext/>
-      </w:pPr>
       <w:r>
         <w:t>Dependencies: MT-3.9</w:t>
       </w:r>
     </w:p>
     <w:p>
-      <w:pPr/>
       <w:r>
         <w:rPr>
           <w:b/>
@@ -1444,7 +1273,6 @@
       </w:r>
     </w:p>
     <w:p>
-      <w:pPr/>
       <w:r>
         <w:rPr>
           <w:b/>
@@ -1464,15 +1292,11 @@
       </w:r>
     </w:p>
     <w:p>
-      <w:pPr>
-        <w:keepNext/>
-      </w:pPr>
       <w:r>
         <w:t>Dependencies: MT-3.3</w:t>
       </w:r>
     </w:p>
     <w:p>
-      <w:pPr/>
       <w:r>
         <w:rPr>
           <w:b/>
@@ -1484,7 +1308,6 @@
       </w:r>
     </w:p>
     <w:p>
-      <w:pPr/>
       <w:r>
         <w:rPr>
           <w:b/>
@@ -1504,15 +1327,11 @@
       </w:r>
     </w:p>
     <w:p>
-      <w:pPr>
-        <w:keepNext/>
-      </w:pPr>
       <w:r>
         <w:t>Dependencies: MT-3.8</w:t>
       </w:r>
     </w:p>
     <w:p>
-      <w:pPr/>
       <w:r>
         <w:rPr>
           <w:b/>
@@ -1520,11 +1339,10 @@
         <w:t>Scope:</w:t>
       </w:r>
       <w:r>
-        <w:t xml:space="preserve"> Define and expose public catalogue/content plus authenticated account/cart/order/payment APIs for Next.js. Add documented approved-domain and operating-profile APIs, mode-aware queries/cache keys and indexed pagination; no public page may fetch the full inventory.</w:t>
-      </w:r>
-    </w:p>
-    <w:p>
-      <w:pPr/>
+        <w:t xml:space="preserve"> Define and expose public catalogue/content plus authenticated account/cart/order/payment APIs for Next.js. Include versioned public contracts for published Software Product overview, policy/FAQ and release-history content while excluding drafts, internal notes and private Admin fields. Add documented approved-domain and operating-profile APIs, mode-aware queries/cache keys and indexed pagination; no public page may fetch the full inventory.</w:t>
+      </w:r>
+    </w:p>
+    <w:p>
       <w:r>
         <w:rPr>
           <w:b/>
@@ -1532,11 +1350,10 @@
         <w:t>Acceptance:</w:t>
       </w:r>
       <w:r>
-        <w:t xml:space="preserve"> Documented payload/error/pagination contracts, authorization, rate limits, public-data allowlists and freshness tests pass; writes use shared services. Direct route/API capability denial, authenticated historical exceptions, selective cache invalidation and all-mode payload/request budgets pass before Website integration.</w:t>
-      </w:r>
-    </w:p>
-    <w:p>
-      <w:pPr/>
+        <w:t xml:space="preserve"> Documented payload/error/pagination contracts, authorization, rate limits, public-data allowlists and freshness tests pass; writes use shared services. Software APIs expose only the published revision/current-version pointers and approved historical releases, reject unknown/archived or draft leakage according to publication rules, and preserve canonical slug identity. Direct route/API capability denial, authenticated historical exceptions, selective cache invalidation and all-mode payload/request budgets pass before Website integration.</w:t>
+      </w:r>
+    </w:p>
+    <w:p>
       <w:r>
         <w:rPr>
           <w:b/>
@@ -1550,7 +1367,6 @@
     <w:p>
       <w:pPr>
         <w:pStyle w:val="Heading1"/>
-        <w:pageBreakBefore/>
       </w:pPr>
       <w:r>
         <w:t>MT-4 - React POS and administration</w:t>
@@ -1565,15 +1381,11 @@
       </w:r>
     </w:p>
     <w:p>
-      <w:pPr>
-        <w:keepNext/>
-      </w:pPr>
       <w:r>
         <w:t>Dependencies: MT-3.4</w:t>
       </w:r>
     </w:p>
     <w:p>
-      <w:pPr/>
       <w:r>
         <w:rPr>
           <w:b/>
@@ -1585,7 +1397,6 @@
       </w:r>
     </w:p>
     <w:p>
-      <w:pPr/>
       <w:r>
         <w:rPr>
           <w:b/>
@@ -1605,15 +1416,11 @@
       </w:r>
     </w:p>
     <w:p>
-      <w:pPr>
-        <w:keepNext/>
-      </w:pPr>
       <w:r>
         <w:t>Dependencies: MT-4.1</w:t>
       </w:r>
     </w:p>
     <w:p>
-      <w:pPr/>
       <w:r>
         <w:rPr>
           <w:b/>
@@ -1625,7 +1432,6 @@
       </w:r>
     </w:p>
     <w:p>
-      <w:pPr/>
       <w:r>
         <w:rPr>
           <w:b/>
@@ -1645,15 +1451,11 @@
       </w:r>
     </w:p>
     <w:p>
-      <w:pPr>
-        <w:keepNext/>
-      </w:pPr>
       <w:r>
         <w:t>Dependencies: MT-4.2</w:t>
       </w:r>
     </w:p>
     <w:p>
-      <w:pPr/>
       <w:r>
         <w:rPr>
           <w:b/>
@@ -1665,7 +1467,6 @@
       </w:r>
     </w:p>
     <w:p>
-      <w:pPr/>
       <w:r>
         <w:rPr>
           <w:b/>
@@ -1685,15 +1486,11 @@
       </w:r>
     </w:p>
     <w:p>
-      <w:pPr>
-        <w:keepNext/>
-      </w:pPr>
       <w:r>
         <w:t>Dependencies: MT-4.5</w:t>
       </w:r>
     </w:p>
     <w:p>
-      <w:pPr/>
       <w:r>
         <w:rPr>
           <w:b/>
@@ -1705,7 +1502,6 @@
       </w:r>
     </w:p>
     <w:p>
-      <w:pPr/>
       <w:r>
         <w:rPr>
           <w:b/>
@@ -1725,15 +1521,11 @@
       </w:r>
     </w:p>
     <w:p>
-      <w:pPr>
-        <w:keepNext/>
-      </w:pPr>
       <w:r>
         <w:t>Dependencies: MT-4.6</w:t>
       </w:r>
     </w:p>
     <w:p>
-      <w:pPr/>
       <w:r>
         <w:rPr>
           <w:b/>
@@ -1745,7 +1537,6 @@
       </w:r>
     </w:p>
     <w:p>
-      <w:pPr/>
       <w:r>
         <w:rPr>
           <w:b/>
@@ -1765,15 +1556,11 @@
       </w:r>
     </w:p>
     <w:p>
-      <w:pPr>
-        <w:keepNext/>
-      </w:pPr>
       <w:r>
         <w:t>Dependencies: MT-4.3</w:t>
       </w:r>
     </w:p>
     <w:p>
-      <w:pPr/>
       <w:r>
         <w:rPr>
           <w:b/>
@@ -1781,11 +1568,10 @@
         <w:t>Scope:</w:t>
       </w:r>
       <w:r>
-        <w:t xml:space="preserve"> Migrate protected React admin screens for Website CMS and POS configuration, Team Member/Role administration, revisions/media/branding/payment settings. Manage six separate Invoice/Warranty Email and WhatsApp templates, POS Payment Destinations with masked identifiers, typed legal/policy content with publish/revision/effective-date controls, applicable document/output defaults and the existing Gmail connection/status entry point. Consume the same Laravel-owned Admin realm, effective permissions, outlet/delegation ceilings and session/recent-auth policy as POS. Include three-way Website mode selector, per-mode preview and publish impact, revision rollback, case studies/digital testimonials/knowledge content, promotion/coupon and optional loyalty settings.</w:t>
-      </w:r>
-    </w:p>
-    <w:p>
-      <w:pPr/>
+        <w:t xml:space="preserve"> Migrate protected React admin screens for Website CMS and POS configuration, Team Member/Role administration, revisions/media/branding/payment settings. Manage six separate Invoice/Warranty Email and WhatsApp templates, POS Payment Destinations with masked identifiers, typed legal/policy content with publish/revision/effective-date controls, applicable document/output defaults and the existing Gmail connection/status entry point. Consume the same Laravel-owned Admin realm, effective permissions, outlet/delegation ceilings and session/recent-auth policy as POS. Include three-way Website mode selector, per-mode preview and publish impact, revision rollback, case studies/digital testimonials/knowledge content, promotion/coupon and optional loyalty settings. Add a protected Software administration area with list/search/status/current-version visibility, `New Software` from the reusable template, Overview/features/media/platform/documentation fields, product-specific Privacy/Terms/FAQ editors, release/version management, preview, publish, archive and rollback workflows.</w:t>
+      </w:r>
+    </w:p>
+    <w:p>
       <w:r>
         <w:rPr>
           <w:b/>
@@ -1793,7 +1579,7 @@
         <w:t>Acceptance:</w:t>
       </w:r>
       <w:r>
-        <w:t xml:space="preserve"> Separate permissions, safe delegated Team Member/Custom Role changes, protected Full Access, preview/publish/rollback, safe recovery, secret masking and Dynamic Platform parity acceptance pass. Ordinary document senders cannot manage integrations/templates/destinations; destination metadata exposes no provider secrets. Policy publication and Gmail configuration retain their own authorization/recent-auth boundaries. Publication triggers verified cache/sitemap/SEO revalidation and does not delete historical data.</w:t>
+        <w:t xml:space="preserve"> Separate permissions, safe delegated Team Member/Custom Role changes, protected Full Access, preview/publish/rollback, safe recovery, secret masking and Dynamic Platform parity acceptance pass. Ordinary document senders cannot manage integrations/templates/destinations; destination metadata exposes no provider secrets. Software create/edit and publish permissions are distinct; New Software never requires copied hard-coded routes, slug collisions fail safely, release updates preserve history and surface documentation-impact review, and archived products retain audit/revision history. Policy publication and Gmail configuration retain their own authorization/recent-auth boundaries. Publication triggers verified cache/sitemap/SEO revalidation and does not delete historical data.</w:t>
       </w:r>
     </w:p>
     <w:p>
@@ -1805,15 +1591,11 @@
       </w:r>
     </w:p>
     <w:p>
-      <w:pPr>
-        <w:keepNext/>
-      </w:pPr>
       <w:r>
         <w:t>Dependencies: MT-4.4</w:t>
       </w:r>
     </w:p>
     <w:p>
-      <w:pPr/>
       <w:r>
         <w:rPr>
           <w:b/>
@@ -1825,7 +1607,6 @@
       </w:r>
     </w:p>
     <w:p>
-      <w:pPr/>
       <w:r>
         <w:rPr>
           <w:b/>
@@ -1845,15 +1626,11 @@
       </w:r>
     </w:p>
     <w:p>
-      <w:pPr>
-        <w:keepNext/>
-      </w:pPr>
       <w:r>
         <w:t>Dependencies: MT-4.8</w:t>
       </w:r>
     </w:p>
     <w:p>
-      <w:pPr/>
       <w:r>
         <w:rPr>
           <w:b/>
@@ -1865,7 +1642,6 @@
       </w:r>
     </w:p>
     <w:p>
-      <w:pPr/>
       <w:r>
         <w:rPr>
           <w:b/>
@@ -1877,7 +1653,6 @@
       </w:r>
     </w:p>
     <w:p>
-      <w:pPr/>
       <w:r>
         <w:rPr>
           <w:b/>
@@ -1891,7 +1666,6 @@
     <w:p>
       <w:pPr>
         <w:pStyle w:val="Heading1"/>
-        <w:pageBreakBefore/>
       </w:pPr>
       <w:r>
         <w:t>MT-5 - Next.js customer Website</w:t>
@@ -1906,15 +1680,11 @@
       </w:r>
     </w:p>
     <w:p>
-      <w:pPr>
-        <w:keepNext/>
-      </w:pPr>
       <w:r>
         <w:t>Dependencies: MT-4.7</w:t>
       </w:r>
     </w:p>
     <w:p>
-      <w:pPr/>
       <w:r>
         <w:rPr>
           <w:b/>
@@ -1926,7 +1696,6 @@
       </w:r>
     </w:p>
     <w:p>
-      <w:pPr/>
       <w:r>
         <w:rPr>
           <w:b/>
@@ -1946,15 +1715,11 @@
       </w:r>
     </w:p>
     <w:p>
-      <w:pPr>
-        <w:keepNext/>
-      </w:pPr>
       <w:r>
         <w:t>Dependencies: MT-5.1</w:t>
       </w:r>
     </w:p>
     <w:p>
-      <w:pPr/>
       <w:r>
         <w:rPr>
           <w:b/>
@@ -1966,7 +1731,6 @@
       </w:r>
     </w:p>
     <w:p>
-      <w:pPr/>
       <w:r>
         <w:rPr>
           <w:b/>
@@ -1986,15 +1750,11 @@
       </w:r>
     </w:p>
     <w:p>
-      <w:pPr>
-        <w:keepNext/>
-      </w:pPr>
       <w:r>
         <w:t>Dependencies: MT-5.2</w:t>
       </w:r>
     </w:p>
     <w:p>
-      <w:pPr/>
       <w:r>
         <w:rPr>
           <w:b/>
@@ -2006,7 +1766,6 @@
       </w:r>
     </w:p>
     <w:p>
-      <w:pPr/>
       <w:r>
         <w:rPr>
           <w:b/>
@@ -2026,15 +1785,11 @@
       </w:r>
     </w:p>
     <w:p>
-      <w:pPr>
-        <w:keepNext/>
-      </w:pPr>
       <w:r>
         <w:t>Dependencies: MT-5.3</w:t>
       </w:r>
     </w:p>
     <w:p>
-      <w:pPr/>
       <w:r>
         <w:rPr>
           <w:b/>
@@ -2042,11 +1797,10 @@
         <w:t>Scope:</w:t>
       </w:r>
       <w:r>
-        <w:t xml:space="preserve"> Migrate managed pages/menu/homepage/themes, promotions, legal content, digital services, service requests and approved project quote/payment flows. Publish responsive footer-linked Privacy, Terms, Return/Refund, Shipping/Delivery, Warranty and applicable Cookie/Digital Services/Project Terms pages from approved typed policy revisions. Add rich service landing pages, case studies, digital testimonials, FAQs/insights/guides, package/add-on presentation and progressive optional-field enquiry/booking flows. Apply common/digital/commerce content and digital_only/hybrid/commerce_only hero/About/Contact/CTA variants; distinguish fixed/package prices, starting-from indications and custom quotations.</w:t>
-      </w:r>
-    </w:p>
-    <w:p>
-      <w:pPr/>
+        <w:t xml:space="preserve"> Migrate managed pages/menu/homepage/themes, promotions, legal content, digital services, service requests and approved project quote/payment flows. Publish responsive footer-linked Privacy, Terms, Return/Refund, Shipping/Delivery, Warranty and applicable Cookie/Digital Services/Project Terms pages from approved typed policy revisions. Add rich service landing pages, case studies, digital testimonials, FAQs/insights/guides, package/add-on presentation and progressive optional-field enquiry/booking flows. Publish the reusable Software Product route family: `/software/{software-slug}` for the canonical overview, plus product-specific `/privacy`, `/terms`, `/faq`, `/releases` and optional `/releases/{version}` pages. The software template presents approved overview/features/media/platform requirements, current version, support/CTA, documentation links and release history without hand-built per-product page trees. Apply common/digital/commerce content and digital_only/hybrid/commerce_only hero/About/Contact/CTA variants; distinguish fixed/package prices, starting-from indications and custom quotations.</w:t>
+      </w:r>
+    </w:p>
+    <w:p>
       <w:r>
         <w:rPr>
           <w:b/>
@@ -2054,7 +1808,7 @@
         <w:t>Acceptance:</w:t>
       </w:r>
       <w:r>
-        <w:t xml:space="preserve"> CMS publication/revision is reflected on the Website; every applicable approved policy route/footer destination works, shows version/effective date and matches actual business/data/payment behavior. No placeholder or unapproved commercial/legal term is treated as final, and mutable Website copy cannot rewrite approved proposal/milestone/warranty/Invoice snapshots. Safe content/media, protected routes, digital quote amount/token/ownership, mode-aware discovery/enquiry, SEO/social metadata, safe attachments and low-friction journeys pass. Production-build measurements meet the MT-5.1 targets or record cause, measured impact and explicit remediation/acceptance; minimize global JS, scripts, libraries and fonts.</w:t>
+        <w:t xml:space="preserve"> CMS publication/revision is reflected on the Website; every applicable approved policy route/footer destination works, shows version/effective date and matches actual business/data/payment behavior. Software routes resolve only published approved content, canonical slugs/redirects and sitemap/SEO metadata are correct, Overview/Privacy/Terms/FAQ remain associated with the intended software, and current-version updates preserve customer-readable historical releases. No placeholder or unapproved commercial/legal term is treated as final, and mutable Website copy cannot rewrite approved proposal/milestone/warranty/Invoice snapshots. Safe content/media, protected routes, digital quote amount/token/ownership, mode-aware discovery/enquiry, SEO/social metadata, safe attachments and low-friction journeys pass. Production-build measurements meet the MT-5.1 targets or record cause, measured impact and explicit remediation/acceptance; minimize global JS, scripts, libraries and fonts.</w:t>
       </w:r>
     </w:p>
     <w:p>
@@ -2066,15 +1820,11 @@
       </w:r>
     </w:p>
     <w:p>
-      <w:pPr>
-        <w:keepNext/>
-      </w:pPr>
       <w:r>
         <w:t>Dependencies: MT-5.4</w:t>
       </w:r>
     </w:p>
     <w:p>
-      <w:pPr/>
       <w:r>
         <w:rPr>
           <w:b/>
@@ -2086,7 +1836,6 @@
       </w:r>
     </w:p>
     <w:p>
-      <w:pPr/>
       <w:r>
         <w:rPr>
           <w:b/>
@@ -2098,7 +1847,6 @@
       </w:r>
     </w:p>
     <w:p>
-      <w:pPr/>
       <w:r>
         <w:rPr>
           <w:b/>
@@ -2112,7 +1860,6 @@
     <w:p>
       <w:pPr>
         <w:pStyle w:val="Heading1"/>
-        <w:pageBreakBefore/>
       </w:pPr>
       <w:r>
         <w:t>MT-6 - Shared brand and Windows Control</w:t>
@@ -2127,15 +1874,11 @@
       </w:r>
     </w:p>
     <w:p>
-      <w:pPr>
-        <w:keepNext/>
-      </w:pPr>
       <w:r>
         <w:t>Dependencies: MT-5.5</w:t>
       </w:r>
     </w:p>
     <w:p>
-      <w:pPr/>
       <w:r>
         <w:rPr>
           <w:b/>
@@ -2147,7 +1890,6 @@
       </w:r>
     </w:p>
     <w:p>
-      <w:pPr/>
       <w:r>
         <w:rPr>
           <w:b/>
@@ -2167,15 +1909,11 @@
       </w:r>
     </w:p>
     <w:p>
-      <w:pPr>
-        <w:keepNext/>
-      </w:pPr>
       <w:r>
         <w:t>Dependencies: MT-6.1</w:t>
       </w:r>
     </w:p>
     <w:p>
-      <w:pPr/>
       <w:r>
         <w:rPr>
           <w:b/>
@@ -2187,7 +1925,6 @@
       </w:r>
     </w:p>
     <w:p>
-      <w:pPr/>
       <w:r>
         <w:rPr>
           <w:b/>
@@ -2207,15 +1944,11 @@
       </w:r>
     </w:p>
     <w:p>
-      <w:pPr>
-        <w:keepNext/>
-      </w:pPr>
       <w:r>
         <w:t>Dependencies: MT-6.2</w:t>
       </w:r>
     </w:p>
     <w:p>
-      <w:pPr/>
       <w:r>
         <w:rPr>
           <w:b/>
@@ -2227,7 +1960,6 @@
       </w:r>
     </w:p>
     <w:p>
-      <w:pPr/>
       <w:r>
         <w:rPr>
           <w:b/>
@@ -2239,7 +1971,6 @@
       </w:r>
     </w:p>
     <w:p>
-      <w:pPr/>
       <w:r>
         <w:rPr>
           <w:b/>
@@ -2253,7 +1984,6 @@
     <w:p>
       <w:pPr>
         <w:pStyle w:val="Heading1"/>
-        <w:pageBreakBefore/>
       </w:pPr>
       <w:r>
         <w:t>MT-7 - Migration rehearsal and release readiness</w:t>
@@ -2268,15 +1998,11 @@
       </w:r>
     </w:p>
     <w:p>
-      <w:pPr>
-        <w:keepNext/>
-      </w:pPr>
       <w:r>
         <w:t>Dependencies: MT-6.3</w:t>
       </w:r>
     </w:p>
     <w:p>
-      <w:pPr/>
       <w:r>
         <w:rPr>
           <w:b/>
@@ -2288,7 +2014,6 @@
       </w:r>
     </w:p>
     <w:p>
-      <w:pPr/>
       <w:r>
         <w:rPr>
           <w:b/>
@@ -2308,15 +2033,11 @@
       </w:r>
     </w:p>
     <w:p>
-      <w:pPr>
-        <w:keepNext/>
-      </w:pPr>
       <w:r>
         <w:t>Dependencies: MT-7.1</w:t>
       </w:r>
     </w:p>
     <w:p>
-      <w:pPr/>
       <w:r>
         <w:rPr>
           <w:b/>
@@ -2324,11 +2045,10 @@
         <w:t>Scope:</w:t>
       </w:r>
       <w:r>
-        <w:t xml:space="preserve"> Audit authentication/authorization, Team Member RBAC/delegation/outlet boundaries, Admin/Customer session and recent-auth policy, uploads/content, secrets, payments, stock concurrency, queues, API/cache performance and recovery. For document delivery audit recipient/header validation, Gmail token isolation, canonical attachment integrity, wrong-outlet access, retries/templates/audit privacy and truthful WhatsApp states. For POS payments audit split-tender arithmetic, destination scope, sensitive card-data exclusion, fee/settlement separation, refund traceability and reconciliation tampering. Verify legal/privacy drafts against actual data, cookies/tracking, providers, retention/reset and public/private boundaries; review project ownership/licensing plus distributed dependency/asset notices without treating framework metadata as an application license. Audit every added domain, capability switching/history exceptions and continuous per-mode performance budgets under production-like builds.</w:t>
-      </w:r>
-    </w:p>
-    <w:p>
-      <w:pPr/>
+        <w:t xml:space="preserve"> Audit authentication/authorization, Team Member RBAC/delegation/outlet boundaries, Admin/Customer session and recent-auth policy, uploads/content, secrets, payments, stock concurrency, queues, API/cache performance and recovery. For document delivery audit recipient/header validation, Gmail token isolation, canonical attachment integrity, wrong-outlet access, retries/templates/audit privacy and truthful WhatsApp states. For POS payments audit split-tender arithmetic, destination scope, sensitive card-data exclusion, fee/settlement separation, refund traceability and reconciliation tampering. Verify legal/privacy drafts against actual data, cookies/tracking, providers, retention/reset and public/private boundaries; review project ownership/licensing plus distributed dependency/asset notices without treating framework metadata as an application license. Audit Software Product draft/public isolation, slug/redirect safety, release-note disclosure, product-specific policy accuracy, documentation-impact review and public route/API/cache/SEO behavior. Audit every added domain, capability switching/history exceptions and continuous per-mode performance budgets under production-like builds.</w:t>
+      </w:r>
+    </w:p>
+    <w:p>
       <w:r>
         <w:rPr>
           <w:b/>
@@ -2348,15 +2068,11 @@
       </w:r>
     </w:p>
     <w:p>
-      <w:pPr>
-        <w:keepNext/>
-      </w:pPr>
       <w:r>
         <w:t>Dependencies: MT-7.2</w:t>
       </w:r>
     </w:p>
     <w:p>
-      <w:pPr/>
       <w:r>
         <w:rPr>
           <w:b/>
@@ -2368,7 +2084,6 @@
       </w:r>
     </w:p>
     <w:p>
-      <w:pPr/>
       <w:r>
         <w:rPr>
           <w:b/>
@@ -2388,15 +2103,11 @@
       </w:r>
     </w:p>
     <w:p>
-      <w:pPr>
-        <w:keepNext/>
-      </w:pPr>
       <w:r>
         <w:t>Dependencies: MT-7.3</w:t>
       </w:r>
     </w:p>
     <w:p>
-      <w:pPr/>
       <w:r>
         <w:rPr>
           <w:b/>
@@ -2408,7 +2119,6 @@
       </w:r>
     </w:p>
     <w:p>
-      <w:pPr/>
       <w:r>
         <w:rPr>
           <w:b/>
@@ -2428,15 +2138,11 @@
       </w:r>
     </w:p>
     <w:p>
-      <w:pPr>
-        <w:keepNext/>
-      </w:pPr>
       <w:r>
         <w:t>Dependencies: MT-7.4</w:t>
       </w:r>
     </w:p>
     <w:p>
-      <w:pPr/>
       <w:r>
         <w:rPr>
           <w:b/>
@@ -2444,11 +2150,10 @@
         <w:t>Scope:</w:t>
       </w:r>
       <w:r>
-        <w:t xml:space="preserve"> Close every valid requirement in the complete source-to-target register with fresh target evidence and independently run operational journeys. Close the addendum and consolidated-requirement traceability as well as original source parity; priorities and optional enablement do not waive implementation gates. Include Invoice/Warranty no-auto-download, Preview/Save PDF/Print/safe Email/assisted WhatsApp/history; POS Cash/Card/Mobile Wallet/Bank Transfer, split tender, cash change, destination authorization, Day Closing, payment mix/fees/refund reconciliation; Website fixed-four-channel regression; and legal-policy/licensing/notice acceptance.</w:t>
-      </w:r>
-    </w:p>
-    <w:p>
-      <w:pPr/>
+        <w:t xml:space="preserve"> Close every valid requirement in the complete source-to-target register with fresh target evidence and independently run operational journeys. Close the addendum, consolidated-requirement and software-product-publishing traceability as well as original source parity; priorities and optional enablement do not waive implementation gates. Include Invoice/Warranty no-auto-download, Preview/Save PDF/Print/safe Email/assisted WhatsApp/history; POS Cash/Card/Mobile Wallet/Bank Transfer, split tender, cash change, destination authorization, Day Closing, payment mix/fees/refund reconciliation; Website fixed-four-channel regression; Software Product create/preview/publish/update/rollback and public route family; and legal-policy/licensing/notice acceptance.</w:t>
+      </w:r>
+    </w:p>
+    <w:p>
       <w:r>
         <w:rPr>
           <w:b/>
@@ -2456,7 +2161,7 @@
         <w:t>Acceptance:</w:t>
       </w:r>
       <w:r>
-        <w:t xml:space="preserve"> Pest/PHPUnit, MySQL, builds, Playwright, POS/Website/Control, documentation and recovery gates pass; no silent feature loss or unreviewed duplicate master remains. Every approved addendum and consolidated-requirement clause has fresh backend/UI/API/performance evidence or an explicit unresolved gap. Policy coverage matches final product behavior with approved versions/effective dates and working footer links; Privacy claims match real data flows; software ownership and third-party notice posture are deliberate.</w:t>
+        <w:t xml:space="preserve"> Pest/PHPUnit, MySQL, builds, Playwright, POS/Website/Control, documentation and recovery gates pass; no silent feature loss or unreviewed duplicate master remains. Every approved addendum, consolidated-requirement and software-product-publishing clause has fresh backend/UI/API/performance evidence or an explicit unresolved gap. Policy coverage matches final product behavior with approved versions/effective dates and working footer/product links; Privacy claims match real data flows; software ownership and third-party notice posture are deliberate. At least the mobiST POS seed/reference set is reconciled through the reusable Software Product workflow without hard-coded one-off implementation.</w:t>
       </w:r>
     </w:p>
     <w:p>
@@ -2468,15 +2173,11 @@
       </w:r>
     </w:p>
     <w:p>
-      <w:pPr>
-        <w:keepNext/>
-      </w:pPr>
       <w:r>
         <w:t>Dependencies: MT-7.5</w:t>
       </w:r>
     </w:p>
     <w:p>
-      <w:pPr/>
       <w:r>
         <w:rPr>
           <w:b/>
@@ -2484,11 +2185,10 @@
         <w:t>Scope:</w:t>
       </w:r>
       <w:r>
-        <w:t xml:space="preserve"> Create the complete role-aware mobiST Tech operational user manual from the final verified product, including current safe UI screenshots and coverage of POS, payments/reconciliation, documents/Email/WhatsApp, inventory/procurement, warranty, cash closing, Website CMS/legal content/Digital Services, integrations, backup/reset safety, mobiST Control and the customer Website. Produce canonical `docs/user-manual/USER_MANUAL.md`, verified same-content DOCX and PDF mirrors, and controlled screenshot assets.</w:t>
-      </w:r>
-    </w:p>
-    <w:p>
-      <w:pPr/>
+        <w:t xml:space="preserve"> Create the complete role-aware mobiST Tech operational user manual from the final verified product, including current safe UI screenshots and coverage of POS, payments/reconciliation, documents/Email/WhatsApp, inventory/procurement, warranty, cash closing, Website CMS/legal content/Digital Services, Software Product creation/version/publication workflows, integrations, backup/reset safety, mobiST Control and the customer Website. Produce canonical `docs/user-manual/USER_MANUAL.md`, verified same-content DOCX and PDF mirrors, and controlled screenshot assets.</w:t>
+      </w:r>
+    </w:p>
+    <w:p>
       <w:r>
         <w:rPr>
           <w:b/>
@@ -2500,7 +2200,6 @@
       </w:r>
     </w:p>
     <w:p>
-      <w:pPr/>
       <w:r>
         <w:rPr>
           <w:b/>
@@ -2514,7 +2213,6 @@
     <w:p>
       <w:pPr>
         <w:pStyle w:val="Heading1"/>
-        <w:pageBreakBefore/>
       </w:pPr>
       <w:r>
         <w:t>MT-8 - Final sign-off</w:t>
@@ -2529,15 +2227,11 @@
       </w:r>
     </w:p>
     <w:p>
-      <w:pPr>
-        <w:keepNext/>
-      </w:pPr>
       <w:r>
         <w:t>Dependencies: MT-7.6</w:t>
       </w:r>
     </w:p>
     <w:p>
-      <w:pPr/>
       <w:r>
         <w:rPr>
           <w:b/>
@@ -2545,11 +2239,10 @@
         <w:t>Scope:</w:t>
       </w:r>
       <w:r>
-        <w:t xml:space="preserve"> Independently audit the complete Goal and Preferences, requirement map, all completed-point claims, Git/code/data, migration/recovery, security, integrations, CI, documentation, HOLD register and source immutability. Include approved requirements addendum v1.1, the unified Admin/Google requirement, the Team Member/delegated-access/session-security requirement and the complete consolidated documents/payments/legal/manual requirement. Inspect actual Invoice/Warranty UX and canonical delivery, Gmail attachments, truthful WhatsApp, POS payment methods/destinations/split tender/refunds/settlement, Website fixed channels, Day Closing/payment mix, legal/privacy/service-pricing consistency, project ownership/third-party notices and the final User Manual.</w:t>
-      </w:r>
-    </w:p>
-    <w:p>
-      <w:pPr/>
+        <w:t xml:space="preserve"> Independently audit the complete Goal and Preferences, requirement map, all completed-point claims, Git/code/data, migration/recovery, security, integrations, CI, documentation, HOLD register and source immutability. Include approved requirements addendum v1.1, the unified Admin/Google requirement, the Team Member/delegated-access/session-security requirement, the complete consolidated documents/payments/legal/manual requirement and the software product publishing requirement. Inspect actual Invoice/Warranty UX and canonical delivery, Gmail attachments, truthful WhatsApp, POS payment methods/destinations/split tender/refunds/settlement, Website fixed channels, Software Product Admin/publication/version routes, Day Closing/payment mix, legal/privacy/service-pricing consistency, project ownership/third-party notices and the final User Manual.</w:t>
+      </w:r>
+    </w:p>
+    <w:p>
       <w:r>
         <w:rPr>
           <w:b/>
@@ -2561,7 +2254,6 @@
       </w:r>
     </w:p>
     <w:p>
-      <w:pPr/>
       <w:r>
         <w:rPr>
           <w:b/>
@@ -2575,38 +2267,32 @@
     <w:p>
       <w:pPr>
         <w:pStyle w:val="Heading1"/>
-        <w:pageBreakBefore/>
       </w:pPr>
       <w:r>
         <w:t>HOLD / Deferred register</w:t>
       </w:r>
     </w:p>
     <w:p>
-      <w:pPr/>
       <w:r>
         <w:t>H-01 - Live production deployment, domains, TLS activation and real customer-data cutover require separate explicit authorization and target access. MT-7.1/MT-7.4 isolated rehearsal/readiness remains in scope.</w:t>
       </w:r>
     </w:p>
     <w:p>
-      <w:pPr/>
       <w:r>
         <w:t>H-02 - JazzCash/Easypaisa authentic sandbox acceptance requires verified official contracts and valid sandbox credentials. Card requires an approved hosted/tokenized processor. Live activation is a separate HOLD. Existing safe disabled-provider behavior and COD migration remain required; fake acceptance is prohibited.</w:t>
       </w:r>
     </w:p>
     <w:p>
-      <w:pPr/>
       <w:r>
         <w:t>H-03 - Source business-data export, destructive restore and production reset require authorization for the sensitive dataset and exact target before access/use. Synthetic/sanitized isolated migration tests may continue. Source repository/database writes are prohibited in this project.</w:t>
       </w:r>
     </w:p>
     <w:p>
-      <w:pPr/>
-      <w:r>
-        <w:t>H-04 - Addendum v1.1 is approved scope, not a HOLD. Arbitrary new top-level category semantics and unrelated features beyond Goal/Preferences/addendum remain outside scope. Marketplace, consumer lending, general subscription billing, arbitrary multi-currency accounting, full ERP/general ledger and unnecessary microservices remain excluded unless separately approved. Existing protected IDs/business rules must be preserved.</w:t>
-      </w:r>
-    </w:p>
-    <w:p>
-      <w:pPr/>
+      <w:r>
+        <w:t>H-04 - Addendum v1.1 and the approved software product publishing requirement are approved scope, not a HOLD. Arbitrary new top-level category semantics and unrelated features beyond Goal/Preferences/approved requirements remain outside scope. Marketplace, consumer lending, general subscription billing, arbitrary multi-currency accounting, full ERP/general ledger and unnecessary microservices remain excluded unless separately approved. Existing protected IDs/business rules must be preserved.</w:t>
+      </w:r>
+    </w:p>
+    <w:p>
       <w:r>
         <w:t>HOLD/dependency evidence is explicitly reviewed in FINAL-AUDIT. A required capability cannot be left unimplemented and then relabeled Deferred merely to complete the project.</w:t>
       </w:r>

</xml_diff>

<commit_message>
checkpoint(mt-7.5): adopt fresh-business scope and unblock first outlet owner
</commit_message>
<xml_diff>
--- a/docs/PROJECT_IMPLEMENTATION_ROADMAP.docx
+++ b/docs/PROJECT_IMPLEMENTATION_ROADMAP.docx
@@ -11,81 +11,97 @@
       </w:r>
     </w:p>
     <w:p>
-      <w:r>
-        <w:t>Version: 1.10 | Date: 2026-09-06</w:t>
-      </w:r>
-    </w:p>
-    <w:p>
+      <w:pPr/>
+      <w:r>
+        <w:t>Version: 1.11 | Date: 2026-09-20</w:t>
+      </w:r>
+    </w:p>
+    <w:p>
+      <w:pPr/>
       <w:r>
         <w:t>Canonical Goal: docs/PROJECT_GOAL.md</w:t>
       </w:r>
     </w:p>
     <w:p>
+      <w:pPr/>
       <w:r>
         <w:t>Binding Preferences: docs/PROJECT_PREFERENCES.md</w:t>
       </w:r>
     </w:p>
     <w:p>
+      <w:pPr/>
       <w:r>
         <w:t>Approved scope expansion: docs/PROJECT_REQUIREMENTS_ADDENDUM_v1.1.md</w:t>
       </w:r>
     </w:p>
     <w:p>
+      <w:pPr/>
       <w:r>
         <w:t>Addendum traceability: docs/REQUIREMENTS_ADDENDUM_v1.1_RECONCILIATION.md</w:t>
       </w:r>
     </w:p>
     <w:p>
+      <w:pPr/>
       <w:r>
         <w:t>Approved superseding requirement: docs/PROJECT_REQUIREMENTS_UNIFIED_ADMIN_GOOGLE_v1.0.md</w:t>
       </w:r>
     </w:p>
     <w:p>
+      <w:pPr/>
       <w:r>
         <w:t>Superseding reconciliation: docs/remediation/RECONCILIATION.md</w:t>
       </w:r>
     </w:p>
     <w:p>
+      <w:pPr/>
       <w:r>
         <w:t>Approved Team Member/session requirement: docs/PROJECT_REQUIREMENTS_TEAM_MEMBERS_SESSION_POLICY_v1.0.md</w:t>
       </w:r>
     </w:p>
     <w:p>
+      <w:pPr/>
       <w:r>
         <w:t>Team Member/session reconciliation: docs/team-members/RECONCILIATION.md</w:t>
       </w:r>
     </w:p>
     <w:p>
+      <w:pPr/>
       <w:r>
         <w:t>Approved consolidated documents/payments/legal/manual requirement: docs/PROJECT_REQUIREMENTS_DOCUMENTS_PAYMENTS_LEGAL_MANUAL_v1.0.md</w:t>
       </w:r>
     </w:p>
     <w:p>
+      <w:pPr/>
       <w:r>
         <w:t>Consolidated requirement reconciliation: docs/consolidated-requirements/RECONCILIATION.md</w:t>
       </w:r>
     </w:p>
     <w:p>
+      <w:pPr/>
       <w:r>
         <w:t>Approved software product publishing requirement: docs/PROJECT_REQUIREMENTS_SOFTWARE_PRODUCT_PUBLISHING_v1.0.md</w:t>
       </w:r>
     </w:p>
     <w:p>
+      <w:pPr/>
       <w:r>
         <w:t>Software publishing reconciliation: docs/software-publishing/RECONCILIATION.md</w:t>
       </w:r>
     </w:p>
     <w:p>
+      <w:pPr/>
       <w:r>
         <w:t>Source of Truth: docs/PROJECT_SOURCE_OF_TRUTH.md</w:t>
       </w:r>
     </w:p>
     <w:p>
+      <w:pPr/>
       <w:r>
         <w:t>Status ledger: docs/PROJECT_IMPLEMENTATION_STATUS.md</w:t>
       </w:r>
     </w:p>
     <w:p>
+      <w:pPr/>
       <w:r>
         <w:t>Word mirror: docs/PROJECT_IMPLEMENTATION_ROADMAP.docx</w:t>
       </w:r>
@@ -99,31 +115,37 @@
       </w:r>
     </w:p>
     <w:p>
+      <w:pPr/>
       <w:r>
         <w:t>This is the single active structural roadmap for the controlled migration. Live Completed/In Progress/Pending state, last/current/next position and progress counts are recorded only in `docs/PROJECT_IMPLEMENTATION_STATUS.md`. Each Proceed executes one point through its required gates and intended new-repository commit/push, then stops. Dependencies are ordered; point IDs and exact titles remain stable.</w:t>
       </w:r>
     </w:p>
     <w:p>
-      <w:r>
-        <w:t>The original POS/Website folders, remotes and data are immutable references. All implementation, copied-source tests and migration rehearsals must run under `C:\mobisttech` or isolated approved target resources. Do not run tests/builds against the originals. Do not replace the single shared Laravel/MySQL authority with duplicate authoritative databases.</w:t>
-      </w:r>
-    </w:p>
-    <w:p>
+      <w:pPr/>
+      <w:r>
+        <w:t>The original POS/Website folders, remotes and data are immutable read-only FUNCTIONAL references only; their business rows are not migration inputs or acceptance dependencies. All implementation and newly generated synthetic tests run under `C:\mobisttech` or isolated approved target resources. Do not run tests/builds against or modify the originals. Do not replace the shared Laravel/MySQL business authority with duplicate authoritative databases.</w:t>
+      </w:r>
+    </w:p>
+    <w:p>
+      <w:pPr/>
       <w:r>
         <w:t>Every point includes applicable focused/full tests, parity evidence, secrets review, source-boundary checks and ledger updates. Routine execution progress updates the ledger only and must not edit this roadmap or regenerate its DOCX. Regenerate/verify the DOCX only when roadmap structure/content materially changes. MT-1.1 detailed inventory may refine this roadmap from evidence, but valid functionality must not be silently dropped and completed IDs must not be renumbered.</w:t>
       </w:r>
     </w:p>
     <w:p>
+      <w:pPr/>
       <w:r>
         <w:t>Goal, Preferences, approved addendum v1.1, the approved unified Admin/Google integrations superseding requirement, the approved Team Member/session security requirement, the approved consolidated documents/payments/legal/manual requirement and the approved software product publishing requirement apply. For working features, assess reuse/adapt/refactor/migrate before rewrite; rewrite requires a verified reason. Verify parity, data consistency, integration and regression incrementally rather than using a big-bang rewrite. Prefer conventional solutions, justified Redis roles and a Laravel-only business backend; do not introduce a parallel Node/Express business backend. Record stack deviations only for verified unavoidable blockers and never silently resolve a Goal conflict.</w:t>
       </w:r>
     </w:p>
     <w:p>
+      <w:pPr/>
       <w:r>
         <w:t>Roman Urdu is limited to assistant chat/UI communication. Git-tracked project documentation and technical artifacts use standard English unless the user explicitly requests another language for a specific artifact. User-supplied Goal/Preferences remain byte-preserved in their original language/content.</w:t>
       </w:r>
     </w:p>
     <w:p>
+      <w:pPr/>
       <w:r>
         <w:t>Addendum v1.1 adds dependency-ordered points without renumbering existing IDs. Follow document order and explicit dependencies, not numeric ID sorting. P1/P2/P3 are implementation priorities within dependency constraints, not permission to defer required work. Optional loyalty/repair/booking features must be implemented with disablement; they are not silently removed from scope. Full clause traceability is in docs/REQUIREMENTS_ADDENDUM_v1.1_RECONCILIATION.md.</w:t>
       </w:r>
@@ -145,11 +167,15 @@
       </w:r>
     </w:p>
     <w:p>
+      <w:pPr>
+        <w:keepNext/>
+      </w:pPr>
       <w:r>
         <w:t>Dependencies: None</w:t>
       </w:r>
     </w:p>
     <w:p>
+      <w:pPr/>
       <w:r>
         <w:rPr>
           <w:b/>
@@ -161,6 +187,7 @@
       </w:r>
     </w:p>
     <w:p>
+      <w:pPr/>
       <w:r>
         <w:rPr>
           <w:b/>
@@ -172,6 +199,7 @@
       </w:r>
     </w:p>
     <w:p>
+      <w:pPr/>
       <w:r>
         <w:rPr>
           <w:b/>
@@ -185,6 +213,7 @@
     <w:p>
       <w:pPr>
         <w:pStyle w:val="Heading1"/>
+        <w:pageBreakBefore/>
       </w:pPr>
       <w:r>
         <w:t>MT-1 - Migration inventory and design</w:t>
@@ -199,11 +228,15 @@
       </w:r>
     </w:p>
     <w:p>
+      <w:pPr>
+        <w:keepNext/>
+      </w:pPr>
       <w:r>
         <w:t>Dependencies: MT-0.1</w:t>
       </w:r>
     </w:p>
     <w:p>
+      <w:pPr/>
       <w:r>
         <w:rPr>
           <w:b/>
@@ -215,6 +248,7 @@
       </w:r>
     </w:p>
     <w:p>
+      <w:pPr/>
       <w:r>
         <w:rPr>
           <w:b/>
@@ -226,6 +260,7 @@
       </w:r>
     </w:p>
     <w:p>
+      <w:pPr/>
       <w:r>
         <w:t>Evidence: docs/migration/FEATURE_PARITY_REGISTER.md; isolated source tests passed, originals unchanged, target parity pending.</w:t>
       </w:r>
@@ -239,11 +274,15 @@
       </w:r>
     </w:p>
     <w:p>
+      <w:pPr>
+        <w:keepNext/>
+      </w:pPr>
       <w:r>
         <w:t>Dependencies: MT-1.1</w:t>
       </w:r>
     </w:p>
     <w:p>
+      <w:pPr/>
       <w:r>
         <w:rPr>
           <w:b/>
@@ -255,6 +294,7 @@
       </w:r>
     </w:p>
     <w:p>
+      <w:pPr/>
       <w:r>
         <w:rPr>
           <w:b/>
@@ -274,11 +314,15 @@
       </w:r>
     </w:p>
     <w:p>
+      <w:pPr>
+        <w:keepNext/>
+      </w:pPr>
       <w:r>
         <w:t>Dependencies: MT-1.2</w:t>
       </w:r>
     </w:p>
     <w:p>
+      <w:pPr/>
       <w:r>
         <w:rPr>
           <w:b/>
@@ -290,6 +334,7 @@
       </w:r>
     </w:p>
     <w:p>
+      <w:pPr/>
       <w:r>
         <w:rPr>
           <w:b/>
@@ -301,6 +346,7 @@
       </w:r>
     </w:p>
     <w:p>
+      <w:pPr/>
       <w:r>
         <w:rPr>
           <w:b/>
@@ -314,6 +360,7 @@
     <w:p>
       <w:pPr>
         <w:pStyle w:val="Heading1"/>
+        <w:pageBreakBefore/>
       </w:pPr>
       <w:r>
         <w:t>MT-2 - Shared backend and transactional migration</w:t>
@@ -328,11 +375,15 @@
       </w:r>
     </w:p>
     <w:p>
+      <w:pPr>
+        <w:keepNext/>
+      </w:pPr>
       <w:r>
         <w:t>Dependencies: MT-1.3</w:t>
       </w:r>
     </w:p>
     <w:p>
+      <w:pPr/>
       <w:r>
         <w:rPr>
           <w:b/>
@@ -344,6 +395,7 @@
       </w:r>
     </w:p>
     <w:p>
+      <w:pPr/>
       <w:r>
         <w:rPr>
           <w:b/>
@@ -363,11 +415,15 @@
       </w:r>
     </w:p>
     <w:p>
+      <w:pPr>
+        <w:keepNext/>
+      </w:pPr>
       <w:r>
         <w:t>Dependencies: MT-2.1</w:t>
       </w:r>
     </w:p>
     <w:p>
+      <w:pPr/>
       <w:r>
         <w:rPr>
           <w:b/>
@@ -379,6 +435,7 @@
       </w:r>
     </w:p>
     <w:p>
+      <w:pPr/>
       <w:r>
         <w:rPr>
           <w:b/>
@@ -398,11 +455,15 @@
       </w:r>
     </w:p>
     <w:p>
+      <w:pPr>
+        <w:keepNext/>
+      </w:pPr>
       <w:r>
         <w:t>Dependencies: MT-2.2</w:t>
       </w:r>
     </w:p>
     <w:p>
+      <w:pPr/>
       <w:r>
         <w:rPr>
           <w:b/>
@@ -414,6 +475,7 @@
       </w:r>
     </w:p>
     <w:p>
+      <w:pPr/>
       <w:r>
         <w:rPr>
           <w:b/>
@@ -433,11 +495,15 @@
       </w:r>
     </w:p>
     <w:p>
+      <w:pPr>
+        <w:keepNext/>
+      </w:pPr>
       <w:r>
         <w:t>Dependencies: MT-2.3</w:t>
       </w:r>
     </w:p>
     <w:p>
+      <w:pPr/>
       <w:r>
         <w:rPr>
           <w:b/>
@@ -449,6 +515,7 @@
       </w:r>
     </w:p>
     <w:p>
+      <w:pPr/>
       <w:r>
         <w:rPr>
           <w:b/>
@@ -468,11 +535,15 @@
       </w:r>
     </w:p>
     <w:p>
+      <w:pPr>
+        <w:keepNext/>
+      </w:pPr>
       <w:r>
         <w:t>Dependencies: MT-2.4</w:t>
       </w:r>
     </w:p>
     <w:p>
+      <w:pPr/>
       <w:r>
         <w:rPr>
           <w:b/>
@@ -484,6 +555,7 @@
       </w:r>
     </w:p>
     <w:p>
+      <w:pPr/>
       <w:r>
         <w:rPr>
           <w:b/>
@@ -503,11 +575,15 @@
       </w:r>
     </w:p>
     <w:p>
+      <w:pPr>
+        <w:keepNext/>
+      </w:pPr>
       <w:r>
         <w:t>Dependencies: MT-2.8</w:t>
       </w:r>
     </w:p>
     <w:p>
+      <w:pPr/>
       <w:r>
         <w:rPr>
           <w:b/>
@@ -519,6 +595,7 @@
       </w:r>
     </w:p>
     <w:p>
+      <w:pPr/>
       <w:r>
         <w:rPr>
           <w:b/>
@@ -538,11 +615,15 @@
       </w:r>
     </w:p>
     <w:p>
+      <w:pPr>
+        <w:keepNext/>
+      </w:pPr>
       <w:r>
         <w:t>Dependencies: MT-2.5</w:t>
       </w:r>
     </w:p>
     <w:p>
+      <w:pPr/>
       <w:r>
         <w:rPr>
           <w:b/>
@@ -554,6 +635,7 @@
       </w:r>
     </w:p>
     <w:p>
+      <w:pPr/>
       <w:r>
         <w:rPr>
           <w:b/>
@@ -573,11 +655,15 @@
       </w:r>
     </w:p>
     <w:p>
+      <w:pPr>
+        <w:keepNext/>
+      </w:pPr>
       <w:r>
         <w:t>Dependencies: MT-2.6</w:t>
       </w:r>
     </w:p>
     <w:p>
+      <w:pPr/>
       <w:r>
         <w:rPr>
           <w:b/>
@@ -589,6 +675,7 @@
       </w:r>
     </w:p>
     <w:p>
+      <w:pPr/>
       <w:r>
         <w:rPr>
           <w:b/>
@@ -608,11 +695,15 @@
       </w:r>
     </w:p>
     <w:p>
+      <w:pPr>
+        <w:keepNext/>
+      </w:pPr>
       <w:r>
         <w:t>Dependencies: MT-2.18</w:t>
       </w:r>
     </w:p>
     <w:p>
+      <w:pPr/>
       <w:r>
         <w:rPr>
           <w:b/>
@@ -624,6 +715,7 @@
       </w:r>
     </w:p>
     <w:p>
+      <w:pPr/>
       <w:r>
         <w:rPr>
           <w:b/>
@@ -643,11 +735,15 @@
       </w:r>
     </w:p>
     <w:p>
+      <w:pPr>
+        <w:keepNext/>
+      </w:pPr>
       <w:r>
         <w:t>Dependencies: MT-2.7</w:t>
       </w:r>
     </w:p>
     <w:p>
+      <w:pPr/>
       <w:r>
         <w:rPr>
           <w:b/>
@@ -659,6 +755,7 @@
       </w:r>
     </w:p>
     <w:p>
+      <w:pPr/>
       <w:r>
         <w:rPr>
           <w:b/>
@@ -678,11 +775,15 @@
       </w:r>
     </w:p>
     <w:p>
+      <w:pPr>
+        <w:keepNext/>
+      </w:pPr>
       <w:r>
         <w:t>Dependencies: MT-2.19</w:t>
       </w:r>
     </w:p>
     <w:p>
+      <w:pPr/>
       <w:r>
         <w:rPr>
           <w:b/>
@@ -694,6 +795,7 @@
       </w:r>
     </w:p>
     <w:p>
+      <w:pPr/>
       <w:r>
         <w:rPr>
           <w:b/>
@@ -713,11 +815,15 @@
       </w:r>
     </w:p>
     <w:p>
+      <w:pPr>
+        <w:keepNext/>
+      </w:pPr>
       <w:r>
         <w:t>Dependencies: MT-2.9</w:t>
       </w:r>
     </w:p>
     <w:p>
+      <w:pPr/>
       <w:r>
         <w:rPr>
           <w:b/>
@@ -729,6 +835,7 @@
       </w:r>
     </w:p>
     <w:p>
+      <w:pPr/>
       <w:r>
         <w:rPr>
           <w:b/>
@@ -748,11 +855,15 @@
       </w:r>
     </w:p>
     <w:p>
+      <w:pPr>
+        <w:keepNext/>
+      </w:pPr>
       <w:r>
         <w:t>Dependencies: MT-2.10</w:t>
       </w:r>
     </w:p>
     <w:p>
+      <w:pPr/>
       <w:r>
         <w:rPr>
           <w:b/>
@@ -764,6 +875,7 @@
       </w:r>
     </w:p>
     <w:p>
+      <w:pPr/>
       <w:r>
         <w:rPr>
           <w:b/>
@@ -783,11 +895,15 @@
       </w:r>
     </w:p>
     <w:p>
+      <w:pPr>
+        <w:keepNext/>
+      </w:pPr>
       <w:r>
         <w:t>Dependencies: MT-2.11</w:t>
       </w:r>
     </w:p>
     <w:p>
+      <w:pPr/>
       <w:r>
         <w:rPr>
           <w:b/>
@@ -799,6 +915,7 @@
       </w:r>
     </w:p>
     <w:p>
+      <w:pPr/>
       <w:r>
         <w:rPr>
           <w:b/>
@@ -818,11 +935,15 @@
       </w:r>
     </w:p>
     <w:p>
+      <w:pPr>
+        <w:keepNext/>
+      </w:pPr>
       <w:r>
         <w:t>Dependencies: MT-2.20</w:t>
       </w:r>
     </w:p>
     <w:p>
+      <w:pPr/>
       <w:r>
         <w:rPr>
           <w:b/>
@@ -834,6 +955,7 @@
       </w:r>
     </w:p>
     <w:p>
+      <w:pPr/>
       <w:r>
         <w:rPr>
           <w:b/>
@@ -853,11 +975,15 @@
       </w:r>
     </w:p>
     <w:p>
+      <w:pPr>
+        <w:keepNext/>
+      </w:pPr>
       <w:r>
         <w:t>Dependencies: MT-2.12</w:t>
       </w:r>
     </w:p>
     <w:p>
+      <w:pPr/>
       <w:r>
         <w:rPr>
           <w:b/>
@@ -869,6 +995,7 @@
       </w:r>
     </w:p>
     <w:p>
+      <w:pPr/>
       <w:r>
         <w:rPr>
           <w:b/>
@@ -888,11 +1015,15 @@
       </w:r>
     </w:p>
     <w:p>
+      <w:pPr>
+        <w:keepNext/>
+      </w:pPr>
       <w:r>
         <w:t>Dependencies: MT-2.13</w:t>
       </w:r>
     </w:p>
     <w:p>
+      <w:pPr/>
       <w:r>
         <w:rPr>
           <w:b/>
@@ -904,6 +1035,7 @@
       </w:r>
     </w:p>
     <w:p>
+      <w:pPr/>
       <w:r>
         <w:rPr>
           <w:b/>
@@ -923,11 +1055,15 @@
       </w:r>
     </w:p>
     <w:p>
+      <w:pPr>
+        <w:keepNext/>
+      </w:pPr>
       <w:r>
         <w:t>Dependencies: MT-2.14</w:t>
       </w:r>
     </w:p>
     <w:p>
+      <w:pPr/>
       <w:r>
         <w:rPr>
           <w:b/>
@@ -939,6 +1075,7 @@
       </w:r>
     </w:p>
     <w:p>
+      <w:pPr/>
       <w:r>
         <w:rPr>
           <w:b/>
@@ -958,11 +1095,15 @@
       </w:r>
     </w:p>
     <w:p>
+      <w:pPr>
+        <w:keepNext/>
+      </w:pPr>
       <w:r>
         <w:t>Dependencies: MT-2.17</w:t>
       </w:r>
     </w:p>
     <w:p>
+      <w:pPr/>
       <w:r>
         <w:rPr>
           <w:b/>
@@ -974,6 +1115,7 @@
       </w:r>
     </w:p>
     <w:p>
+      <w:pPr/>
       <w:r>
         <w:rPr>
           <w:b/>
@@ -993,11 +1135,15 @@
       </w:r>
     </w:p>
     <w:p>
+      <w:pPr>
+        <w:keepNext/>
+      </w:pPr>
       <w:r>
         <w:t>Dependencies: MT-2.15</w:t>
       </w:r>
     </w:p>
     <w:p>
+      <w:pPr/>
       <w:r>
         <w:rPr>
           <w:b/>
@@ -1009,6 +1155,7 @@
       </w:r>
     </w:p>
     <w:p>
+      <w:pPr/>
       <w:r>
         <w:rPr>
           <w:b/>
@@ -1020,6 +1167,7 @@
       </w:r>
     </w:p>
     <w:p>
+      <w:pPr/>
       <w:r>
         <w:rPr>
           <w:b/>
@@ -1033,6 +1181,7 @@
     <w:p>
       <w:pPr>
         <w:pStyle w:val="Heading1"/>
+        <w:pageBreakBefore/>
       </w:pPr>
       <w:r>
         <w:t>MT-3 - Administration, content and REST APIs</w:t>
@@ -1047,11 +1196,15 @@
       </w:r>
     </w:p>
     <w:p>
+      <w:pPr>
+        <w:keepNext/>
+      </w:pPr>
       <w:r>
         <w:t>Dependencies: MT-2.16</w:t>
       </w:r>
     </w:p>
     <w:p>
+      <w:pPr/>
       <w:r>
         <w:rPr>
           <w:b/>
@@ -1063,6 +1216,7 @@
       </w:r>
     </w:p>
     <w:p>
+      <w:pPr/>
       <w:r>
         <w:rPr>
           <w:b/>
@@ -1082,11 +1236,15 @@
       </w:r>
     </w:p>
     <w:p>
+      <w:pPr>
+        <w:keepNext/>
+      </w:pPr>
       <w:r>
         <w:t>Dependencies: MT-3.1</w:t>
       </w:r>
     </w:p>
     <w:p>
+      <w:pPr/>
       <w:r>
         <w:rPr>
           <w:b/>
@@ -1098,6 +1256,7 @@
       </w:r>
     </w:p>
     <w:p>
+      <w:pPr/>
       <w:r>
         <w:rPr>
           <w:b/>
@@ -1117,11 +1276,15 @@
       </w:r>
     </w:p>
     <w:p>
+      <w:pPr>
+        <w:keepNext/>
+      </w:pPr>
       <w:r>
         <w:t>Dependencies: MT-3.2</w:t>
       </w:r>
     </w:p>
     <w:p>
+      <w:pPr/>
       <w:r>
         <w:rPr>
           <w:b/>
@@ -1133,6 +1296,7 @@
       </w:r>
     </w:p>
     <w:p>
+      <w:pPr/>
       <w:r>
         <w:rPr>
           <w:b/>
@@ -1152,11 +1316,15 @@
       </w:r>
     </w:p>
     <w:p>
+      <w:pPr>
+        <w:keepNext/>
+      </w:pPr>
       <w:r>
         <w:t>Dependencies: MT-3.7</w:t>
       </w:r>
     </w:p>
     <w:p>
+      <w:pPr/>
       <w:r>
         <w:rPr>
           <w:b/>
@@ -1168,6 +1336,7 @@
       </w:r>
     </w:p>
     <w:p>
+      <w:pPr/>
       <w:r>
         <w:rPr>
           <w:b/>
@@ -1187,11 +1356,15 @@
       </w:r>
     </w:p>
     <w:p>
+      <w:pPr>
+        <w:keepNext/>
+      </w:pPr>
       <w:r>
         <w:t>Dependencies: MT-3.5</w:t>
       </w:r>
     </w:p>
     <w:p>
+      <w:pPr/>
       <w:r>
         <w:rPr>
           <w:b/>
@@ -1203,6 +1376,7 @@
       </w:r>
     </w:p>
     <w:p>
+      <w:pPr/>
       <w:r>
         <w:rPr>
           <w:b/>
@@ -1222,11 +1396,15 @@
       </w:r>
     </w:p>
     <w:p>
+      <w:pPr>
+        <w:keepNext/>
+      </w:pPr>
       <w:r>
         <w:t>Dependencies: MT-3.6</w:t>
       </w:r>
     </w:p>
     <w:p>
+      <w:pPr/>
       <w:r>
         <w:rPr>
           <w:b/>
@@ -1238,6 +1416,7 @@
       </w:r>
     </w:p>
     <w:p>
+      <w:pPr/>
       <w:r>
         <w:rPr>
           <w:b/>
@@ -1257,11 +1436,15 @@
       </w:r>
     </w:p>
     <w:p>
+      <w:pPr>
+        <w:keepNext/>
+      </w:pPr>
       <w:r>
         <w:t>Dependencies: MT-3.9</w:t>
       </w:r>
     </w:p>
     <w:p>
+      <w:pPr/>
       <w:r>
         <w:rPr>
           <w:b/>
@@ -1273,6 +1456,7 @@
       </w:r>
     </w:p>
     <w:p>
+      <w:pPr/>
       <w:r>
         <w:rPr>
           <w:b/>
@@ -1292,11 +1476,15 @@
       </w:r>
     </w:p>
     <w:p>
+      <w:pPr>
+        <w:keepNext/>
+      </w:pPr>
       <w:r>
         <w:t>Dependencies: MT-3.3</w:t>
       </w:r>
     </w:p>
     <w:p>
+      <w:pPr/>
       <w:r>
         <w:rPr>
           <w:b/>
@@ -1308,6 +1496,7 @@
       </w:r>
     </w:p>
     <w:p>
+      <w:pPr/>
       <w:r>
         <w:rPr>
           <w:b/>
@@ -1327,11 +1516,15 @@
       </w:r>
     </w:p>
     <w:p>
+      <w:pPr>
+        <w:keepNext/>
+      </w:pPr>
       <w:r>
         <w:t>Dependencies: MT-3.8</w:t>
       </w:r>
     </w:p>
     <w:p>
+      <w:pPr/>
       <w:r>
         <w:rPr>
           <w:b/>
@@ -1343,6 +1536,7 @@
       </w:r>
     </w:p>
     <w:p>
+      <w:pPr/>
       <w:r>
         <w:rPr>
           <w:b/>
@@ -1354,6 +1548,7 @@
       </w:r>
     </w:p>
     <w:p>
+      <w:pPr/>
       <w:r>
         <w:rPr>
           <w:b/>
@@ -1367,6 +1562,7 @@
     <w:p>
       <w:pPr>
         <w:pStyle w:val="Heading1"/>
+        <w:pageBreakBefore/>
       </w:pPr>
       <w:r>
         <w:t>MT-4 - React POS and administration</w:t>
@@ -1381,11 +1577,15 @@
       </w:r>
     </w:p>
     <w:p>
+      <w:pPr>
+        <w:keepNext/>
+      </w:pPr>
       <w:r>
         <w:t>Dependencies: MT-3.4</w:t>
       </w:r>
     </w:p>
     <w:p>
+      <w:pPr/>
       <w:r>
         <w:rPr>
           <w:b/>
@@ -1397,6 +1597,7 @@
       </w:r>
     </w:p>
     <w:p>
+      <w:pPr/>
       <w:r>
         <w:rPr>
           <w:b/>
@@ -1416,11 +1617,15 @@
       </w:r>
     </w:p>
     <w:p>
+      <w:pPr>
+        <w:keepNext/>
+      </w:pPr>
       <w:r>
         <w:t>Dependencies: MT-4.1</w:t>
       </w:r>
     </w:p>
     <w:p>
+      <w:pPr/>
       <w:r>
         <w:rPr>
           <w:b/>
@@ -1432,6 +1637,7 @@
       </w:r>
     </w:p>
     <w:p>
+      <w:pPr/>
       <w:r>
         <w:rPr>
           <w:b/>
@@ -1451,11 +1657,15 @@
       </w:r>
     </w:p>
     <w:p>
+      <w:pPr>
+        <w:keepNext/>
+      </w:pPr>
       <w:r>
         <w:t>Dependencies: MT-4.2</w:t>
       </w:r>
     </w:p>
     <w:p>
+      <w:pPr/>
       <w:r>
         <w:rPr>
           <w:b/>
@@ -1467,6 +1677,7 @@
       </w:r>
     </w:p>
     <w:p>
+      <w:pPr/>
       <w:r>
         <w:rPr>
           <w:b/>
@@ -1486,11 +1697,15 @@
       </w:r>
     </w:p>
     <w:p>
+      <w:pPr>
+        <w:keepNext/>
+      </w:pPr>
       <w:r>
         <w:t>Dependencies: MT-4.5</w:t>
       </w:r>
     </w:p>
     <w:p>
+      <w:pPr/>
       <w:r>
         <w:rPr>
           <w:b/>
@@ -1502,6 +1717,7 @@
       </w:r>
     </w:p>
     <w:p>
+      <w:pPr/>
       <w:r>
         <w:rPr>
           <w:b/>
@@ -1521,11 +1737,15 @@
       </w:r>
     </w:p>
     <w:p>
+      <w:pPr>
+        <w:keepNext/>
+      </w:pPr>
       <w:r>
         <w:t>Dependencies: MT-4.6</w:t>
       </w:r>
     </w:p>
     <w:p>
+      <w:pPr/>
       <w:r>
         <w:rPr>
           <w:b/>
@@ -1537,6 +1757,7 @@
       </w:r>
     </w:p>
     <w:p>
+      <w:pPr/>
       <w:r>
         <w:rPr>
           <w:b/>
@@ -1556,11 +1777,15 @@
       </w:r>
     </w:p>
     <w:p>
+      <w:pPr>
+        <w:keepNext/>
+      </w:pPr>
       <w:r>
         <w:t>Dependencies: MT-4.3</w:t>
       </w:r>
     </w:p>
     <w:p>
+      <w:pPr/>
       <w:r>
         <w:rPr>
           <w:b/>
@@ -1572,6 +1797,7 @@
       </w:r>
     </w:p>
     <w:p>
+      <w:pPr/>
       <w:r>
         <w:rPr>
           <w:b/>
@@ -1591,11 +1817,15 @@
       </w:r>
     </w:p>
     <w:p>
+      <w:pPr>
+        <w:keepNext/>
+      </w:pPr>
       <w:r>
         <w:t>Dependencies: MT-4.4</w:t>
       </w:r>
     </w:p>
     <w:p>
+      <w:pPr/>
       <w:r>
         <w:rPr>
           <w:b/>
@@ -1607,6 +1837,7 @@
       </w:r>
     </w:p>
     <w:p>
+      <w:pPr/>
       <w:r>
         <w:rPr>
           <w:b/>
@@ -1626,11 +1857,15 @@
       </w:r>
     </w:p>
     <w:p>
+      <w:pPr>
+        <w:keepNext/>
+      </w:pPr>
       <w:r>
         <w:t>Dependencies: MT-4.8</w:t>
       </w:r>
     </w:p>
     <w:p>
+      <w:pPr/>
       <w:r>
         <w:rPr>
           <w:b/>
@@ -1642,6 +1877,7 @@
       </w:r>
     </w:p>
     <w:p>
+      <w:pPr/>
       <w:r>
         <w:rPr>
           <w:b/>
@@ -1653,6 +1889,7 @@
       </w:r>
     </w:p>
     <w:p>
+      <w:pPr/>
       <w:r>
         <w:rPr>
           <w:b/>
@@ -1666,6 +1903,7 @@
     <w:p>
       <w:pPr>
         <w:pStyle w:val="Heading1"/>
+        <w:pageBreakBefore/>
       </w:pPr>
       <w:r>
         <w:t>MT-5 - Next.js customer Website</w:t>
@@ -1680,11 +1918,15 @@
       </w:r>
     </w:p>
     <w:p>
+      <w:pPr>
+        <w:keepNext/>
+      </w:pPr>
       <w:r>
         <w:t>Dependencies: MT-4.7</w:t>
       </w:r>
     </w:p>
     <w:p>
+      <w:pPr/>
       <w:r>
         <w:rPr>
           <w:b/>
@@ -1696,6 +1938,7 @@
       </w:r>
     </w:p>
     <w:p>
+      <w:pPr/>
       <w:r>
         <w:rPr>
           <w:b/>
@@ -1715,11 +1958,15 @@
       </w:r>
     </w:p>
     <w:p>
+      <w:pPr>
+        <w:keepNext/>
+      </w:pPr>
       <w:r>
         <w:t>Dependencies: MT-5.1</w:t>
       </w:r>
     </w:p>
     <w:p>
+      <w:pPr/>
       <w:r>
         <w:rPr>
           <w:b/>
@@ -1731,6 +1978,7 @@
       </w:r>
     </w:p>
     <w:p>
+      <w:pPr/>
       <w:r>
         <w:rPr>
           <w:b/>
@@ -1750,11 +1998,15 @@
       </w:r>
     </w:p>
     <w:p>
+      <w:pPr>
+        <w:keepNext/>
+      </w:pPr>
       <w:r>
         <w:t>Dependencies: MT-5.2</w:t>
       </w:r>
     </w:p>
     <w:p>
+      <w:pPr/>
       <w:r>
         <w:rPr>
           <w:b/>
@@ -1766,6 +2018,7 @@
       </w:r>
     </w:p>
     <w:p>
+      <w:pPr/>
       <w:r>
         <w:rPr>
           <w:b/>
@@ -1785,11 +2038,15 @@
       </w:r>
     </w:p>
     <w:p>
+      <w:pPr>
+        <w:keepNext/>
+      </w:pPr>
       <w:r>
         <w:t>Dependencies: MT-5.3</w:t>
       </w:r>
     </w:p>
     <w:p>
+      <w:pPr/>
       <w:r>
         <w:rPr>
           <w:b/>
@@ -1801,6 +2058,7 @@
       </w:r>
     </w:p>
     <w:p>
+      <w:pPr/>
       <w:r>
         <w:rPr>
           <w:b/>
@@ -1820,11 +2078,15 @@
       </w:r>
     </w:p>
     <w:p>
+      <w:pPr>
+        <w:keepNext/>
+      </w:pPr>
       <w:r>
         <w:t>Dependencies: MT-5.4</w:t>
       </w:r>
     </w:p>
     <w:p>
+      <w:pPr/>
       <w:r>
         <w:rPr>
           <w:b/>
@@ -1836,6 +2098,7 @@
       </w:r>
     </w:p>
     <w:p>
+      <w:pPr/>
       <w:r>
         <w:rPr>
           <w:b/>
@@ -1847,6 +2110,7 @@
       </w:r>
     </w:p>
     <w:p>
+      <w:pPr/>
       <w:r>
         <w:rPr>
           <w:b/>
@@ -1860,6 +2124,7 @@
     <w:p>
       <w:pPr>
         <w:pStyle w:val="Heading1"/>
+        <w:pageBreakBefore/>
       </w:pPr>
       <w:r>
         <w:t>MT-6 - Shared brand and Windows Control</w:t>
@@ -1874,11 +2139,15 @@
       </w:r>
     </w:p>
     <w:p>
+      <w:pPr>
+        <w:keepNext/>
+      </w:pPr>
       <w:r>
         <w:t>Dependencies: MT-5.5</w:t>
       </w:r>
     </w:p>
     <w:p>
+      <w:pPr/>
       <w:r>
         <w:rPr>
           <w:b/>
@@ -1890,6 +2159,7 @@
       </w:r>
     </w:p>
     <w:p>
+      <w:pPr/>
       <w:r>
         <w:rPr>
           <w:b/>
@@ -1909,11 +2179,15 @@
       </w:r>
     </w:p>
     <w:p>
+      <w:pPr>
+        <w:keepNext/>
+      </w:pPr>
       <w:r>
         <w:t>Dependencies: MT-6.1</w:t>
       </w:r>
     </w:p>
     <w:p>
+      <w:pPr/>
       <w:r>
         <w:rPr>
           <w:b/>
@@ -1925,6 +2199,7 @@
       </w:r>
     </w:p>
     <w:p>
+      <w:pPr/>
       <w:r>
         <w:rPr>
           <w:b/>
@@ -1944,11 +2219,15 @@
       </w:r>
     </w:p>
     <w:p>
+      <w:pPr>
+        <w:keepNext/>
+      </w:pPr>
       <w:r>
         <w:t>Dependencies: MT-6.2</w:t>
       </w:r>
     </w:p>
     <w:p>
+      <w:pPr/>
       <w:r>
         <w:rPr>
           <w:b/>
@@ -1960,6 +2239,7 @@
       </w:r>
     </w:p>
     <w:p>
+      <w:pPr/>
       <w:r>
         <w:rPr>
           <w:b/>
@@ -1971,6 +2251,7 @@
       </w:r>
     </w:p>
     <w:p>
+      <w:pPr/>
       <w:r>
         <w:rPr>
           <w:b/>
@@ -1984,6 +2265,7 @@
     <w:p>
       <w:pPr>
         <w:pStyle w:val="Heading1"/>
+        <w:pageBreakBefore/>
       </w:pPr>
       <w:r>
         <w:t>MT-7 - Migration rehearsal and release readiness</w:t>
@@ -1998,11 +2280,15 @@
       </w:r>
     </w:p>
     <w:p>
+      <w:pPr>
+        <w:keepNext/>
+      </w:pPr>
       <w:r>
         <w:t>Dependencies: MT-6.3</w:t>
       </w:r>
     </w:p>
     <w:p>
+      <w:pPr/>
       <w:r>
         <w:rPr>
           <w:b/>
@@ -2014,6 +2300,7 @@
       </w:r>
     </w:p>
     <w:p>
+      <w:pPr/>
       <w:r>
         <w:rPr>
           <w:b/>
@@ -2033,11 +2320,15 @@
       </w:r>
     </w:p>
     <w:p>
+      <w:pPr>
+        <w:keepNext/>
+      </w:pPr>
       <w:r>
         <w:t>Dependencies: MT-7.1</w:t>
       </w:r>
     </w:p>
     <w:p>
+      <w:pPr/>
       <w:r>
         <w:rPr>
           <w:b/>
@@ -2049,6 +2340,7 @@
       </w:r>
     </w:p>
     <w:p>
+      <w:pPr/>
       <w:r>
         <w:rPr>
           <w:b/>
@@ -2068,11 +2360,15 @@
       </w:r>
     </w:p>
     <w:p>
+      <w:pPr>
+        <w:keepNext/>
+      </w:pPr>
       <w:r>
         <w:t>Dependencies: MT-7.2</w:t>
       </w:r>
     </w:p>
     <w:p>
+      <w:pPr/>
       <w:r>
         <w:rPr>
           <w:b/>
@@ -2084,6 +2380,7 @@
       </w:r>
     </w:p>
     <w:p>
+      <w:pPr/>
       <w:r>
         <w:rPr>
           <w:b/>
@@ -2103,11 +2400,15 @@
       </w:r>
     </w:p>
     <w:p>
+      <w:pPr>
+        <w:keepNext/>
+      </w:pPr>
       <w:r>
         <w:t>Dependencies: MT-7.3</w:t>
       </w:r>
     </w:p>
     <w:p>
+      <w:pPr/>
       <w:r>
         <w:rPr>
           <w:b/>
@@ -2119,6 +2420,7 @@
       </w:r>
     </w:p>
     <w:p>
+      <w:pPr/>
       <w:r>
         <w:rPr>
           <w:b/>
@@ -2138,11 +2440,15 @@
       </w:r>
     </w:p>
     <w:p>
+      <w:pPr>
+        <w:keepNext/>
+      </w:pPr>
       <w:r>
         <w:t>Dependencies: MT-7.4</w:t>
       </w:r>
     </w:p>
     <w:p>
+      <w:pPr/>
       <w:r>
         <w:rPr>
           <w:b/>
@@ -2150,10 +2456,11 @@
         <w:t>Scope:</w:t>
       </w:r>
       <w:r>
-        <w:t xml:space="preserve"> Close every valid requirement in the complete source-to-target register with fresh target evidence and independently run operational journeys. Close the addendum, consolidated-requirement and software-product-publishing traceability as well as original source parity; priorities and optional enablement do not waive implementation gates. Include Invoice/Warranty no-auto-download, Preview/Save PDF/Print/safe Email/assisted WhatsApp/history; POS Cash/Card/Mobile Wallet/Bank Transfer, split tender, cash change, destination authorization, Day Closing, payment mix/fees/refund reconciliation; Website fixed-four-channel regression; Software Product create/preview/publish/update/rollback and public route family; and legal-policy/licensing/notice acceptance.</w:t>
-      </w:r>
-    </w:p>
-    <w:p>
+        <w:t xml:space="preserve"> Complete the approved functionality and business-rule parity using a FRESH mobiSTtech business setup: secure Admin bootstrap -&gt; create/configure new outlet -&gt; create new inventory/customers -&gt; exercise new sales, payments, returns, warranties, reporting and Website workflows with isolated newly generated synthetic target data. Close every applicable source-feature disposition with current target evidence; no legacy business rows are imported or required. Close the addendum, consolidated-requirement and software-product-publishing traceability as well as original source parity; priorities and optional enablement do not waive implementation gates. Include Invoice/Warranty no-auto-download, Preview/Save PDF/Print/safe Email/assisted WhatsApp/history; POS Cash/Card/Mobile Wallet/Bank Transfer, split tender, cash change, destination authorization, Day Closing, payment mix/fees/refund reconciliation; Website fixed-four-channel regression; Software Product create/preview/publish/update/rollback and public route family; and legal-policy/licensing/notice acceptance.</w:t>
+      </w:r>
+    </w:p>
+    <w:p>
+      <w:pPr/>
       <w:r>
         <w:rPr>
           <w:b/>
@@ -2161,7 +2468,7 @@
         <w:t>Acceptance:</w:t>
       </w:r>
       <w:r>
-        <w:t xml:space="preserve"> Pest/PHPUnit, MySQL, builds, Playwright, POS/Website/Control, documentation and recovery gates pass; no silent feature loss or unreviewed duplicate master remains. Every approved addendum, consolidated-requirement and software-product-publishing clause has fresh backend/UI/API/performance evidence or an explicit unresolved gap. Policy coverage matches final product behavior with approved versions/effective dates and working footer/product links; Privacy claims match real data flows; software ownership and third-party notice posture are deliberate. At least the mobiST POS seed/reference set is reconciled through the reusable Software Product workflow without hard-coded one-off implementation.</w:t>
+        <w:t xml:space="preserve"> End-to-end fresh-outlet Admin/POS/Website journeys and Pest/PHPUnit, isolated MySQL, builds, Playwright, Control, documentation and recovery gates pass; production bootstrap has no legacy or demo business transactions; no silent feature loss or unreviewed duplicate master remains. Every approved addendum, consolidated-requirement and software-product-publishing clause has fresh backend/UI/API/performance evidence or an explicit unresolved gap. Policy coverage matches final product behavior with approved versions/effective dates and working footer/product links; Privacy claims match real data flows; software ownership and third-party notice posture are deliberate. At least the mobiST POS software reference set is reconciled through the reusable Software Product workflow without hard-coded one-off implementation. Previously approved source-data rehearsal D04 is retired from MT-7.5; old POS/Website identities, outlets and other business records require no import, original-data reconciliation, snapshots, restoration, cutover or archival proof. Future mobiSTtech business-history safeguards remain mandatory. Integration backend/UI/mock acceptance must not wait for credentials; authentic Gmail/provider connectivity and transactions are labelled external-unverified pending separate authorization and do not block independent functional gates.</w:t>
       </w:r>
     </w:p>
     <w:p>
@@ -2173,11 +2480,15 @@
       </w:r>
     </w:p>
     <w:p>
+      <w:pPr>
+        <w:keepNext/>
+      </w:pPr>
       <w:r>
         <w:t>Dependencies: MT-7.5</w:t>
       </w:r>
     </w:p>
     <w:p>
+      <w:pPr/>
       <w:r>
         <w:rPr>
           <w:b/>
@@ -2189,6 +2500,7 @@
       </w:r>
     </w:p>
     <w:p>
+      <w:pPr/>
       <w:r>
         <w:rPr>
           <w:b/>
@@ -2200,6 +2512,7 @@
       </w:r>
     </w:p>
     <w:p>
+      <w:pPr/>
       <w:r>
         <w:rPr>
           <w:b/>
@@ -2213,6 +2526,7 @@
     <w:p>
       <w:pPr>
         <w:pStyle w:val="Heading1"/>
+        <w:pageBreakBefore/>
       </w:pPr>
       <w:r>
         <w:t>MT-8 - Final sign-off</w:t>
@@ -2227,11 +2541,15 @@
       </w:r>
     </w:p>
     <w:p>
+      <w:pPr>
+        <w:keepNext/>
+      </w:pPr>
       <w:r>
         <w:t>Dependencies: MT-7.6</w:t>
       </w:r>
     </w:p>
     <w:p>
+      <w:pPr/>
       <w:r>
         <w:rPr>
           <w:b/>
@@ -2243,6 +2561,7 @@
       </w:r>
     </w:p>
     <w:p>
+      <w:pPr/>
       <w:r>
         <w:rPr>
           <w:b/>
@@ -2254,6 +2573,7 @@
       </w:r>
     </w:p>
     <w:p>
+      <w:pPr/>
       <w:r>
         <w:rPr>
           <w:b/>
@@ -2267,32 +2587,38 @@
     <w:p>
       <w:pPr>
         <w:pStyle w:val="Heading1"/>
+        <w:pageBreakBefore/>
       </w:pPr>
       <w:r>
         <w:t>HOLD / Deferred register</w:t>
       </w:r>
     </w:p>
     <w:p>
+      <w:pPr/>
       <w:r>
         <w:t>H-01 - Live production deployment, domains, TLS activation and real customer-data cutover require separate explicit authorization and target access. MT-7.1/MT-7.4 isolated rehearsal/readiness remains in scope.</w:t>
       </w:r>
     </w:p>
     <w:p>
+      <w:pPr/>
       <w:r>
         <w:t>H-02 - JazzCash/Easypaisa authentic sandbox acceptance requires verified official contracts and valid sandbox credentials. Card requires an approved hosted/tokenized processor. Live activation is a separate HOLD. Existing safe disabled-provider behavior and COD migration remain required; fake acceptance is prohibited.</w:t>
       </w:r>
     </w:p>
     <w:p>
+      <w:pPr/>
       <w:r>
         <w:t>H-03 - Source business-data export, destructive restore and production reset require authorization for the sensitive dataset and exact target before access/use. Synthetic/sanitized isolated migration tests may continue. Source repository/database writes are prohibited in this project.</w:t>
       </w:r>
     </w:p>
     <w:p>
+      <w:pPr/>
       <w:r>
         <w:t>H-04 - Addendum v1.1 and the approved software product publishing requirement are approved scope, not a HOLD. Arbitrary new top-level category semantics and unrelated features beyond Goal/Preferences/approved requirements remain outside scope. Marketplace, consumer lending, general subscription billing, arbitrary multi-currency accounting, full ERP/general ledger and unnecessary microservices remain excluded unless separately approved. Existing protected IDs/business rules must be preserved.</w:t>
       </w:r>
     </w:p>
     <w:p>
+      <w:pPr/>
       <w:r>
         <w:t>HOLD/dependency evidence is explicitly reviewed in FINAL-AUDIT. A required capability cannot be left unimplemented and then relabeled Deferred merely to complete the project.</w:t>
       </w:r>

</xml_diff>

<commit_message>
docs(w04): close development acceptance and retain H-02 prelaunch gate
</commit_message>
<xml_diff>
--- a/docs/PROJECT_IMPLEMENTATION_ROADMAP.docx
+++ b/docs/PROJECT_IMPLEMENTATION_ROADMAP.docx
@@ -7,13 +7,13 @@
         <w:pStyle w:val="Title"/>
       </w:pPr>
       <w:r>
-        <w:t>mobiST Tech - Project Implementation Roadmap</w:t>
+        <w:t>Mobisttech - Project Implementation Roadmap</w:t>
       </w:r>
     </w:p>
     <w:p>
       <w:pPr/>
       <w:r>
-        <w:t>Version: 1.11 | Date: 2026-09-20</w:t>
+        <w:t>Version: 1.12 | Date: 2026-09-24</w:t>
       </w:r>
     </w:p>
     <w:p>
@@ -129,7 +129,7 @@
     <w:p>
       <w:pPr/>
       <w:r>
-        <w:t>Every point includes applicable focused/full tests, parity evidence, secrets review, source-boundary checks and ledger updates. Routine execution progress updates the ledger only and must not edit this roadmap or regenerate its DOCX. Regenerate/verify the DOCX only when roadmap structure/content materially changes. MT-1.1 detailed inventory may refine this roadmap from evidence, but valid functionality must not be silently dropped and completed IDs must not be renumbered.</w:t>
+        <w:t>Every point includes applicable focused/full tests, parity evidence, secrets review, source-boundary checks and ledger updates. Routine execution progress updates the ledger only and must not edit this roadmap or regenerate its DOCX. Approved development-versus-external-activation acceptance separation is binding across all current/future stages: independently testable implementation, security, payment/data integrity and synthetic/API/browser acceptance must complete before each development-stage exit; separately registered external provider/production/owner-activation prerequisites block their applicable real-world activation or release, not unrelated development. The enforceable external prerequisite and final-audit register is `docs/HOLD_PRE_LAUNCH_REGISTER.md`; neither a HOLD nor a synthetic PASS is permission for a live transaction. Regenerate/verify the DOCX only when roadmap structure/content materially changes. MT-1.1 detailed inventory may refine this roadmap from evidence, but valid functionality must not be silently dropped and completed IDs must not be renumbered.</w:t>
       </w:r>
     </w:p>
     <w:p>
@@ -2026,7 +2026,7 @@
         <w:t>Acceptance:</w:t>
       </w:r>
       <w:r>
-        <w:t xml:space="preserve"> Duplicate submit, price/stock changes, failed payments, verified confirmation and the fixed-four-channel contract pass end-to-end; sandbox claims are made only for authentically configured providers. Website transactions classify into shared reporting/reconciliation without changing checkout choices. Measure mode-specific checkout loading with production builds; price/discount/reward tampering and usage-limit races fail safely.</w:t>
+        <w:t xml:space="preserve"> DEVELOPMENT ACCEPTANCE separately proves duplicate submit, price/stock changes, failed payments, synthetic verified-confirmation/refund/reconciliation and the fixed-four-channel UI/Admin configuration/backend/ownership/idempotency/retry/cancel contract end-to-end, with disabled external channels and applicable real API/browser/security/regression evidence. Authentic JazzCash/Easypaisa/card contracts, sandbox transactions, callbacks, external refunds and settlement are EXTERNAL PROVIDER ACCEPTANCE H-02 PRE-LAUNCH, not this independently executable development gate; only authentically configured providers may make sandbox claims. Website transactions classify into shared reporting/reconciliation without changing checkout choices. Measure mode-specific checkout loading with production builds; price/discount/reward tampering and usage-limit races fail safely.</w:t>
       </w:r>
     </w:p>
     <w:p>
@@ -2468,7 +2468,7 @@
         <w:t>Acceptance:</w:t>
       </w:r>
       <w:r>
-        <w:t xml:space="preserve"> End-to-end fresh-outlet Admin/POS/Website journeys and Pest/PHPUnit, isolated MySQL, builds, Playwright, Control, documentation and recovery gates pass; production bootstrap has no legacy or demo business transactions; no silent feature loss or unreviewed duplicate master remains. Every approved addendum, consolidated-requirement and software-product-publishing clause has fresh backend/UI/API/performance evidence or an explicit unresolved gap. Policy coverage matches final product behavior with approved versions/effective dates and working footer/product links; Privacy claims match real data flows; software ownership and third-party notice posture are deliberate. At least the mobiST POS software reference set is reconciled through the reusable Software Product workflow without hard-coded one-off implementation. Previously approved source-data rehearsal D04 is retired from MT-7.5; old POS/Website identities, outlets and other business records require no import, original-data reconciliation, snapshots, restoration, cutover or archival proof. Future mobiSTtech business-history safeguards remain mandatory. Integration backend/UI/mock acceptance must not wait for credentials; authentic Gmail/provider connectivity and transactions are labelled external-unverified pending separate authorization and do not block independent functional gates.</w:t>
+        <w:t xml:space="preserve"> End-to-end fresh-outlet Admin/POS/Website journeys and Pest/PHPUnit, isolated MySQL, builds, Playwright, Control, documentation and recovery gates pass; production bootstrap has no legacy or demo business transactions; no silent feature loss or unreviewed duplicate master remains. Every approved addendum, consolidated-requirement and software-product-publishing clause has fresh backend/UI/API/performance evidence or an explicit unresolved gap. Policy coverage matches final product behavior with approved versions/effective dates and working footer/product links; Privacy claims match real data flows; software ownership and third-party notice posture are deliberate. At least the mobiST POS software reference set is reconciled through the reusable Software Product workflow without hard-coded one-off implementation. Previously approved source-data rehearsal D04 is retired from MT-7.5; old POS/Website identities, outlets and other business records require no import, original-data reconciliation, snapshots, restoration, cutover or archival proof. Future mobiSTtech business-history safeguards remain mandatory. Integration backend/UI/mock acceptance must not wait for credentials; the W04 four-channel DEVELOPMENT ACCEPTANCE, including independently verifiable security, order/money/data-integrity, UI/Admin, refund, recovery and synthetic/API/browser regression, closes on its own finite proof. H-02 authentic Website provider contracts, credentials, provider-specific callbacks/external refunds/settlement and distinct live activation remain PRE-LAUNCH HOLD, not W04 or MT-7.5 development-exit prerequisites. Authentic Gmail/provider connectivity and transactions remain external-unverified pending separate authorization and do not block independent functional gates. Every remaining required development gate (including Q01 exact-candidate full regression) still must pass before MT-7.5 closes; the 27-gate count measures development parity only, never production-payment or launch readiness.</w:t>
       </w:r>
     </w:p>
     <w:p>
@@ -2496,7 +2496,7 @@
         <w:t>Scope:</w:t>
       </w:r>
       <w:r>
-        <w:t xml:space="preserve"> Create the complete role-aware mobiST Tech operational user manual from the final verified product, including current safe UI screenshots and coverage of POS, payments/reconciliation, documents/Email/WhatsApp, inventory/procurement, warranty, cash closing, Website CMS/legal content/Digital Services, Software Product creation/version/publication workflows, integrations, backup/reset safety, mobiST Control and the customer Website. Produce canonical `docs/user-manual/USER_MANUAL.md`, verified same-content DOCX and PDF mirrors, and controlled screenshot assets.</w:t>
+        <w:t xml:space="preserve"> Create the complete role-aware Mobisttech operational user manual from the final verified product, including current safe UI screenshots and coverage of POS, payments/reconciliation, documents/Email/WhatsApp, inventory/procurement, warranty, cash closing, Website CMS/legal content/Digital Services, Software Product creation/version/publication workflows, integrations, backup/reset safety, mobiST Control and the customer Website. Produce canonical `docs/user-manual/USER_MANUAL.md`, verified same-content DOCX and PDF mirrors, and controlled screenshot assets.</w:t>
       </w:r>
     </w:p>
     <w:p>
@@ -2557,7 +2557,7 @@
         <w:t>Scope:</w:t>
       </w:r>
       <w:r>
-        <w:t xml:space="preserve"> Independently audit the complete Goal and Preferences, requirement map, all completed-point claims, Git/code/data, migration/recovery, security, integrations, CI, documentation, HOLD register and source immutability. Include approved requirements addendum v1.1, the unified Admin/Google requirement, the Team Member/delegated-access/session-security requirement, the complete consolidated documents/payments/legal/manual requirement and the software product publishing requirement. Inspect actual Invoice/Warranty UX and canonical delivery, Gmail attachments, truthful WhatsApp, POS payment methods/destinations/split tender/refunds/settlement, Website fixed channels, Software Product Admin/publication/version routes, Day Closing/payment mix, legal/privacy/service-pricing consistency, project ownership/third-party notices and the final User Manual.</w:t>
+        <w:t xml:space="preserve"> Independently audit the complete Goal and Preferences, requirement map, all completed-point claims, Git/code/data, migration/recovery, security, integrations, CI, documentation, HOLD register and source immutability. Audit development completion separately from external-provider/pre-launch readiness; no vendor claim or live payment is inferred from a finished W04/MT-7.5/MT-7.6 development stage. Include approved requirements addendum v1.1, the unified Admin/Google requirement, the Team Member/delegated-access/session-security requirement, the complete consolidated documents/payments/legal/manual requirement and the software product publishing requirement. Inspect actual Invoice/Warranty UX and canonical delivery, Gmail attachments, truthful WhatsApp, POS payment methods/destinations/split tender/refunds/settlement, Website fixed channels, Software Product Admin/publication/version routes, Day Closing/payment mix, legal/privacy/service-pricing consistency, project ownership/third-party notices and the final User Manual.</w:t>
       </w:r>
     </w:p>
     <w:p>
@@ -2569,7 +2569,7 @@
         <w:t>Acceptance:</w:t>
       </w:r>
       <w:r>
-        <w:t xml:space="preserve"> Reopen every material requirement, policy, manual, payment or document-delivery mismatch; the new repository must be clean and remote-aligned. Report `Project complete: 100%` only after a clean final audit; Deferred required work cannot substitute for completion. Verify original completed history was preserved and every subsequent extension was independently accepted.</w:t>
+        <w:t xml:space="preserve"> Reopen every material requirement, policy, manual, payment or document-delivery mismatch; the new repository must be clean and remote-aligned. A development-only audit may report technical development acceptance with explicit PRE-LAUNCH BLOCKED status, but must NOT report `Project complete: 100%`, live payment readiness or final release sign-off while any required pre-launch/provider/production/owner/legal gate in `docs/HOLD_PRE_LAUNCH_REGISTER.md` remains unverified or unauthorized. Report `Project complete: 100%` only after the clean final audit AND all applicable mandatory external/pre-launch prerequisites are genuinely passed and authorized; Deferred required work cannot substitute for completion. Verify original completed history was preserved and every subsequent extension was independently accepted.</w:t>
       </w:r>
     </w:p>
     <w:p>
@@ -2602,7 +2602,7 @@
     <w:p>
       <w:pPr/>
       <w:r>
-        <w:t>H-02 - JazzCash/Easypaisa authentic sandbox acceptance requires verified official contracts and valid sandbox credentials. Card requires an approved hosted/tokenized processor. Live activation is a separate HOLD. Existing safe disabled-provider behavior and COD migration remain required; fake acceptance is prohibited.</w:t>
+        <w:t>H-02 - PRE-LAUNCH EXTERNAL PROVIDER ACCEPTANCE, separately tracked from W04/MT-7.5 DEVELOPMENT ACCEPTANCE. JazzCash and Easypaisa need verified official merchant-specific contracts, selected provider mode/transport, merchant enrolment and valid sandbox credentials; card needs an owner-approved hosted/tokenized processor, official integration contract and valid sandbox credentials. Provider-specific authenticated initiation, callback/IPN signature/reference/amount/replay/failure, genuine sandbox refunds, settlement/reconciliation, security/secret rotation and truthful Admin/Customer browser behavior require exact-provider evidence and explicit owner approval before a channel is eligible for activation. Live activation additionally needs its own explicit authorization and production-safe review; until then external channels stay disabled/fail closed. W04 development can close, other roadmap families/stages can advance and 27/27 development parity can eventually be evidenced without marking H-02 PASS, live-ready or `Project complete: 100%`. `docs/HOLD_PRE_LAUNCH_REGISTER.md` defines the accountable gate and evidence; fake acceptance is prohibited.</w:t>
       </w:r>
     </w:p>
     <w:p>
@@ -2620,7 +2620,7 @@
     <w:p>
       <w:pPr/>
       <w:r>
-        <w:t>HOLD/dependency evidence is explicitly reviewed in FINAL-AUDIT. A required capability cannot be left unimplemented and then relabeled Deferred merely to complete the project.</w:t>
+        <w:t>HOLD/dependency evidence is explicitly reviewed in FINAL-AUDIT. Approved development-versus-activation separation also applies to Gmail, live infrastructure, external credentials and factual owner/legal decisions where local development can proceed; required internal security, data-integrity, implementation, local tests and independently executable gates are NEVER deferred to HOLD. A required capability cannot be left unimplemented and then relabeled Deferred merely to complete the project.</w:t>
       </w:r>
     </w:p>
     <w:sectPr>

</xml_diff>